<commit_message>
docs: add demo video link and deliverables checklist
</commit_message>
<xml_diff>
--- a/docs/bpmn-gen-report.docx
+++ b/docs/bpmn-gen-report.docx
@@ -2,8 +2,6 @@
 <file path=word/document.xml><?xml version="1.0" encoding="utf-8"?>
 <w:document xmlns:wpc="http://schemas.microsoft.com/office/word/2010/wordprocessingCanvas" xmlns:mo="http://schemas.microsoft.com/office/mac/office/2008/main" xmlns:mc="http://schemas.openxmlformats.org/markup-compatibility/2006" xmlns:mv="urn:schemas-microsoft-com:mac:vml" xmlns:o="urn:schemas-microsoft-com:office:office" xmlns:r="http://schemas.openxmlformats.org/officeDocument/2006/relationships" xmlns:m="http://schemas.openxmlformats.org/officeDocument/2006/math" xmlns:v="urn:schemas-microsoft-com:vml" xmlns:wp14="http://schemas.microsoft.com/office/word/2010/wordprocessingDrawing" xmlns:wp="http://schemas.openxmlformats.org/drawingml/2006/wordprocessingDrawing" xmlns:w10="urn:schemas-microsoft-com:office:word" xmlns:w="http://schemas.openxmlformats.org/wordprocessingml/2006/main" xmlns:w14="http://schemas.microsoft.com/office/word/2010/wordml" xmlns:wpg="http://schemas.microsoft.com/office/word/2010/wordprocessingGroup" xmlns:wpi="http://schemas.microsoft.com/office/word/2010/wordprocessingInk" xmlns:wne="http://schemas.microsoft.com/office/word/2006/wordml" xmlns:wps="http://schemas.microsoft.com/office/word/2010/wordprocessingShape" mc:Ignorable="w14 wp14">
   <w:body>
-    <w:p/>
-    <w:p/>
     <w:p/>
     <w:p>
       <w:pPr>
@@ -97,7 +95,7 @@
               <w:rPr>
                 <w:rFonts w:ascii="微软雅黑" w:hAnsi="微软雅黑"/>
                 <w:b/>
-                <w:sz w:val="19"/>
+                <w:sz w:val="18"/>
               </w:rPr>
               <w:t>项目</w:t>
             </w:r>
@@ -114,7 +112,7 @@
               <w:rPr>
                 <w:rFonts w:ascii="微软雅黑" w:hAnsi="微软雅黑"/>
                 <w:b/>
-                <w:sz w:val="19"/>
+                <w:sz w:val="18"/>
               </w:rPr>
               <w:t>内容</w:t>
             </w:r>
@@ -137,7 +135,7 @@
             <w:r>
               <w:rPr>
                 <w:rFonts w:ascii="微软雅黑" w:hAnsi="微软雅黑" w:eastAsia="微软雅黑"/>
-                <w:sz w:val="19"/>
+                <w:sz w:val="18"/>
               </w:rPr>
               <w:t>项目名称</w:t>
             </w:r>
@@ -155,7 +153,7 @@
             <w:r>
               <w:rPr>
                 <w:rFonts w:ascii="微软雅黑" w:hAnsi="微软雅黑" w:eastAsia="微软雅黑"/>
-                <w:sz w:val="19"/>
+                <w:sz w:val="18"/>
               </w:rPr>
               <w:t>bpmn-gen —— AI 驱动的审批流生成器</w:t>
             </w:r>
@@ -178,7 +176,7 @@
             <w:r>
               <w:rPr>
                 <w:rFonts w:ascii="微软雅黑" w:hAnsi="微软雅黑" w:eastAsia="微软雅黑"/>
-                <w:sz w:val="19"/>
+                <w:sz w:val="18"/>
               </w:rPr>
               <w:t>技术栈</w:t>
             </w:r>
@@ -196,7 +194,7 @@
             <w:r>
               <w:rPr>
                 <w:rFonts w:ascii="微软雅黑" w:hAnsi="微软雅黑" w:eastAsia="微软雅黑"/>
-                <w:sz w:val="19"/>
+                <w:sz w:val="18"/>
               </w:rPr>
               <w:t>Node.js（生成核心，零运行时依赖）+ Java（验证工具 / Flowable 引擎）+ bpmn-js（可视化）</w:t>
             </w:r>
@@ -219,7 +217,7 @@
             <w:r>
               <w:rPr>
                 <w:rFonts w:ascii="微软雅黑" w:hAnsi="微软雅黑" w:eastAsia="微软雅黑"/>
-                <w:sz w:val="19"/>
+                <w:sz w:val="18"/>
               </w:rPr>
               <w:t>大模型</w:t>
             </w:r>
@@ -237,7 +235,7 @@
             <w:r>
               <w:rPr>
                 <w:rFonts w:ascii="微软雅黑" w:hAnsi="微软雅黑" w:eastAsia="微软雅黑"/>
-                <w:sz w:val="19"/>
+                <w:sz w:val="18"/>
               </w:rPr>
               <w:t>DeepSeek（OpenAI 兼容接口），可一键切换通义千问</w:t>
             </w:r>
@@ -260,7 +258,7 @@
             <w:r>
               <w:rPr>
                 <w:rFonts w:ascii="微软雅黑" w:hAnsi="微软雅黑" w:eastAsia="微软雅黑"/>
-                <w:sz w:val="19"/>
+                <w:sz w:val="18"/>
               </w:rPr>
               <w:t>引擎方言</w:t>
             </w:r>
@@ -278,7 +276,7 @@
             <w:r>
               <w:rPr>
                 <w:rFonts w:ascii="微软雅黑" w:hAnsi="微软雅黑" w:eastAsia="微软雅黑"/>
-                <w:sz w:val="19"/>
+                <w:sz w:val="18"/>
               </w:rPr>
               <w:t>Flowable 7（xmlns:flowable）</w:t>
             </w:r>
@@ -301,7 +299,7 @@
             <w:r>
               <w:rPr>
                 <w:rFonts w:ascii="微软雅黑" w:hAnsi="微软雅黑" w:eastAsia="微软雅黑"/>
-                <w:sz w:val="19"/>
+                <w:sz w:val="18"/>
               </w:rPr>
               <w:t>开源许可</w:t>
             </w:r>
@@ -319,7 +317,7 @@
             <w:r>
               <w:rPr>
                 <w:rFonts w:ascii="微软雅黑" w:hAnsi="微软雅黑" w:eastAsia="微软雅黑"/>
-                <w:sz w:val="19"/>
+                <w:sz w:val="18"/>
               </w:rPr>
               <w:t>Apache License 2.0</w:t>
             </w:r>
@@ -342,7 +340,48 @@
             <w:r>
               <w:rPr>
                 <w:rFonts w:ascii="微软雅黑" w:hAnsi="微软雅黑" w:eastAsia="微软雅黑"/>
-                <w:sz w:val="19"/>
+                <w:sz w:val="18"/>
+              </w:rPr>
+              <w:t>演示视频</w:t>
+            </w:r>
+          </w:p>
+        </w:tc>
+        <w:tc>
+          <w:tcPr>
+            <w:tcW w:type="dxa" w:w="6973"/>
+          </w:tcPr>
+          <w:p>
+            <w:pPr>
+              <w:spacing w:after="40"/>
+            </w:pPr>
+            <w:r/>
+            <w:r>
+              <w:rPr>
+                <w:rFonts w:ascii="微软雅黑" w:hAnsi="微软雅黑" w:eastAsia="微软雅黑"/>
+                <w:sz w:val="18"/>
+              </w:rPr>
+              <w:t>https://www.bilibili.com/video/BV1FvHA6YEyP/（P1 走大模型 / P2 离线模式）</w:t>
+            </w:r>
+          </w:p>
+        </w:tc>
+      </w:tr>
+      <w:tr>
+        <w:trPr>
+          <w:cantSplit/>
+        </w:trPr>
+        <w:tc>
+          <w:tcPr>
+            <w:tcW w:type="dxa" w:w="1814"/>
+          </w:tcPr>
+          <w:p>
+            <w:pPr>
+              <w:spacing w:after="40"/>
+            </w:pPr>
+            <w:r/>
+            <w:r>
+              <w:rPr>
+                <w:rFonts w:ascii="微软雅黑" w:hAnsi="微软雅黑" w:eastAsia="微软雅黑"/>
+                <w:sz w:val="18"/>
               </w:rPr>
               <w:t>文档版本</w:t>
             </w:r>
@@ -360,7 +399,7 @@
             <w:r>
               <w:rPr>
                 <w:rFonts w:ascii="微软雅黑" w:hAnsi="微软雅黑" w:eastAsia="微软雅黑"/>
-                <w:sz w:val="19"/>
+                <w:sz w:val="18"/>
               </w:rPr>
               <w:t>v1.0</w:t>
             </w:r>

</xml_diff>

<commit_message>
docs: add repository URL to report and deliverables
</commit_message>
<xml_diff>
--- a/docs/bpmn-gen-report.docx
+++ b/docs/bpmn-gen-report.docx
@@ -95,7 +95,7 @@
               <w:rPr>
                 <w:rFonts w:ascii="微软雅黑" w:hAnsi="微软雅黑"/>
                 <w:b/>
-                <w:sz w:val="18"/>
+                <w:sz w:val="17"/>
               </w:rPr>
               <w:t>项目</w:t>
             </w:r>
@@ -112,7 +112,7 @@
               <w:rPr>
                 <w:rFonts w:ascii="微软雅黑" w:hAnsi="微软雅黑"/>
                 <w:b/>
-                <w:sz w:val="18"/>
+                <w:sz w:val="17"/>
               </w:rPr>
               <w:t>内容</w:t>
             </w:r>
@@ -135,7 +135,7 @@
             <w:r>
               <w:rPr>
                 <w:rFonts w:ascii="微软雅黑" w:hAnsi="微软雅黑" w:eastAsia="微软雅黑"/>
-                <w:sz w:val="18"/>
+                <w:sz w:val="17"/>
               </w:rPr>
               <w:t>项目名称</w:t>
             </w:r>
@@ -153,7 +153,7 @@
             <w:r>
               <w:rPr>
                 <w:rFonts w:ascii="微软雅黑" w:hAnsi="微软雅黑" w:eastAsia="微软雅黑"/>
-                <w:sz w:val="18"/>
+                <w:sz w:val="17"/>
               </w:rPr>
               <w:t>bpmn-gen —— AI 驱动的审批流生成器</w:t>
             </w:r>
@@ -176,7 +176,7 @@
             <w:r>
               <w:rPr>
                 <w:rFonts w:ascii="微软雅黑" w:hAnsi="微软雅黑" w:eastAsia="微软雅黑"/>
-                <w:sz w:val="18"/>
+                <w:sz w:val="17"/>
               </w:rPr>
               <w:t>技术栈</w:t>
             </w:r>
@@ -194,7 +194,7 @@
             <w:r>
               <w:rPr>
                 <w:rFonts w:ascii="微软雅黑" w:hAnsi="微软雅黑" w:eastAsia="微软雅黑"/>
-                <w:sz w:val="18"/>
+                <w:sz w:val="17"/>
               </w:rPr>
               <w:t>Node.js（生成核心，零运行时依赖）+ Java（验证工具 / Flowable 引擎）+ bpmn-js（可视化）</w:t>
             </w:r>
@@ -217,7 +217,7 @@
             <w:r>
               <w:rPr>
                 <w:rFonts w:ascii="微软雅黑" w:hAnsi="微软雅黑" w:eastAsia="微软雅黑"/>
-                <w:sz w:val="18"/>
+                <w:sz w:val="17"/>
               </w:rPr>
               <w:t>大模型</w:t>
             </w:r>
@@ -235,7 +235,7 @@
             <w:r>
               <w:rPr>
                 <w:rFonts w:ascii="微软雅黑" w:hAnsi="微软雅黑" w:eastAsia="微软雅黑"/>
-                <w:sz w:val="18"/>
+                <w:sz w:val="17"/>
               </w:rPr>
               <w:t>DeepSeek（OpenAI 兼容接口），可一键切换通义千问</w:t>
             </w:r>
@@ -258,7 +258,7 @@
             <w:r>
               <w:rPr>
                 <w:rFonts w:ascii="微软雅黑" w:hAnsi="微软雅黑" w:eastAsia="微软雅黑"/>
-                <w:sz w:val="18"/>
+                <w:sz w:val="17"/>
               </w:rPr>
               <w:t>引擎方言</w:t>
             </w:r>
@@ -276,7 +276,7 @@
             <w:r>
               <w:rPr>
                 <w:rFonts w:ascii="微软雅黑" w:hAnsi="微软雅黑" w:eastAsia="微软雅黑"/>
-                <w:sz w:val="18"/>
+                <w:sz w:val="17"/>
               </w:rPr>
               <w:t>Flowable 7（xmlns:flowable）</w:t>
             </w:r>
@@ -299,7 +299,7 @@
             <w:r>
               <w:rPr>
                 <w:rFonts w:ascii="微软雅黑" w:hAnsi="微软雅黑" w:eastAsia="微软雅黑"/>
-                <w:sz w:val="18"/>
+                <w:sz w:val="17"/>
               </w:rPr>
               <w:t>开源许可</w:t>
             </w:r>
@@ -317,7 +317,7 @@
             <w:r>
               <w:rPr>
                 <w:rFonts w:ascii="微软雅黑" w:hAnsi="微软雅黑" w:eastAsia="微软雅黑"/>
-                <w:sz w:val="18"/>
+                <w:sz w:val="17"/>
               </w:rPr>
               <w:t>Apache License 2.0</w:t>
             </w:r>
@@ -340,7 +340,48 @@
             <w:r>
               <w:rPr>
                 <w:rFonts w:ascii="微软雅黑" w:hAnsi="微软雅黑" w:eastAsia="微软雅黑"/>
-                <w:sz w:val="18"/>
+                <w:sz w:val="17"/>
+              </w:rPr>
+              <w:t>代码仓库</w:t>
+            </w:r>
+          </w:p>
+        </w:tc>
+        <w:tc>
+          <w:tcPr>
+            <w:tcW w:type="dxa" w:w="6973"/>
+          </w:tcPr>
+          <w:p>
+            <w:pPr>
+              <w:spacing w:after="40"/>
+            </w:pPr>
+            <w:r/>
+            <w:r>
+              <w:rPr>
+                <w:rFonts w:ascii="微软雅黑" w:hAnsi="微软雅黑" w:eastAsia="微软雅黑"/>
+                <w:sz w:val="17"/>
+              </w:rPr>
+              <w:t>https://github.com/Alter2007/bpmn-gen</w:t>
+            </w:r>
+          </w:p>
+        </w:tc>
+      </w:tr>
+      <w:tr>
+        <w:trPr>
+          <w:cantSplit/>
+        </w:trPr>
+        <w:tc>
+          <w:tcPr>
+            <w:tcW w:type="dxa" w:w="1814"/>
+          </w:tcPr>
+          <w:p>
+            <w:pPr>
+              <w:spacing w:after="40"/>
+            </w:pPr>
+            <w:r/>
+            <w:r>
+              <w:rPr>
+                <w:rFonts w:ascii="微软雅黑" w:hAnsi="微软雅黑" w:eastAsia="微软雅黑"/>
+                <w:sz w:val="17"/>
               </w:rPr>
               <w:t>演示视频</w:t>
             </w:r>
@@ -358,7 +399,7 @@
             <w:r>
               <w:rPr>
                 <w:rFonts w:ascii="微软雅黑" w:hAnsi="微软雅黑" w:eastAsia="微软雅黑"/>
-                <w:sz w:val="18"/>
+                <w:sz w:val="17"/>
               </w:rPr>
               <w:t>https://www.bilibili.com/video/BV1FvHA6YEyP/（P1 走大模型 / P2 离线模式）</w:t>
             </w:r>
@@ -381,7 +422,7 @@
             <w:r>
               <w:rPr>
                 <w:rFonts w:ascii="微软雅黑" w:hAnsi="微软雅黑" w:eastAsia="微软雅黑"/>
-                <w:sz w:val="18"/>
+                <w:sz w:val="17"/>
               </w:rPr>
               <w:t>文档版本</w:t>
             </w:r>
@@ -399,7 +440,7 @@
             <w:r>
               <w:rPr>
                 <w:rFonts w:ascii="微软雅黑" w:hAnsi="微软雅黑" w:eastAsia="微软雅黑"/>
-                <w:sz w:val="18"/>
+                <w:sz w:val="17"/>
               </w:rPr>
               <w:t>v1.0</w:t>
             </w:r>

</xml_diff>

<commit_message>
docs: add P0 capability section to report PDF (12 pages)
</commit_message>
<xml_diff>
--- a/docs/bpmn-gen-report.docx
+++ b/docs/bpmn-gen-report.docx
@@ -2494,7 +2494,7 @@
                 <w:rFonts w:ascii="微软雅黑" w:hAnsi="微软雅黑" w:eastAsia="微软雅黑"/>
                 <w:sz w:val="18"/>
               </w:rPr>
-              <w:t>16 / 16 文件</w:t>
+              <w:t>54 / 54 文件</w:t>
             </w:r>
           </w:p>
         </w:tc>
@@ -2571,7 +2571,7 @@
                 <w:rFonts w:ascii="微软雅黑" w:hAnsi="微软雅黑" w:eastAsia="微软雅黑"/>
                 <w:sz w:val="18"/>
               </w:rPr>
-              <w:t>16 / 16 文件</w:t>
+              <w:t>54 / 54 文件</w:t>
             </w:r>
           </w:p>
         </w:tc>
@@ -2648,7 +2648,7 @@
                 <w:rFonts w:ascii="微软雅黑" w:hAnsi="微软雅黑" w:eastAsia="微软雅黑"/>
                 <w:sz w:val="18"/>
               </w:rPr>
-              <w:t>19 / 19 文件</w:t>
+              <w:t>54 / 54 文件</w:t>
             </w:r>
           </w:p>
         </w:tc>
@@ -2725,7 +2725,7 @@
                 <w:rFonts w:ascii="微软雅黑" w:hAnsi="微软雅黑" w:eastAsia="微软雅黑"/>
                 <w:sz w:val="18"/>
               </w:rPr>
-              <w:t>6 / 6 场景</w:t>
+              <w:t>9 / 9 场景</w:t>
             </w:r>
           </w:p>
         </w:tc>
@@ -3894,6 +3894,356 @@
     </w:p>
     <w:p>
       <w:pPr>
+        <w:pStyle w:val="Heading2"/>
+      </w:pPr>
+      <w:r>
+        <w:t>4.1 已实现的扩展能力</w:t>
+      </w:r>
+    </w:p>
+    <w:p>
+      <w:pPr>
+        <w:spacing w:after="120"/>
+      </w:pPr>
+      <w:r>
+        <w:rPr>
+          <w:rFonts w:ascii="微软雅黑" w:hAnsi="微软雅黑" w:eastAsia="微软雅黑"/>
+          <w:b w:val="0"/>
+          <w:i w:val="0"/>
+          <w:color w:val="1F2329"/>
+          <w:sz w:val="21"/>
+        </w:rPr>
+        <w:t>在基础生成能力之上，补齐了真实审批场景最需要的四项：</w:t>
+      </w:r>
+    </w:p>
+    <w:tbl>
+      <w:tblPr>
+        <w:tblStyle w:val="TableGrid"/>
+        <w:tblW w:type="auto" w:w="0"/>
+        <w:jc w:val="center"/>
+        <w:tblLayout w:type="fixed"/>
+        <w:tblLook w:firstColumn="1" w:firstRow="1" w:lastColumn="0" w:lastRow="0" w:noHBand="0" w:noVBand="1" w:val="04A0"/>
+      </w:tblPr>
+      <w:tblGrid>
+        <w:gridCol w:w="3024"/>
+        <w:gridCol w:w="3024"/>
+        <w:gridCol w:w="3024"/>
+      </w:tblGrid>
+      <w:tr>
+        <w:trPr>
+          <w:cantSplit/>
+          <w:tblHeader/>
+        </w:trPr>
+        <w:tc>
+          <w:tcPr>
+            <w:tcW w:type="dxa" w:w="1928"/>
+            <w:shd w:fill="EEF1F6"/>
+          </w:tcPr>
+          <w:p>
+            <w:r/>
+            <w:r>
+              <w:rPr>
+                <w:rFonts w:ascii="微软雅黑" w:hAnsi="微软雅黑"/>
+                <w:b/>
+                <w:sz w:val="18"/>
+              </w:rPr>
+              <w:t>能力</w:t>
+            </w:r>
+          </w:p>
+        </w:tc>
+        <w:tc>
+          <w:tcPr>
+            <w:tcW w:type="dxa" w:w="4309"/>
+            <w:shd w:fill="EEF1F6"/>
+          </w:tcPr>
+          <w:p>
+            <w:r/>
+            <w:r>
+              <w:rPr>
+                <w:rFonts w:ascii="微软雅黑" w:hAnsi="微软雅黑"/>
+                <w:b/>
+                <w:sz w:val="18"/>
+              </w:rPr>
+              <w:t>实现方式</w:t>
+            </w:r>
+          </w:p>
+        </w:tc>
+        <w:tc>
+          <w:tcPr>
+            <w:tcW w:type="dxa" w:w="2551"/>
+            <w:shd w:fill="EEF1F6"/>
+          </w:tcPr>
+          <w:p>
+            <w:r/>
+            <w:r>
+              <w:rPr>
+                <w:rFonts w:ascii="微软雅黑" w:hAnsi="微软雅黑"/>
+                <w:b/>
+                <w:sz w:val="18"/>
+              </w:rPr>
+              <w:t>验证方式</w:t>
+            </w:r>
+          </w:p>
+        </w:tc>
+      </w:tr>
+      <w:tr>
+        <w:trPr>
+          <w:cantSplit/>
+        </w:trPr>
+        <w:tc>
+          <w:tcPr>
+            <w:tcW w:type="dxa" w:w="1928"/>
+          </w:tcPr>
+          <w:p>
+            <w:pPr>
+              <w:spacing w:after="40"/>
+            </w:pPr>
+            <w:r/>
+            <w:r>
+              <w:rPr>
+                <w:rFonts w:ascii="微软雅黑" w:hAnsi="微软雅黑" w:eastAsia="微软雅黑"/>
+                <w:sz w:val="18"/>
+              </w:rPr>
+              <w:t>审批驳回 / 退回</w:t>
+            </w:r>
+          </w:p>
+        </w:tc>
+        <w:tc>
+          <w:tcPr>
+            <w:tcW w:type="dxa" w:w="4309"/>
+          </w:tcPr>
+          <w:p>
+            <w:pPr>
+              <w:spacing w:after="40"/>
+            </w:pPr>
+            <w:r/>
+            <w:r>
+              <w:rPr>
+                <w:rFonts w:ascii="微软雅黑" w:hAnsi="微软雅黑" w:eastAsia="微软雅黑"/>
+                <w:sz w:val="18"/>
+              </w:rPr>
+              <w:t>BPMN 回边：通过设为默认流，驳回走 approved == false 条件</w:t>
+            </w:r>
+          </w:p>
+        </w:tc>
+        <w:tc>
+          <w:tcPr>
+            <w:tcW w:type="dxa" w:w="2551"/>
+          </w:tcPr>
+          <w:p>
+            <w:pPr>
+              <w:spacing w:after="40"/>
+            </w:pPr>
+            <w:r/>
+            <w:r>
+              <w:rPr>
+                <w:rFonts w:ascii="微软雅黑" w:hAnsi="微软雅黑" w:eastAsia="微软雅黑"/>
+                <w:sz w:val="18"/>
+              </w:rPr>
+              <w:t>第 6 层含 3 条驳回路径断言</w:t>
+            </w:r>
+          </w:p>
+        </w:tc>
+      </w:tr>
+      <w:tr>
+        <w:trPr>
+          <w:cantSplit/>
+        </w:trPr>
+        <w:tc>
+          <w:tcPr>
+            <w:tcW w:type="dxa" w:w="1928"/>
+          </w:tcPr>
+          <w:p>
+            <w:pPr>
+              <w:spacing w:after="40"/>
+            </w:pPr>
+            <w:r/>
+            <w:r>
+              <w:rPr>
+                <w:rFonts w:ascii="微软雅黑" w:hAnsi="微软雅黑" w:eastAsia="微软雅黑"/>
+                <w:sz w:val="18"/>
+              </w:rPr>
+              <w:t>15 个审批模板</w:t>
+            </w:r>
+          </w:p>
+        </w:tc>
+        <w:tc>
+          <w:tcPr>
+            <w:tcW w:type="dxa" w:w="4309"/>
+          </w:tcPr>
+          <w:p>
+            <w:pPr>
+              <w:spacing w:after="40"/>
+            </w:pPr>
+            <w:r/>
+            <w:r>
+              <w:rPr>
+                <w:rFonts w:ascii="微软雅黑" w:hAnsi="微软雅黑" w:eastAsia="微软雅黑"/>
+                <w:sz w:val="18"/>
+              </w:rPr>
+              <w:t>纯 JSON 模板库，新增场景只需加一个文件</w:t>
+            </w:r>
+          </w:p>
+        </w:tc>
+        <w:tc>
+          <w:tcPr>
+            <w:tcW w:type="dxa" w:w="2551"/>
+          </w:tcPr>
+          <w:p>
+            <w:pPr>
+              <w:spacing w:after="40"/>
+            </w:pPr>
+            <w:r/>
+            <w:r>
+              <w:rPr>
+                <w:rFonts w:ascii="微软雅黑" w:hAnsi="微软雅黑" w:eastAsia="微软雅黑"/>
+                <w:sz w:val="18"/>
+              </w:rPr>
+              <w:t>每个模板都过六层校验</w:t>
+            </w:r>
+          </w:p>
+        </w:tc>
+      </w:tr>
+      <w:tr>
+        <w:trPr>
+          <w:cantSplit/>
+        </w:trPr>
+        <w:tc>
+          <w:tcPr>
+            <w:tcW w:type="dxa" w:w="1928"/>
+          </w:tcPr>
+          <w:p>
+            <w:pPr>
+              <w:spacing w:after="40"/>
+            </w:pPr>
+            <w:r/>
+            <w:r>
+              <w:rPr>
+                <w:rFonts w:ascii="微软雅黑" w:hAnsi="微软雅黑" w:eastAsia="微软雅黑"/>
+                <w:sz w:val="18"/>
+              </w:rPr>
+              <w:t>交互式澄清</w:t>
+            </w:r>
+          </w:p>
+        </w:tc>
+        <w:tc>
+          <w:tcPr>
+            <w:tcW w:type="dxa" w:w="4309"/>
+          </w:tcPr>
+          <w:p>
+            <w:pPr>
+              <w:spacing w:after="40"/>
+            </w:pPr>
+            <w:r/>
+            <w:r>
+              <w:rPr>
+                <w:rFonts w:ascii="微软雅黑" w:hAnsi="微软雅黑" w:eastAsia="微软雅黑"/>
+                <w:sz w:val="18"/>
+              </w:rPr>
+              <w:t>关键词得分不足或模型置信度低于 0.7 时，列出候选让人确认，不硬生成</w:t>
+            </w:r>
+          </w:p>
+        </w:tc>
+        <w:tc>
+          <w:tcPr>
+            <w:tcW w:type="dxa" w:w="2551"/>
+          </w:tcPr>
+          <w:p>
+            <w:pPr>
+              <w:spacing w:after="40"/>
+            </w:pPr>
+            <w:r/>
+            <w:r>
+              <w:rPr>
+                <w:rFonts w:ascii="微软雅黑" w:hAnsi="微软雅黑" w:eastAsia="微软雅黑"/>
+                <w:sz w:val="18"/>
+              </w:rPr>
+              <w:t>接口返回 needClarify + candidates</w:t>
+            </w:r>
+          </w:p>
+        </w:tc>
+      </w:tr>
+      <w:tr>
+        <w:trPr>
+          <w:cantSplit/>
+        </w:trPr>
+        <w:tc>
+          <w:tcPr>
+            <w:tcW w:type="dxa" w:w="1928"/>
+          </w:tcPr>
+          <w:p>
+            <w:pPr>
+              <w:spacing w:after="40"/>
+            </w:pPr>
+            <w:r/>
+            <w:r>
+              <w:rPr>
+                <w:rFonts w:ascii="微软雅黑" w:hAnsi="微软雅黑" w:eastAsia="微软雅黑"/>
+                <w:sz w:val="18"/>
+              </w:rPr>
+              <w:t>配套产物</w:t>
+            </w:r>
+          </w:p>
+        </w:tc>
+        <w:tc>
+          <w:tcPr>
+            <w:tcW w:type="dxa" w:w="4309"/>
+          </w:tcPr>
+          <w:p>
+            <w:pPr>
+              <w:spacing w:after="40"/>
+            </w:pPr>
+            <w:r/>
+            <w:r>
+              <w:rPr>
+                <w:rFonts w:ascii="微软雅黑" w:hAnsi="微软雅黑" w:eastAsia="微软雅黑"/>
+                <w:sz w:val="18"/>
+              </w:rPr>
+              <w:t>每次生成同时产出表单定义、流程说明书、分支覆盖用例</w:t>
+            </w:r>
+          </w:p>
+        </w:tc>
+        <w:tc>
+          <w:tcPr>
+            <w:tcW w:type="dxa" w:w="2551"/>
+          </w:tcPr>
+          <w:p>
+            <w:pPr>
+              <w:spacing w:after="40"/>
+            </w:pPr>
+            <w:r/>
+            <w:r>
+              <w:rPr>
+                <w:rFonts w:ascii="微软雅黑" w:hAnsi="微软雅黑" w:eastAsia="微软雅黑"/>
+                <w:sz w:val="18"/>
+              </w:rPr>
+              <w:t>单元测试断言三类产物内容</w:t>
+            </w:r>
+          </w:p>
+        </w:tc>
+      </w:tr>
+    </w:tbl>
+    <w:p>
+      <w:pPr>
+        <w:spacing w:after="40"/>
+      </w:pPr>
+    </w:p>
+    <w:p>
+      <w:pPr>
+        <w:spacing w:after="120"/>
+      </w:pPr>
+      <w:r>
+        <w:rPr>
+          <w:rFonts w:ascii="微软雅黑" w:hAnsi="微软雅黑" w:eastAsia="微软雅黑"/>
+          <w:b w:val="0"/>
+          <w:i w:val="0"/>
+          <w:color w:val="6B7280"/>
+          <w:sz w:val="19"/>
+        </w:rPr>
+        <w:t>驳回的工程量集中在三处：自动布局要为回边绕行（否则分层会发散）、修复器不能再删任务上的默认流、引擎要求条件变量必须存在（写成 approved == false 会抛异常，需用 execution.getVariable）。</w:t>
+      </w:r>
+    </w:p>
+    <w:p>
+      <w:pPr>
         <w:pStyle w:val="Heading1"/>
       </w:pPr>
       <w:r>
@@ -4199,7 +4549,7 @@
                 <w:rFonts w:ascii="微软雅黑" w:hAnsi="微软雅黑" w:eastAsia="微软雅黑"/>
                 <w:sz w:val="18"/>
               </w:rPr>
-              <w:t>128 项断言全部通过</w:t>
+              <w:t>189 项断言全部通过</w:t>
             </w:r>
           </w:p>
         </w:tc>
@@ -4317,7 +4667,7 @@
                 <w:rFonts w:ascii="微软雅黑" w:hAnsi="微软雅黑" w:eastAsia="微软雅黑"/>
                 <w:sz w:val="18"/>
               </w:rPr>
-              <w:t>19 / 19 文件通过</w:t>
+              <w:t>54 / 54 文件通过</w:t>
             </w:r>
           </w:p>
         </w:tc>
@@ -4376,7 +4726,7 @@
                 <w:rFonts w:ascii="微软雅黑" w:hAnsi="微软雅黑" w:eastAsia="微软雅黑"/>
                 <w:sz w:val="18"/>
               </w:rPr>
-              <w:t>19 / 19 文件通过</w:t>
+              <w:t>54 / 54 文件通过</w:t>
             </w:r>
           </w:p>
         </w:tc>
@@ -4435,7 +4785,7 @@
                 <w:rFonts w:ascii="微软雅黑" w:hAnsi="微软雅黑" w:eastAsia="微软雅黑"/>
                 <w:sz w:val="18"/>
               </w:rPr>
-              <w:t>19 / 19 文件通过</w:t>
+              <w:t>54 / 54 文件通过</w:t>
             </w:r>
           </w:p>
         </w:tc>
@@ -4494,7 +4844,7 @@
                 <w:rFonts w:ascii="微软雅黑" w:hAnsi="微软雅黑" w:eastAsia="微软雅黑"/>
                 <w:sz w:val="18"/>
               </w:rPr>
-              <w:t>6 / 6 场景通过</w:t>
+              <w:t>9 / 9 场景通过</w:t>
             </w:r>
           </w:p>
         </w:tc>
@@ -6568,7 +6918,7 @@
                 <w:rFonts w:ascii="微软雅黑" w:hAnsi="微软雅黑" w:eastAsia="微软雅黑"/>
                 <w:sz w:val="18"/>
               </w:rPr>
-              <w:t>8 个审批流模板（JSON，可直接增删）</w:t>
+              <w:t>15 个审批流模板（JSON，可直接增删）</w:t>
             </w:r>
           </w:p>
         </w:tc>
@@ -6609,7 +6959,7 @@
                 <w:rFonts w:ascii="微软雅黑" w:hAnsi="微软雅黑" w:eastAsia="微软雅黑"/>
                 <w:sz w:val="18"/>
               </w:rPr>
-              <w:t>正向 / 反向 / 可修复 / 自然语言用例，共 118 项断言</w:t>
+              <w:t>正向 / 反向 / 可修复 / 自然语言用例，共 189 项断言</w:t>
             </w:r>
           </w:p>
         </w:tc>

</xml_diff>

<commit_message>
feat: 10 more templates (25 total), gov scenarios included
</commit_message>
<xml_diff>
--- a/docs/bpmn-gen-report.docx
+++ b/docs/bpmn-gen-report.docx
@@ -2494,7 +2494,7 @@
                 <w:rFonts w:ascii="微软雅黑" w:hAnsi="微软雅黑" w:eastAsia="微软雅黑"/>
                 <w:sz w:val="18"/>
               </w:rPr>
-              <w:t>54 / 54 文件</w:t>
+              <w:t>80 / 80 文件</w:t>
             </w:r>
           </w:p>
         </w:tc>
@@ -2571,7 +2571,7 @@
                 <w:rFonts w:ascii="微软雅黑" w:hAnsi="微软雅黑" w:eastAsia="微软雅黑"/>
                 <w:sz w:val="18"/>
               </w:rPr>
-              <w:t>54 / 54 文件</w:t>
+              <w:t>80 / 80 文件</w:t>
             </w:r>
           </w:p>
         </w:tc>
@@ -2648,7 +2648,7 @@
                 <w:rFonts w:ascii="微软雅黑" w:hAnsi="微软雅黑" w:eastAsia="微软雅黑"/>
                 <w:sz w:val="18"/>
               </w:rPr>
-              <w:t>54 / 54 文件</w:t>
+              <w:t>80 / 80 文件</w:t>
             </w:r>
           </w:p>
         </w:tc>
@@ -3808,6 +3808,242 @@
                 <w:sz w:val="18"/>
               </w:rPr>
               <w:t>expense_reimburse</w:t>
+            </w:r>
+          </w:p>
+        </w:tc>
+      </w:tr>
+      <w:tr>
+        <w:trPr>
+          <w:cantSplit/>
+        </w:trPr>
+        <w:tc>
+          <w:tcPr>
+            <w:tcW w:type="dxa" w:w="1474"/>
+          </w:tcPr>
+          <w:p>
+            <w:pPr>
+              <w:spacing w:after="40"/>
+            </w:pPr>
+            <w:r/>
+            <w:r>
+              <w:rPr>
+                <w:rFonts w:ascii="微软雅黑" w:hAnsi="微软雅黑" w:eastAsia="微软雅黑"/>
+                <w:sz w:val="18"/>
+              </w:rPr>
+              <w:t>公文签发</w:t>
+            </w:r>
+          </w:p>
+        </w:tc>
+        <w:tc>
+          <w:tcPr>
+            <w:tcW w:type="dxa" w:w="4535"/>
+          </w:tcPr>
+          <w:p>
+            <w:pPr>
+              <w:spacing w:after="40"/>
+            </w:pPr>
+            <w:r/>
+            <w:r>
+              <w:rPr>
+                <w:rFonts w:ascii="微软雅黑" w:hAnsi="微软雅黑" w:eastAsia="微软雅黑"/>
+                <w:sz w:val="18"/>
+              </w:rPr>
+              <w:t>拟稿 → 核稿 → 会签 → 签发（政务发文）</w:t>
+            </w:r>
+          </w:p>
+        </w:tc>
+        <w:tc>
+          <w:tcPr>
+            <w:tcW w:type="dxa" w:w="2778"/>
+          </w:tcPr>
+          <w:p>
+            <w:pPr>
+              <w:spacing w:after="40"/>
+            </w:pPr>
+            <w:r/>
+            <w:r>
+              <w:rPr>
+                <w:rFonts w:ascii="微软雅黑" w:hAnsi="微软雅黑" w:eastAsia="微软雅黑"/>
+                <w:sz w:val="18"/>
+              </w:rPr>
+              <w:t>official_document</w:t>
+            </w:r>
+          </w:p>
+        </w:tc>
+      </w:tr>
+      <w:tr>
+        <w:trPr>
+          <w:cantSplit/>
+        </w:trPr>
+        <w:tc>
+          <w:tcPr>
+            <w:tcW w:type="dxa" w:w="1474"/>
+          </w:tcPr>
+          <w:p>
+            <w:pPr>
+              <w:spacing w:after="40"/>
+            </w:pPr>
+            <w:r/>
+            <w:r>
+              <w:rPr>
+                <w:rFonts w:ascii="微软雅黑" w:hAnsi="微软雅黑" w:eastAsia="微软雅黑"/>
+                <w:sz w:val="18"/>
+              </w:rPr>
+              <w:t>投诉信访</w:t>
+            </w:r>
+          </w:p>
+        </w:tc>
+        <w:tc>
+          <w:tcPr>
+            <w:tcW w:type="dxa" w:w="4535"/>
+          </w:tcPr>
+          <w:p>
+            <w:pPr>
+              <w:spacing w:after="40"/>
+            </w:pPr>
+            <w:r/>
+            <w:r>
+              <w:rPr>
+                <w:rFonts w:ascii="微软雅黑" w:hAnsi="微软雅黑" w:eastAsia="微软雅黑"/>
+                <w:sz w:val="18"/>
+              </w:rPr>
+              <w:t>登记 → 分办 → 责任部门处理 → 回访</w:t>
+            </w:r>
+          </w:p>
+        </w:tc>
+        <w:tc>
+          <w:tcPr>
+            <w:tcW w:type="dxa" w:w="2778"/>
+          </w:tcPr>
+          <w:p>
+            <w:pPr>
+              <w:spacing w:after="40"/>
+            </w:pPr>
+            <w:r/>
+            <w:r>
+              <w:rPr>
+                <w:rFonts w:ascii="微软雅黑" w:hAnsi="微软雅黑" w:eastAsia="微软雅黑"/>
+                <w:sz w:val="18"/>
+              </w:rPr>
+              <w:t>complaint_handling</w:t>
+            </w:r>
+          </w:p>
+        </w:tc>
+      </w:tr>
+      <w:tr>
+        <w:trPr>
+          <w:cantSplit/>
+        </w:trPr>
+        <w:tc>
+          <w:tcPr>
+            <w:tcW w:type="dxa" w:w="1474"/>
+          </w:tcPr>
+          <w:p>
+            <w:pPr>
+              <w:spacing w:after="40"/>
+            </w:pPr>
+            <w:r/>
+            <w:r>
+              <w:rPr>
+                <w:rFonts w:ascii="微软雅黑" w:hAnsi="微软雅黑" w:eastAsia="微软雅黑"/>
+                <w:sz w:val="18"/>
+              </w:rPr>
+              <w:t>会议审批</w:t>
+            </w:r>
+          </w:p>
+        </w:tc>
+        <w:tc>
+          <w:tcPr>
+            <w:tcW w:type="dxa" w:w="4535"/>
+          </w:tcPr>
+          <w:p>
+            <w:pPr>
+              <w:spacing w:after="40"/>
+            </w:pPr>
+            <w:r/>
+            <w:r>
+              <w:rPr>
+                <w:rFonts w:ascii="微软雅黑" w:hAnsi="微软雅黑" w:eastAsia="微软雅黑"/>
+                <w:sz w:val="18"/>
+              </w:rPr>
+              <w:t>按会议级别分流：一般 / 重要</w:t>
+            </w:r>
+          </w:p>
+        </w:tc>
+        <w:tc>
+          <w:tcPr>
+            <w:tcW w:type="dxa" w:w="2778"/>
+          </w:tcPr>
+          <w:p>
+            <w:pPr>
+              <w:spacing w:after="40"/>
+            </w:pPr>
+            <w:r/>
+            <w:r>
+              <w:rPr>
+                <w:rFonts w:ascii="微软雅黑" w:hAnsi="微软雅黑" w:eastAsia="微软雅黑"/>
+                <w:sz w:val="18"/>
+              </w:rPr>
+              <w:t>meeting_apply（排他网关）</w:t>
+            </w:r>
+          </w:p>
+        </w:tc>
+      </w:tr>
+      <w:tr>
+        <w:trPr>
+          <w:cantSplit/>
+        </w:trPr>
+        <w:tc>
+          <w:tcPr>
+            <w:tcW w:type="dxa" w:w="1474"/>
+          </w:tcPr>
+          <w:p>
+            <w:pPr>
+              <w:spacing w:after="40"/>
+            </w:pPr>
+            <w:r/>
+            <w:r>
+              <w:rPr>
+                <w:rFonts w:ascii="微软雅黑" w:hAnsi="微软雅黑" w:eastAsia="微软雅黑"/>
+                <w:sz w:val="18"/>
+              </w:rPr>
+              <w:t>出差 / 借款 / 用车</w:t>
+            </w:r>
+          </w:p>
+        </w:tc>
+        <w:tc>
+          <w:tcPr>
+            <w:tcW w:type="dxa" w:w="4535"/>
+          </w:tcPr>
+          <w:p>
+            <w:pPr>
+              <w:spacing w:after="40"/>
+            </w:pPr>
+            <w:r/>
+            <w:r>
+              <w:rPr>
+                <w:rFonts w:ascii="微软雅黑" w:hAnsi="微软雅黑" w:eastAsia="微软雅黑"/>
+                <w:sz w:val="18"/>
+              </w:rPr>
+              <w:t>日常行政事务的串行审批</w:t>
+            </w:r>
+          </w:p>
+        </w:tc>
+        <w:tc>
+          <w:tcPr>
+            <w:tcW w:type="dxa" w:w="2778"/>
+          </w:tcPr>
+          <w:p>
+            <w:pPr>
+              <w:spacing w:after="40"/>
+            </w:pPr>
+            <w:r/>
+            <w:r>
+              <w:rPr>
+                <w:rFonts w:ascii="微软雅黑" w:hAnsi="微软雅黑" w:eastAsia="微软雅黑"/>
+                <w:sz w:val="18"/>
+              </w:rPr>
+              <w:t>business_trip / loan_request / vehicle_use</w:t>
             </w:r>
           </w:p>
         </w:tc>
@@ -4549,7 +4785,7 @@
                 <w:rFonts w:ascii="微软雅黑" w:hAnsi="微软雅黑" w:eastAsia="微软雅黑"/>
                 <w:sz w:val="18"/>
               </w:rPr>
-              <w:t>189 项断言全部通过</w:t>
+              <w:t>241 项断言全部通过</w:t>
             </w:r>
           </w:p>
         </w:tc>
@@ -4667,7 +4903,7 @@
                 <w:rFonts w:ascii="微软雅黑" w:hAnsi="微软雅黑" w:eastAsia="微软雅黑"/>
                 <w:sz w:val="18"/>
               </w:rPr>
-              <w:t>54 / 54 文件通过</w:t>
+              <w:t>80 / 80 文件通过</w:t>
             </w:r>
           </w:p>
         </w:tc>
@@ -4726,7 +4962,7 @@
                 <w:rFonts w:ascii="微软雅黑" w:hAnsi="微软雅黑" w:eastAsia="微软雅黑"/>
                 <w:sz w:val="18"/>
               </w:rPr>
-              <w:t>54 / 54 文件通过</w:t>
+              <w:t>80 / 80 文件通过</w:t>
             </w:r>
           </w:p>
         </w:tc>
@@ -4785,7 +5021,7 @@
                 <w:rFonts w:ascii="微软雅黑" w:hAnsi="微软雅黑" w:eastAsia="微软雅黑"/>
                 <w:sz w:val="18"/>
               </w:rPr>
-              <w:t>54 / 54 文件通过</w:t>
+              <w:t>80 / 80 文件通过</w:t>
             </w:r>
           </w:p>
         </w:tc>
@@ -6918,7 +7154,7 @@
                 <w:rFonts w:ascii="微软雅黑" w:hAnsi="微软雅黑" w:eastAsia="微软雅黑"/>
                 <w:sz w:val="18"/>
               </w:rPr>
-              <w:t>15 个审批流模板（JSON，可直接增删）</w:t>
+              <w:t>25 个审批流模板（JSON，可直接增删）</w:t>
             </w:r>
           </w:p>
         </w:tc>
@@ -6959,7 +7195,7 @@
                 <w:rFonts w:ascii="微软雅黑" w:hAnsi="微软雅黑" w:eastAsia="微软雅黑"/>
                 <w:sz w:val="18"/>
               </w:rPr>
-              <w:t>正向 / 反向 / 可修复 / 自然语言用例，共 189 项断言</w:t>
+              <w:t>正向 / 反向 / 可修复 / 自然语言用例，共 241 项断言</w:t>
             </w:r>
           </w:p>
         </w:tc>

</xml_diff>

<commit_message>
feat: multi-instance cosign/orsign with configurable signer list
</commit_message>
<xml_diff>
--- a/docs/bpmn-gen-report.docx
+++ b/docs/bpmn-gen-report.docx
@@ -2494,7 +2494,7 @@
                 <w:rFonts w:ascii="微软雅黑" w:hAnsi="微软雅黑" w:eastAsia="微软雅黑"/>
                 <w:sz w:val="18"/>
               </w:rPr>
-              <w:t>80 / 80 文件</w:t>
+              <w:t>85 / 85 文件</w:t>
             </w:r>
           </w:p>
         </w:tc>
@@ -2571,7 +2571,7 @@
                 <w:rFonts w:ascii="微软雅黑" w:hAnsi="微软雅黑" w:eastAsia="微软雅黑"/>
                 <w:sz w:val="18"/>
               </w:rPr>
-              <w:t>80 / 80 文件</w:t>
+              <w:t>85 / 85 文件</w:t>
             </w:r>
           </w:p>
         </w:tc>
@@ -2648,7 +2648,7 @@
                 <w:rFonts w:ascii="微软雅黑" w:hAnsi="微软雅黑" w:eastAsia="微软雅黑"/>
                 <w:sz w:val="18"/>
               </w:rPr>
-              <w:t>80 / 80 文件</w:t>
+              <w:t>85 / 85 文件</w:t>
             </w:r>
           </w:p>
         </w:tc>
@@ -2725,7 +2725,7 @@
                 <w:rFonts w:ascii="微软雅黑" w:hAnsi="微软雅黑" w:eastAsia="微软雅黑"/>
                 <w:sz w:val="18"/>
               </w:rPr>
-              <w:t>9 / 9 场景</w:t>
+              <w:t>12 / 12 场景</w:t>
             </w:r>
           </w:p>
         </w:tc>
@@ -4785,7 +4785,7 @@
                 <w:rFonts w:ascii="微软雅黑" w:hAnsi="微软雅黑" w:eastAsia="微软雅黑"/>
                 <w:sz w:val="18"/>
               </w:rPr>
-              <w:t>241 项断言全部通过</w:t>
+              <w:t>265 项断言全部通过</w:t>
             </w:r>
           </w:p>
         </w:tc>
@@ -4903,7 +4903,7 @@
                 <w:rFonts w:ascii="微软雅黑" w:hAnsi="微软雅黑" w:eastAsia="微软雅黑"/>
                 <w:sz w:val="18"/>
               </w:rPr>
-              <w:t>80 / 80 文件通过</w:t>
+              <w:t>85 / 85 文件通过</w:t>
             </w:r>
           </w:p>
         </w:tc>
@@ -4962,7 +4962,7 @@
                 <w:rFonts w:ascii="微软雅黑" w:hAnsi="微软雅黑" w:eastAsia="微软雅黑"/>
                 <w:sz w:val="18"/>
               </w:rPr>
-              <w:t>80 / 80 文件通过</w:t>
+              <w:t>85 / 85 文件通过</w:t>
             </w:r>
           </w:p>
         </w:tc>
@@ -5021,7 +5021,7 @@
                 <w:rFonts w:ascii="微软雅黑" w:hAnsi="微软雅黑" w:eastAsia="微软雅黑"/>
                 <w:sz w:val="18"/>
               </w:rPr>
-              <w:t>80 / 80 文件通过</w:t>
+              <w:t>85 / 85 文件通过</w:t>
             </w:r>
           </w:p>
         </w:tc>
@@ -5080,7 +5080,7 @@
                 <w:rFonts w:ascii="微软雅黑" w:hAnsi="微软雅黑" w:eastAsia="微软雅黑"/>
                 <w:sz w:val="18"/>
               </w:rPr>
-              <w:t>9 / 9 场景通过</w:t>
+              <w:t>12 / 12 场景通过</w:t>
             </w:r>
           </w:p>
         </w:tc>
@@ -7154,7 +7154,7 @@
                 <w:rFonts w:ascii="微软雅黑" w:hAnsi="微软雅黑" w:eastAsia="微软雅黑"/>
                 <w:sz w:val="18"/>
               </w:rPr>
-              <w:t>25 个审批流模板（JSON，可直接增删）</w:t>
+              <w:t>27 个审批流模板（JSON，可直接增删）</w:t>
             </w:r>
           </w:p>
         </w:tc>
@@ -7195,7 +7195,7 @@
                 <w:rFonts w:ascii="微软雅黑" w:hAnsi="微软雅黑" w:eastAsia="微软雅黑"/>
                 <w:sz w:val="18"/>
               </w:rPr>
-              <w:t>正向 / 反向 / 可修复 / 自然语言用例，共 241 项断言</w:t>
+              <w:t>正向 / 反向 / 可修复 / 自然语言用例，共 265 项断言</w:t>
             </w:r>
           </w:p>
         </w:tc>

</xml_diff>

<commit_message>
feat: SVG export button, zero-dep BPMN-to-SVG renderer, diagrams in docs
</commit_message>
<xml_diff>
--- a/docs/bpmn-gen-report.docx
+++ b/docs/bpmn-gen-report.docx
@@ -4298,7 +4298,7 @@
                 <w:rFonts w:ascii="微软雅黑" w:hAnsi="微软雅黑" w:eastAsia="微软雅黑"/>
                 <w:sz w:val="18"/>
               </w:rPr>
-              <w:t>15 个审批模板</w:t>
+              <w:t>27 个审批模板</w:t>
             </w:r>
           </w:p>
         </w:tc>
@@ -4476,6 +4476,137 @@
           <w:sz w:val="19"/>
         </w:rPr>
         <w:t>驳回的工程量集中在三处：自动布局要为回边绕行（否则分层会发散）、修复器不能再删任务上的默认流、引擎要求条件变量必须存在（写成 approved == false 会抛异常，需用 execution.getVariable）。</w:t>
+      </w:r>
+    </w:p>
+    <w:p>
+      <w:pPr>
+        <w:pStyle w:val="Heading2"/>
+      </w:pPr>
+      <w:r>
+        <w:t>4.2 生成效果（真实输出）</w:t>
+      </w:r>
+    </w:p>
+    <w:p>
+      <w:pPr>
+        <w:spacing w:after="120"/>
+      </w:pPr>
+      <w:r>
+        <w:rPr>
+          <w:rFonts w:ascii="微软雅黑" w:hAnsi="微软雅黑" w:eastAsia="微软雅黑"/>
+          <w:b w:val="0"/>
+          <w:i w:val="0"/>
+          <w:color w:val="1F2329"/>
+          <w:sz w:val="21"/>
+        </w:rPr>
+        <w:t>下面两张图由 nl2bpmn 的实际产物渲染而来（直接读 BPMN 的 DI 坐标，不经过浏览器），不是示意图。</w:t>
+      </w:r>
+    </w:p>
+    <w:p>
+      <w:pPr>
+        <w:jc w:val="center"/>
+      </w:pPr>
+      <w:r>
+        <w:drawing>
+          <wp:inline xmlns:a="http://schemas.openxmlformats.org/drawingml/2006/main" xmlns:pic="http://schemas.openxmlformats.org/drawingml/2006/picture">
+            <wp:extent cx="5577840" cy="2743200"/>
+            <wp:docPr id="1" name="Picture 1"/>
+            <wp:cNvGraphicFramePr>
+              <a:graphicFrameLocks noChangeAspect="1"/>
+            </wp:cNvGraphicFramePr>
+            <a:graphic>
+              <a:graphicData uri="http://schemas.openxmlformats.org/drawingml/2006/picture">
+                <pic:pic>
+                  <pic:nvPicPr>
+                    <pic:cNvPr id="0" name="flow-travel-reject.png"/>
+                    <pic:cNvPicPr/>
+                  </pic:nvPicPr>
+                  <pic:blipFill>
+                    <a:blip r:embed="rId9"/>
+                    <a:stretch>
+                      <a:fillRect/>
+                    </a:stretch>
+                  </pic:blipFill>
+                  <pic:spPr>
+                    <a:xfrm>
+                      <a:off x="0" y="0"/>
+                      <a:ext cx="5577840" cy="2743200"/>
+                    </a:xfrm>
+                    <a:prstGeom prst="rect"/>
+                  </pic:spPr>
+                </pic:pic>
+              </a:graphicData>
+            </a:graphic>
+          </wp:inline>
+        </w:drawing>
+      </w:r>
+    </w:p>
+    <w:p>
+      <w:pPr>
+        <w:spacing w:after="120"/>
+      </w:pPr>
+      <w:r>
+        <w:rPr>
+          <w:rFonts w:ascii="微软雅黑" w:hAnsi="微软雅黑" w:eastAsia="微软雅黑"/>
+          <w:b w:val="0"/>
+          <w:i w:val="0"/>
+          <w:color w:val="6B7280"/>
+          <w:sz w:val="18"/>
+        </w:rPr>
+        <w:t>图 1  金额分级审批流：三条金额分支 + 三条驳回回边</w:t>
+      </w:r>
+    </w:p>
+    <w:p>
+      <w:pPr>
+        <w:jc w:val="center"/>
+      </w:pPr>
+      <w:r>
+        <w:drawing>
+          <wp:inline xmlns:a="http://schemas.openxmlformats.org/drawingml/2006/main" xmlns:pic="http://schemas.openxmlformats.org/drawingml/2006/picture">
+            <wp:extent cx="5577840" cy="1475797"/>
+            <wp:docPr id="2" name="Picture 2"/>
+            <wp:cNvGraphicFramePr>
+              <a:graphicFrameLocks noChangeAspect="1"/>
+            </wp:cNvGraphicFramePr>
+            <a:graphic>
+              <a:graphicData uri="http://schemas.openxmlformats.org/drawingml/2006/picture">
+                <pic:pic>
+                  <pic:nvPicPr>
+                    <pic:cNvPr id="0" name="flow-multi-sign.png"/>
+                    <pic:cNvPicPr/>
+                  </pic:nvPicPr>
+                  <pic:blipFill>
+                    <a:blip r:embed="rId10"/>
+                    <a:stretch>
+                      <a:fillRect/>
+                    </a:stretch>
+                  </pic:blipFill>
+                  <pic:spPr>
+                    <a:xfrm>
+                      <a:off x="0" y="0"/>
+                      <a:ext cx="5577840" cy="1475797"/>
+                    </a:xfrm>
+                    <a:prstGeom prst="rect"/>
+                  </pic:spPr>
+                </pic:pic>
+              </a:graphicData>
+            </a:graphic>
+          </wp:inline>
+        </w:drawing>
+      </w:r>
+    </w:p>
+    <w:p>
+      <w:pPr>
+        <w:spacing w:after="120"/>
+      </w:pPr>
+      <w:r>
+        <w:rPr>
+          <w:rFonts w:ascii="微软雅黑" w:hAnsi="微软雅黑" w:eastAsia="微软雅黑"/>
+          <w:b w:val="0"/>
+          <w:i w:val="0"/>
+          <w:color w:val="6B7280"/>
+          <w:sz w:val="18"/>
+        </w:rPr>
+        <w:t>图 2  多人会签：人数由 approvers 列表长度决定，流程本身不写死人数</w:t>
       </w:r>
     </w:p>
     <w:p>

</xml_diff>

<commit_message>
feat: boundary timer for timeout escalation, plus timer-job assertion
</commit_message>
<xml_diff>
--- a/docs/bpmn-gen-report.docx
+++ b/docs/bpmn-gen-report.docx
@@ -2494,7 +2494,7 @@
                 <w:rFonts w:ascii="微软雅黑" w:hAnsi="微软雅黑" w:eastAsia="微软雅黑"/>
                 <w:sz w:val="18"/>
               </w:rPr>
-              <w:t>85 / 85 文件</w:t>
+              <w:t>125 / 125 文件</w:t>
             </w:r>
           </w:p>
         </w:tc>
@@ -2571,7 +2571,7 @@
                 <w:rFonts w:ascii="微软雅黑" w:hAnsi="微软雅黑" w:eastAsia="微软雅黑"/>
                 <w:sz w:val="18"/>
               </w:rPr>
-              <w:t>85 / 85 文件</w:t>
+              <w:t>125 / 125 文件</w:t>
             </w:r>
           </w:p>
         </w:tc>
@@ -2648,7 +2648,7 @@
                 <w:rFonts w:ascii="微软雅黑" w:hAnsi="微软雅黑" w:eastAsia="微软雅黑"/>
                 <w:sz w:val="18"/>
               </w:rPr>
-              <w:t>85 / 85 文件</w:t>
+              <w:t>125 / 125 文件</w:t>
             </w:r>
           </w:p>
         </w:tc>
@@ -2725,7 +2725,7 @@
                 <w:rFonts w:ascii="微软雅黑" w:hAnsi="微软雅黑" w:eastAsia="微软雅黑"/>
                 <w:sz w:val="18"/>
               </w:rPr>
-              <w:t>12 / 12 场景</w:t>
+              <w:t>72 / 72 断言</w:t>
             </w:r>
           </w:p>
         </w:tc>
@@ -4916,7 +4916,7 @@
                 <w:rFonts w:ascii="微软雅黑" w:hAnsi="微软雅黑" w:eastAsia="微软雅黑"/>
                 <w:sz w:val="18"/>
               </w:rPr>
-              <w:t>265 项断言全部通过</w:t>
+              <w:t>276 项断言全部通过</w:t>
             </w:r>
           </w:p>
         </w:tc>
@@ -5034,7 +5034,7 @@
                 <w:rFonts w:ascii="微软雅黑" w:hAnsi="微软雅黑" w:eastAsia="微软雅黑"/>
                 <w:sz w:val="18"/>
               </w:rPr>
-              <w:t>85 / 85 文件通过</w:t>
+              <w:t>125 / 125 文件通过</w:t>
             </w:r>
           </w:p>
         </w:tc>
@@ -5093,7 +5093,7 @@
                 <w:rFonts w:ascii="微软雅黑" w:hAnsi="微软雅黑" w:eastAsia="微软雅黑"/>
                 <w:sz w:val="18"/>
               </w:rPr>
-              <w:t>85 / 85 文件通过</w:t>
+              <w:t>125 / 125 文件通过</w:t>
             </w:r>
           </w:p>
         </w:tc>
@@ -5152,7 +5152,7 @@
                 <w:rFonts w:ascii="微软雅黑" w:hAnsi="微软雅黑" w:eastAsia="微软雅黑"/>
                 <w:sz w:val="18"/>
               </w:rPr>
-              <w:t>85 / 85 文件通过</w:t>
+              <w:t>125 / 125 文件通过</w:t>
             </w:r>
           </w:p>
         </w:tc>
@@ -5211,7 +5211,7 @@
                 <w:rFonts w:ascii="微软雅黑" w:hAnsi="微软雅黑" w:eastAsia="微软雅黑"/>
                 <w:sz w:val="18"/>
               </w:rPr>
-              <w:t>12 / 12 场景通过</w:t>
+              <w:t>72 / 72 断言通过</w:t>
             </w:r>
           </w:p>
         </w:tc>
@@ -7285,7 +7285,7 @@
                 <w:rFonts w:ascii="微软雅黑" w:hAnsi="微软雅黑" w:eastAsia="微软雅黑"/>
                 <w:sz w:val="18"/>
               </w:rPr>
-              <w:t>27 个审批流模板（JSON，可直接增删）</w:t>
+              <w:t>28 个审批流模板（JSON，可直接增删）</w:t>
             </w:r>
           </w:p>
         </w:tc>
@@ -7326,7 +7326,7 @@
                 <w:rFonts w:ascii="微软雅黑" w:hAnsi="微软雅黑" w:eastAsia="微软雅黑"/>
                 <w:sz w:val="18"/>
               </w:rPr>
-              <w:t>正向 / 反向 / 可修复 / 自然语言用例，共 265 项断言</w:t>
+              <w:t>正向 / 反向 / 可修复 / 自然语言用例，共 276 项断言</w:t>
             </w:r>
           </w:p>
         </w:tc>

</xml_diff>

<commit_message>
docs: timeout escalation in capability tables
</commit_message>
<xml_diff>
--- a/docs/bpmn-gen-report.docx
+++ b/docs/bpmn-gen-report.docx
@@ -4394,6 +4394,65 @@
                 <w:sz w:val="18"/>
               </w:rPr>
               <w:t>接口返回 needClarify + candidates</w:t>
+            </w:r>
+          </w:p>
+        </w:tc>
+      </w:tr>
+      <w:tr>
+        <w:trPr>
+          <w:cantSplit/>
+        </w:trPr>
+        <w:tc>
+          <w:tcPr>
+            <w:tcW w:type="dxa" w:w="1928"/>
+          </w:tcPr>
+          <w:p>
+            <w:pPr>
+              <w:spacing w:after="40"/>
+            </w:pPr>
+            <w:r/>
+            <w:r>
+              <w:rPr>
+                <w:rFonts w:ascii="微软雅黑" w:hAnsi="微软雅黑" w:eastAsia="微软雅黑"/>
+                <w:sz w:val="18"/>
+              </w:rPr>
+              <w:t>超时催办</w:t>
+            </w:r>
+          </w:p>
+        </w:tc>
+        <w:tc>
+          <w:tcPr>
+            <w:tcW w:type="dxa" w:w="4309"/>
+          </w:tcPr>
+          <w:p>
+            <w:pPr>
+              <w:spacing w:after="40"/>
+            </w:pPr>
+            <w:r/>
+            <w:r>
+              <w:rPr>
+                <w:rFonts w:ascii="微软雅黑" w:hAnsi="微软雅黑" w:eastAsia="微软雅黑"/>
+                <w:sz w:val="18"/>
+              </w:rPr>
+              <w:t>边界定时器（boundaryEvent + timerEventDefinition），超时自动转升级分支</w:t>
+            </w:r>
+          </w:p>
+        </w:tc>
+        <w:tc>
+          <w:tcPr>
+            <w:tcW w:type="dxa" w:w="2551"/>
+          </w:tcPr>
+          <w:p>
+            <w:pPr>
+              <w:spacing w:after="40"/>
+            </w:pPr>
+            <w:r/>
+            <w:r>
+              <w:rPr>
+                <w:rFonts w:ascii="微软雅黑" w:hAnsi="微软雅黑" w:eastAsia="微软雅黑"/>
+                <w:sz w:val="18"/>
+              </w:rPr>
+              <w:t>L4 断言定时器作业确实注册到引擎</w:t>
             </w:r>
           </w:p>
         </w:tc>

</xml_diff>

<commit_message>
docs: rebuild PDF with 113/113 assertions
</commit_message>
<xml_diff>
--- a/docs/bpmn-gen-report.docx
+++ b/docs/bpmn-gen-report.docx
@@ -2725,7 +2725,7 @@
                 <w:rFonts w:ascii="微软雅黑" w:hAnsi="微软雅黑" w:eastAsia="微软雅黑"/>
                 <w:sz w:val="18"/>
               </w:rPr>
-              <w:t>72 / 72 断言</w:t>
+              <w:t>113 / 113 断言</w:t>
             </w:r>
           </w:p>
         </w:tc>
@@ -5270,7 +5270,7 @@
                 <w:rFonts w:ascii="微软雅黑" w:hAnsi="微软雅黑" w:eastAsia="微软雅黑"/>
                 <w:sz w:val="18"/>
               </w:rPr>
-              <w:t>72 / 72 断言通过</w:t>
+              <w:t>113 / 113 断言通过</w:t>
             </w:r>
           </w:p>
         </w:tc>

</xml_diff>

<commit_message>
docs: document help page, numeric parsing, branch coverage and A/B experiment; align all counts
</commit_message>
<xml_diff>
--- a/docs/bpmn-gen-report.docx
+++ b/docs/bpmn-gen-report.docx
@@ -2494,7 +2494,7 @@
                 <w:rFonts w:ascii="微软雅黑" w:hAnsi="微软雅黑" w:eastAsia="微软雅黑"/>
                 <w:sz w:val="18"/>
               </w:rPr>
-              <w:t>125 / 125 文件</w:t>
+              <w:t>66 / 66 文件</w:t>
             </w:r>
           </w:p>
         </w:tc>
@@ -2571,7 +2571,7 @@
                 <w:rFonts w:ascii="微软雅黑" w:hAnsi="微软雅黑" w:eastAsia="微软雅黑"/>
                 <w:sz w:val="18"/>
               </w:rPr>
-              <w:t>125 / 125 文件</w:t>
+              <w:t>66 / 66 文件</w:t>
             </w:r>
           </w:p>
         </w:tc>
@@ -2648,7 +2648,7 @@
                 <w:rFonts w:ascii="微软雅黑" w:hAnsi="微软雅黑" w:eastAsia="微软雅黑"/>
                 <w:sz w:val="18"/>
               </w:rPr>
-              <w:t>125 / 125 文件</w:t>
+              <w:t>66 / 66 文件</w:t>
             </w:r>
           </w:p>
         </w:tc>
@@ -4298,7 +4298,7 @@
                 <w:rFonts w:ascii="微软雅黑" w:hAnsi="微软雅黑" w:eastAsia="微软雅黑"/>
                 <w:sz w:val="18"/>
               </w:rPr>
-              <w:t>27 个审批模板</w:t>
+              <w:t>28 个审批模板</w:t>
             </w:r>
           </w:p>
         </w:tc>
@@ -4316,7 +4316,7 @@
                 <w:rFonts w:ascii="微软雅黑" w:hAnsi="微软雅黑" w:eastAsia="微软雅黑"/>
                 <w:sz w:val="18"/>
               </w:rPr>
-              <w:t>纯 JSON 模板库，新增场景只需加一个文件</w:t>
+              <w:t>纯 JSON 模板库，每个模板都带真实分支（0 个纯串行）</w:t>
             </w:r>
           </w:p>
         </w:tc>
@@ -4334,7 +4334,7 @@
                 <w:rFonts w:ascii="微软雅黑" w:hAnsi="微软雅黑" w:eastAsia="微软雅黑"/>
                 <w:sz w:val="18"/>
               </w:rPr>
-              <w:t>每个模板都过六层校验</w:t>
+              <w:t>每个模板都过六层校验 + 分支覆盖</w:t>
             </w:r>
           </w:p>
         </w:tc>
@@ -4453,6 +4453,124 @@
                 <w:sz w:val="18"/>
               </w:rPr>
               <w:t>L4 断言定时器作业确实注册到引擎</w:t>
+            </w:r>
+          </w:p>
+        </w:tc>
+      </w:tr>
+      <w:tr>
+        <w:trPr>
+          <w:cantSplit/>
+        </w:trPr>
+        <w:tc>
+          <w:tcPr>
+            <w:tcW w:type="dxa" w:w="1928"/>
+          </w:tcPr>
+          <w:p>
+            <w:pPr>
+              <w:spacing w:after="40"/>
+            </w:pPr>
+            <w:r/>
+            <w:r>
+              <w:rPr>
+                <w:rFonts w:ascii="微软雅黑" w:hAnsi="微软雅黑" w:eastAsia="微软雅黑"/>
+                <w:sz w:val="18"/>
+              </w:rPr>
+              <w:t>生成提示</w:t>
+            </w:r>
+          </w:p>
+        </w:tc>
+        <w:tc>
+          <w:tcPr>
+            <w:tcW w:type="dxa" w:w="4309"/>
+          </w:tcPr>
+          <w:p>
+            <w:pPr>
+              <w:spacing w:after="40"/>
+            </w:pPr>
+            <w:r/>
+            <w:r>
+              <w:rPr>
+                <w:rFonts w:ascii="微软雅黑" w:hAnsi="微软雅黑" w:eastAsia="微软雅黑"/>
+                <w:sz w:val="18"/>
+              </w:rPr>
+              <w:t>阈值识别不出、档位超过模板能力时明确告知，不静默用默认值</w:t>
+            </w:r>
+          </w:p>
+        </w:tc>
+        <w:tc>
+          <w:tcPr>
+            <w:tcW w:type="dxa" w:w="2551"/>
+          </w:tcPr>
+          <w:p>
+            <w:pPr>
+              <w:spacing w:after="40"/>
+            </w:pPr>
+            <w:r/>
+            <w:r>
+              <w:rPr>
+                <w:rFonts w:ascii="微软雅黑" w:hAnsi="微软雅黑" w:eastAsia="微软雅黑"/>
+                <w:sz w:val="18"/>
+              </w:rPr>
+              <w:t>单元测试断言提示内容</w:t>
+            </w:r>
+          </w:p>
+        </w:tc>
+      </w:tr>
+      <w:tr>
+        <w:trPr>
+          <w:cantSplit/>
+        </w:trPr>
+        <w:tc>
+          <w:tcPr>
+            <w:tcW w:type="dxa" w:w="1928"/>
+          </w:tcPr>
+          <w:p>
+            <w:pPr>
+              <w:spacing w:after="40"/>
+            </w:pPr>
+            <w:r/>
+            <w:r>
+              <w:rPr>
+                <w:rFonts w:ascii="微软雅黑" w:hAnsi="微软雅黑" w:eastAsia="微软雅黑"/>
+                <w:sz w:val="18"/>
+              </w:rPr>
+              <w:t>数值解析</w:t>
+            </w:r>
+          </w:p>
+        </w:tc>
+        <w:tc>
+          <w:tcPr>
+            <w:tcW w:type="dxa" w:w="4309"/>
+          </w:tcPr>
+          <w:p>
+            <w:pPr>
+              <w:spacing w:after="40"/>
+            </w:pPr>
+            <w:r/>
+            <w:r>
+              <w:rPr>
+                <w:rFonts w:ascii="微软雅黑" w:hAnsi="微软雅黑" w:eastAsia="微软雅黑"/>
+                <w:sz w:val="18"/>
+              </w:rPr>
+              <w:t>支持中文数字与单位：五千 / 两万 / 一万五 / 10万</w:t>
+            </w:r>
+          </w:p>
+        </w:tc>
+        <w:tc>
+          <w:tcPr>
+            <w:tcW w:type="dxa" w:w="2551"/>
+          </w:tcPr>
+          <w:p>
+            <w:pPr>
+              <w:spacing w:after="40"/>
+            </w:pPr>
+            <w:r/>
+            <w:r>
+              <w:rPr>
+                <w:rFonts w:ascii="微软雅黑" w:hAnsi="微软雅黑" w:eastAsia="微软雅黑"/>
+                <w:sz w:val="18"/>
+              </w:rPr>
+              <w:t>单元测试覆盖 8 种写法</w:t>
             </w:r>
           </w:p>
         </w:tc>

</xml_diff>

<commit_message>
docs: align PDF assertion count to 308
</commit_message>
<xml_diff>
--- a/docs/bpmn-gen-report.docx
+++ b/docs/bpmn-gen-report.docx
@@ -5093,7 +5093,7 @@
                 <w:rFonts w:ascii="微软雅黑" w:hAnsi="微软雅黑" w:eastAsia="微软雅黑"/>
                 <w:sz w:val="18"/>
               </w:rPr>
-              <w:t>276 项断言全部通过</w:t>
+              <w:t>308 项断言全部通过</w:t>
             </w:r>
           </w:p>
         </w:tc>
@@ -7503,7 +7503,7 @@
                 <w:rFonts w:ascii="微软雅黑" w:hAnsi="微软雅黑" w:eastAsia="微软雅黑"/>
                 <w:sz w:val="18"/>
               </w:rPr>
-              <w:t>正向 / 反向 / 可修复 / 自然语言用例，共 276 项断言</w:t>
+              <w:t>正向 / 反向 / 可修复 / 自然语言用例，共 308 项断言</w:t>
             </w:r>
           </w:p>
         </w:tc>

</xml_diff>

<commit_message>
fix(ui): stale numbers on verify page; add layer/old-number guards (318 assertions)
</commit_message>
<xml_diff>
--- a/docs/bpmn-gen-report.docx
+++ b/docs/bpmn-gen-report.docx
@@ -5093,7 +5093,7 @@
                 <w:rFonts w:ascii="微软雅黑" w:hAnsi="微软雅黑" w:eastAsia="微软雅黑"/>
                 <w:sz w:val="18"/>
               </w:rPr>
-              <w:t>308 项断言全部通过</w:t>
+              <w:t>318 项断言全部通过</w:t>
             </w:r>
           </w:p>
         </w:tc>
@@ -7503,7 +7503,7 @@
                 <w:rFonts w:ascii="微软雅黑" w:hAnsi="微软雅黑" w:eastAsia="微软雅黑"/>
                 <w:sz w:val="18"/>
               </w:rPr>
-              <w:t>正向 / 反向 / 可修复 / 自然语言用例，共 308 项断言</w:t>
+              <w:t>正向 / 反向 / 可修复 / 自然语言用例，共 318 项断言</w:t>
             </w:r>
           </w:p>
         </w:tc>

</xml_diff>

<commit_message>
docs: plain-language opening for README and PDF; halve README (503->183 lines), PDF 13->11 pages
</commit_message>
<xml_diff>
--- a/docs/bpmn-gen-report.docx
+++ b/docs/bpmn-gen-report.docx
@@ -479,7 +479,22 @@
         <w:pStyle w:val="Heading1"/>
       </w:pPr>
       <w:r>
-        <w:t>一、项目背景：审批流配置的三重门槛</w:t>
+        <w:t>一、这是什么（大白话）</w:t>
+      </w:r>
+    </w:p>
+    <w:p>
+      <w:pPr>
+        <w:spacing w:after="120"/>
+      </w:pPr>
+      <w:r>
+        <w:rPr>
+          <w:rFonts w:ascii="微软雅黑" w:hAnsi="微软雅黑" w:eastAsia="微软雅黑"/>
+          <w:b/>
+          <w:i w:val="0"/>
+          <w:color w:val="1F2329"/>
+          <w:sz w:val="23"/>
+        </w:rPr>
+        <w:t>业务人员用中文说一遍审批规则，工具直接生成一个能被 Flowable / Camunda 直接部署的 BPMN 文件。</w:t>
       </w:r>
     </w:p>
     <w:p>
@@ -494,22 +509,38 @@
           <w:color w:val="1F2329"/>
           <w:sz w:val="21"/>
         </w:rPr>
-        <w:t>在政务与企业场景里，审批流程的配置长期是“业务说得清、开发画不准”的地带。一个典型的需求是这样的：</w:t>
+        <w:t>不用写代码，也不用去求 IT。</w:t>
+      </w:r>
+    </w:p>
+    <w:p>
+      <w:pPr>
+        <w:spacing w:after="80"/>
+      </w:pPr>
+      <w:r>
+        <w:rPr>
+          <w:rFonts w:ascii="微软雅黑" w:hAnsi="微软雅黑" w:eastAsia="微软雅黑"/>
+          <w:b w:val="0"/>
+          <w:i w:val="0"/>
+          <w:color w:val="1F2329"/>
+          <w:sz w:val="21"/>
+        </w:rPr>
+        <w:t>在企业或政府办公里，财务、行政想做一个“报销审批流”，通常要走这么一圈：</w:t>
       </w:r>
     </w:p>
     <w:p>
       <w:pPr>
         <w:spacing w:after="120"/>
+        <w:jc w:val="center"/>
       </w:pPr>
       <w:r>
         <w:rPr>
           <w:rFonts w:ascii="微软雅黑" w:hAnsi="微软雅黑" w:eastAsia="微软雅黑"/>
           <w:b w:val="0"/>
-          <w:i/>
+          <w:i w:val="0"/>
           <w:color w:val="6B7280"/>
           <w:sz w:val="20"/>
         </w:rPr>
-        <w:t>“我要做一个差旅报销审批流，金额小于 1000 直接主管批，大于 1000 需要总监批，超过 5000 需要财务复核。”</w:t>
+        <w:t>业务人员 → 提需求 → IT 部门 → 程序员开发 → 反复确认 → 上线</w:t>
       </w:r>
     </w:p>
     <w:p>
@@ -524,7 +555,306 @@
           <w:color w:val="1F2329"/>
           <w:sz w:val="21"/>
         </w:rPr>
-        <w:t>这句话对业务人员毫无歧义，但要落地成系统，中间横着三道门槛：</w:t>
+        <w:t>问题是：业务人员不懂代码，程序员不懂业务。一句话就能说完的规则（“1000 以内主管批，超过 5000 财务复核”），往往要来回沟通好几轮，周期以周计。</w:t>
+      </w:r>
+    </w:p>
+    <w:p>
+      <w:pPr>
+        <w:spacing w:after="120"/>
+      </w:pPr>
+      <w:r>
+        <w:rPr>
+          <w:rFonts w:ascii="微软雅黑" w:hAnsi="微软雅黑" w:eastAsia="微软雅黑"/>
+          <w:b/>
+          <w:i w:val="0"/>
+          <w:color w:val="1F2329"/>
+          <w:sz w:val="21"/>
+        </w:rPr>
+        <w:t>本工具让业务人员自己动手，把这句话直接变成系统能跑的配置，把中间的沟通成本干掉。</w:t>
+      </w:r>
+    </w:p>
+    <w:p>
+      <w:pPr>
+        <w:pStyle w:val="Heading2"/>
+      </w:pPr>
+      <w:r>
+        <w:t>1.1 它怎么工作（三步）</w:t>
+      </w:r>
+    </w:p>
+    <w:tbl>
+      <w:tblPr>
+        <w:tblStyle w:val="TableGrid"/>
+        <w:tblW w:type="auto" w:w="0"/>
+        <w:jc w:val="center"/>
+        <w:tblLayout w:type="fixed"/>
+        <w:tblLook w:firstColumn="1" w:firstRow="1" w:lastColumn="0" w:lastRow="0" w:noHBand="0" w:noVBand="1" w:val="04A0"/>
+      </w:tblPr>
+      <w:tblGrid>
+        <w:gridCol w:w="3024"/>
+        <w:gridCol w:w="3024"/>
+        <w:gridCol w:w="3024"/>
+      </w:tblGrid>
+      <w:tr>
+        <w:trPr>
+          <w:cantSplit/>
+          <w:tblHeader/>
+        </w:trPr>
+        <w:tc>
+          <w:tcPr>
+            <w:tcW w:type="dxa" w:w="1361"/>
+            <w:shd w:fill="EEF1F6"/>
+          </w:tcPr>
+          <w:p>
+            <w:r/>
+            <w:r>
+              <w:rPr>
+                <w:rFonts w:ascii="微软雅黑" w:hAnsi="微软雅黑"/>
+                <w:b/>
+                <w:sz w:val="18"/>
+              </w:rPr>
+              <w:t>步骤</w:t>
+            </w:r>
+          </w:p>
+        </w:tc>
+        <w:tc>
+          <w:tcPr>
+            <w:tcW w:type="dxa" w:w="2948"/>
+            <w:shd w:fill="EEF1F6"/>
+          </w:tcPr>
+          <w:p>
+            <w:r/>
+            <w:r>
+              <w:rPr>
+                <w:rFonts w:ascii="微软雅黑" w:hAnsi="微软雅黑"/>
+                <w:b/>
+                <w:sz w:val="18"/>
+              </w:rPr>
+              <w:t>你做什么</w:t>
+            </w:r>
+          </w:p>
+        </w:tc>
+        <w:tc>
+          <w:tcPr>
+            <w:tcW w:type="dxa" w:w="4479"/>
+            <w:shd w:fill="EEF1F6"/>
+          </w:tcPr>
+          <w:p>
+            <w:r/>
+            <w:r>
+              <w:rPr>
+                <w:rFonts w:ascii="微软雅黑" w:hAnsi="微软雅黑"/>
+                <w:b/>
+                <w:sz w:val="18"/>
+              </w:rPr>
+              <w:t>系统做什么</w:t>
+            </w:r>
+          </w:p>
+        </w:tc>
+      </w:tr>
+      <w:tr>
+        <w:trPr>
+          <w:cantSplit/>
+        </w:trPr>
+        <w:tc>
+          <w:tcPr>
+            <w:tcW w:type="dxa" w:w="1361"/>
+          </w:tcPr>
+          <w:p>
+            <w:pPr>
+              <w:spacing w:after="40"/>
+            </w:pPr>
+            <w:r/>
+            <w:r>
+              <w:rPr>
+                <w:rFonts w:ascii="微软雅黑" w:hAnsi="微软雅黑" w:eastAsia="微软雅黑"/>
+                <w:sz w:val="18"/>
+              </w:rPr>
+              <w:t>① 说人话</w:t>
+            </w:r>
+          </w:p>
+        </w:tc>
+        <w:tc>
+          <w:tcPr>
+            <w:tcW w:type="dxa" w:w="2948"/>
+          </w:tcPr>
+          <w:p>
+            <w:pPr>
+              <w:spacing w:after="40"/>
+            </w:pPr>
+            <w:r/>
+            <w:r>
+              <w:rPr>
+                <w:rFonts w:ascii="微软雅黑" w:hAnsi="微软雅黑" w:eastAsia="微软雅黑"/>
+                <w:sz w:val="18"/>
+              </w:rPr>
+              <w:t>输入一句中文规则</w:t>
+            </w:r>
+          </w:p>
+        </w:tc>
+        <w:tc>
+          <w:tcPr>
+            <w:tcW w:type="dxa" w:w="4479"/>
+          </w:tcPr>
+          <w:p>
+            <w:pPr>
+              <w:spacing w:after="40"/>
+            </w:pPr>
+            <w:r/>
+            <w:r>
+              <w:rPr>
+                <w:rFonts w:ascii="微软雅黑" w:hAnsi="微软雅黑" w:eastAsia="微软雅黑"/>
+                <w:sz w:val="18"/>
+              </w:rPr>
+              <w:t>解析关键词，选出最匹配的模板</w:t>
+            </w:r>
+          </w:p>
+        </w:tc>
+      </w:tr>
+      <w:tr>
+        <w:trPr>
+          <w:cantSplit/>
+        </w:trPr>
+        <w:tc>
+          <w:tcPr>
+            <w:tcW w:type="dxa" w:w="1361"/>
+          </w:tcPr>
+          <w:p>
+            <w:pPr>
+              <w:spacing w:after="40"/>
+            </w:pPr>
+            <w:r/>
+            <w:r>
+              <w:rPr>
+                <w:rFonts w:ascii="微软雅黑" w:hAnsi="微软雅黑" w:eastAsia="微软雅黑"/>
+                <w:sz w:val="18"/>
+              </w:rPr>
+              <w:t>② 翻译意图</w:t>
+            </w:r>
+          </w:p>
+        </w:tc>
+        <w:tc>
+          <w:tcPr>
+            <w:tcW w:type="dxa" w:w="2948"/>
+          </w:tcPr>
+          <w:p>
+            <w:pPr>
+              <w:spacing w:after="40"/>
+            </w:pPr>
+            <w:r/>
+            <w:r>
+              <w:rPr>
+                <w:rFonts w:ascii="微软雅黑" w:hAnsi="微软雅黑" w:eastAsia="微软雅黑"/>
+                <w:sz w:val="18"/>
+              </w:rPr>
+              <w:t>——</w:t>
+            </w:r>
+          </w:p>
+        </w:tc>
+        <w:tc>
+          <w:tcPr>
+            <w:tcW w:type="dxa" w:w="4479"/>
+          </w:tcPr>
+          <w:p>
+            <w:pPr>
+              <w:spacing w:after="40"/>
+            </w:pPr>
+            <w:r/>
+            <w:r>
+              <w:rPr>
+                <w:rFonts w:ascii="微软雅黑" w:hAnsi="微软雅黑" w:eastAsia="微软雅黑"/>
+                <w:sz w:val="18"/>
+              </w:rPr>
+              <w:t>大模型只输出一个极小 JSON（模板 id + 参数 + 置信度）；XML 由确定性代码生成</w:t>
+            </w:r>
+          </w:p>
+        </w:tc>
+      </w:tr>
+      <w:tr>
+        <w:trPr>
+          <w:cantSplit/>
+        </w:trPr>
+        <w:tc>
+          <w:tcPr>
+            <w:tcW w:type="dxa" w:w="1361"/>
+          </w:tcPr>
+          <w:p>
+            <w:pPr>
+              <w:spacing w:after="40"/>
+            </w:pPr>
+            <w:r/>
+            <w:r>
+              <w:rPr>
+                <w:rFonts w:ascii="微软雅黑" w:hAnsi="微软雅黑" w:eastAsia="微软雅黑"/>
+                <w:sz w:val="18"/>
+              </w:rPr>
+              <w:t>③ 直接运行</w:t>
+            </w:r>
+          </w:p>
+        </w:tc>
+        <w:tc>
+          <w:tcPr>
+            <w:tcW w:type="dxa" w:w="2948"/>
+          </w:tcPr>
+          <w:p>
+            <w:pPr>
+              <w:spacing w:after="40"/>
+            </w:pPr>
+            <w:r/>
+            <w:r>
+              <w:rPr>
+                <w:rFonts w:ascii="微软雅黑" w:hAnsi="微软雅黑" w:eastAsia="微软雅黑"/>
+                <w:sz w:val="18"/>
+              </w:rPr>
+              <w:t>下载 .bpmn，扔进引擎</w:t>
+            </w:r>
+          </w:p>
+        </w:tc>
+        <w:tc>
+          <w:tcPr>
+            <w:tcW w:type="dxa" w:w="4479"/>
+          </w:tcPr>
+          <w:p>
+            <w:pPr>
+              <w:spacing w:after="40"/>
+            </w:pPr>
+            <w:r/>
+            <w:r>
+              <w:rPr>
+                <w:rFonts w:ascii="微软雅黑" w:hAnsi="微软雅黑" w:eastAsia="微软雅黑"/>
+                <w:sz w:val="18"/>
+              </w:rPr>
+              <w:t>Flowable / Camunda 部署即跑</w:t>
+            </w:r>
+          </w:p>
+        </w:tc>
+      </w:tr>
+    </w:tbl>
+    <w:p>
+      <w:pPr>
+        <w:spacing w:after="40"/>
+      </w:pPr>
+    </w:p>
+    <w:p>
+      <w:pPr>
+        <w:spacing w:after="120"/>
+      </w:pPr>
+      <w:r>
+        <w:rPr>
+          <w:rFonts w:ascii="微软雅黑" w:hAnsi="微软雅黑" w:eastAsia="微软雅黑"/>
+          <w:b/>
+          <w:i w:val="0"/>
+          <w:color w:val="1F2329"/>
+          <w:sz w:val="21"/>
+        </w:rPr>
+        <w:t>关键设计：模型从不写 XML。它的自由度被限制在“理解你说的是哪一类流程、阈值是多少”；语法正确性由代码保证 —— 所以“AI 生成的 XML 语法错”这类问题在物理上不可能发生。</w:t>
+      </w:r>
+    </w:p>
+    <w:p>
+      <w:pPr>
+        <w:pStyle w:val="Heading2"/>
+      </w:pPr>
+      <w:r>
+        <w:t>1.2 传统做法卡在哪（三重门槛）</w:t>
       </w:r>
     </w:p>
     <w:tbl>
@@ -633,7 +963,7 @@
                 <w:rFonts w:ascii="微软雅黑" w:hAnsi="微软雅黑" w:eastAsia="微软雅黑"/>
                 <w:sz w:val="18"/>
               </w:rPr>
-              <w:t>业务描述是自然语言，开发要实现的是流程定义，中间靠文档和会议来回对齐</w:t>
+              <w:t>业务说自然语言，开发要写流程定义，靠文档和会议反复对齐</w:t>
             </w:r>
           </w:p>
         </w:tc>
@@ -651,7 +981,7 @@
                 <w:rFonts w:ascii="微软雅黑" w:hAnsi="微软雅黑" w:eastAsia="微软雅黑"/>
                 <w:sz w:val="18"/>
               </w:rPr>
-              <w:t>一轮需求澄清 2~5 天，改一次再走一轮</w:t>
+              <w:t>一轮澄清 2~5 天</w:t>
             </w:r>
           </w:p>
         </w:tc>
@@ -692,7 +1022,7 @@
                 <w:rFonts w:ascii="微软雅黑" w:hAnsi="微软雅黑" w:eastAsia="微软雅黑"/>
                 <w:sz w:val="18"/>
               </w:rPr>
-              <w:t>BPMN 2.0 是 OMG 规范，涉及排他/并行网关、默认流、条件表达式、图形坐标（DI）</w:t>
+              <w:t>BPMN 2.0 涉及网关、默认流、条件表达式、图形坐标（DI）</w:t>
             </w:r>
           </w:p>
         </w:tc>
@@ -710,7 +1040,7 @@
                 <w:rFonts w:ascii="微软雅黑" w:hAnsi="微软雅黑" w:eastAsia="微软雅黑"/>
                 <w:sz w:val="18"/>
               </w:rPr>
-              <w:t>业务人员学不会；开发人员也要查规范</w:t>
+              <w:t>业务学不会，开发也要查规范</w:t>
             </w:r>
           </w:p>
         </w:tc>
@@ -751,7 +1081,7 @@
                 <w:rFonts w:ascii="微软雅黑" w:hAnsi="微软雅黑" w:eastAsia="微软雅黑"/>
                 <w:sz w:val="18"/>
               </w:rPr>
-              <w:t>生成的流程文件是否合法、能否被引擎接受，往往要部署到引擎才知道</w:t>
+              <w:t>文件是否合法、引擎能否接受，往往部署时才知道</w:t>
             </w:r>
           </w:p>
         </w:tc>
@@ -782,32 +1112,49 @@
     </w:p>
     <w:p>
       <w:pPr>
-        <w:spacing w:after="120"/>
+        <w:pStyle w:val="Heading2"/>
+      </w:pPr>
+      <w:r>
+        <w:t>1.3 属于什么方向的产品</w:t>
+      </w:r>
+    </w:p>
+    <w:p>
+      <w:pPr>
+        <w:pStyle w:val="ListBullet"/>
+        <w:spacing w:after="60" w:line="336" w:lineRule="auto"/>
       </w:pPr>
       <w:r>
         <w:rPr>
           <w:rFonts w:ascii="微软雅黑" w:hAnsi="微软雅黑" w:eastAsia="微软雅黑"/>
-          <w:b w:val="0"/>
-          <w:i w:val="0"/>
-          <w:color w:val="1F2329"/>
           <w:sz w:val="21"/>
         </w:rPr>
-        <w:t>大模型出现后，一个非常自然的想法是：让模型直接输出 BPMN XML。</w:t>
+        <w:t>低代码 / 无代码：不用画图也不用写代码，一句话即可；比拖拽式 BPMN 设计器更快。</w:t>
       </w:r>
     </w:p>
     <w:p>
       <w:pPr>
-        <w:spacing w:after="120"/>
+        <w:pStyle w:val="ListBullet"/>
+        <w:spacing w:after="60" w:line="336" w:lineRule="auto"/>
       </w:pPr>
       <w:r>
         <w:rPr>
           <w:rFonts w:ascii="微软雅黑" w:hAnsi="微软雅黑" w:eastAsia="微软雅黑"/>
-          <w:b w:val="0"/>
-          <w:i w:val="0"/>
-          <w:color w:val="1F2329"/>
           <w:sz w:val="21"/>
         </w:rPr>
-        <w:t>本项目在实现过程中验证了这条路的真实风险，并给出了替代方案——这也构成了本作品最主要的技术主张。</w:t>
+        <w:t>AI 开发工具链：AI 负责“意图 → 配置”的翻译，而不是负责生成语法。</w:t>
+      </w:r>
+    </w:p>
+    <w:p>
+      <w:pPr>
+        <w:pStyle w:val="ListBullet"/>
+        <w:spacing w:after="60" w:line="336" w:lineRule="auto"/>
+      </w:pPr>
+      <w:r>
+        <w:rPr>
+          <w:rFonts w:ascii="微软雅黑" w:hAnsi="微软雅黑" w:eastAsia="微软雅黑"/>
+          <w:sz w:val="21"/>
+        </w:rPr>
+        <w:t>行业应用平台（政务 / 企业）：28 个模板覆盖公文、投诉、报销、采购、用章、请假、会签、超时催办等场景。</w:t>
       </w:r>
     </w:p>
     <w:p>
@@ -841,330 +1188,44 @@
         <w:t>2.1 三条使用路径</w:t>
       </w:r>
     </w:p>
-    <w:tbl>
-      <w:tblPr>
-        <w:tblStyle w:val="TableGrid"/>
-        <w:tblW w:type="auto" w:w="0"/>
-        <w:jc w:val="center"/>
-        <w:tblLayout w:type="fixed"/>
-        <w:tblLook w:firstColumn="1" w:firstRow="1" w:lastColumn="0" w:lastRow="0" w:noHBand="0" w:noVBand="1" w:val="04A0"/>
-      </w:tblPr>
-      <w:tblGrid>
-        <w:gridCol w:w="2268"/>
-        <w:gridCol w:w="2268"/>
-        <w:gridCol w:w="2268"/>
-        <w:gridCol w:w="2268"/>
-      </w:tblGrid>
-      <w:tr>
-        <w:trPr>
-          <w:cantSplit/>
-          <w:tblHeader/>
-        </w:trPr>
-        <w:tc>
-          <w:tcPr>
-            <w:tcW w:type="dxa" w:w="1814"/>
-            <w:shd w:fill="EEF1F6"/>
-          </w:tcPr>
-          <w:p>
-            <w:r/>
-            <w:r>
-              <w:rPr>
-                <w:rFonts w:ascii="微软雅黑" w:hAnsi="微软雅黑"/>
-                <w:b/>
-                <w:sz w:val="18"/>
-              </w:rPr>
-              <w:t>路径</w:t>
-            </w:r>
-          </w:p>
-        </w:tc>
-        <w:tc>
-          <w:tcPr>
-            <w:tcW w:type="dxa" w:w="2381"/>
-            <w:shd w:fill="EEF1F6"/>
-          </w:tcPr>
-          <w:p>
-            <w:r/>
-            <w:r>
-              <w:rPr>
-                <w:rFonts w:ascii="微软雅黑" w:hAnsi="微软雅黑"/>
-                <w:b/>
-                <w:sz w:val="18"/>
-              </w:rPr>
-              <w:t>输入</w:t>
-            </w:r>
-          </w:p>
-        </w:tc>
-        <w:tc>
-          <w:tcPr>
-            <w:tcW w:type="dxa" w:w="1928"/>
-            <w:shd w:fill="EEF1F6"/>
-          </w:tcPr>
-          <w:p>
-            <w:r/>
-            <w:r>
-              <w:rPr>
-                <w:rFonts w:ascii="微软雅黑" w:hAnsi="微软雅黑"/>
-                <w:b/>
-                <w:sz w:val="18"/>
-              </w:rPr>
-              <w:t>是否需要大模型</w:t>
-            </w:r>
-          </w:p>
-        </w:tc>
-        <w:tc>
-          <w:tcPr>
-            <w:tcW w:type="dxa" w:w="2665"/>
-            <w:shd w:fill="EEF1F6"/>
-          </w:tcPr>
-          <w:p>
-            <w:r/>
-            <w:r>
-              <w:rPr>
-                <w:rFonts w:ascii="微软雅黑" w:hAnsi="微软雅黑"/>
-                <w:b/>
-                <w:sz w:val="18"/>
-              </w:rPr>
-              <w:t>适用场景</w:t>
-            </w:r>
-          </w:p>
-        </w:tc>
-      </w:tr>
-      <w:tr>
-        <w:trPr>
-          <w:cantSplit/>
-        </w:trPr>
-        <w:tc>
-          <w:tcPr>
-            <w:tcW w:type="dxa" w:w="1814"/>
-          </w:tcPr>
-          <w:p>
-            <w:pPr>
-              <w:spacing w:after="40"/>
-            </w:pPr>
-            <w:r/>
-            <w:r>
-              <w:rPr>
-                <w:rFonts w:ascii="微软雅黑" w:hAnsi="微软雅黑" w:eastAsia="微软雅黑"/>
-                <w:sz w:val="18"/>
-              </w:rPr>
-              <w:t>离线模板匹配</w:t>
-            </w:r>
-          </w:p>
-        </w:tc>
-        <w:tc>
-          <w:tcPr>
-            <w:tcW w:type="dxa" w:w="2381"/>
-          </w:tcPr>
-          <w:p>
-            <w:pPr>
-              <w:spacing w:after="40"/>
-            </w:pPr>
-            <w:r/>
-            <w:r>
-              <w:rPr>
-                <w:rFonts w:ascii="微软雅黑" w:hAnsi="微软雅黑" w:eastAsia="微软雅黑"/>
-                <w:sz w:val="18"/>
-              </w:rPr>
-              <w:t>业务描述一句话</w:t>
-            </w:r>
-          </w:p>
-        </w:tc>
-        <w:tc>
-          <w:tcPr>
-            <w:tcW w:type="dxa" w:w="1928"/>
-          </w:tcPr>
-          <w:p>
-            <w:pPr>
-              <w:spacing w:after="40"/>
-            </w:pPr>
-            <w:r/>
-            <w:r>
-              <w:rPr>
-                <w:rFonts w:ascii="微软雅黑" w:hAnsi="微软雅黑" w:eastAsia="微软雅黑"/>
-                <w:sz w:val="18"/>
-              </w:rPr>
-              <w:t>否</w:t>
-            </w:r>
-          </w:p>
-        </w:tc>
-        <w:tc>
-          <w:tcPr>
-            <w:tcW w:type="dxa" w:w="2665"/>
-          </w:tcPr>
-          <w:p>
-            <w:pPr>
-              <w:spacing w:after="40"/>
-            </w:pPr>
-            <w:r/>
-            <w:r>
-              <w:rPr>
-                <w:rFonts w:ascii="微软雅黑" w:hAnsi="微软雅黑" w:eastAsia="微软雅黑"/>
-                <w:sz w:val="18"/>
-              </w:rPr>
-              <w:t>演示、断网环境、成本敏感场景</w:t>
-            </w:r>
-          </w:p>
-        </w:tc>
-      </w:tr>
-      <w:tr>
-        <w:trPr>
-          <w:cantSplit/>
-        </w:trPr>
-        <w:tc>
-          <w:tcPr>
-            <w:tcW w:type="dxa" w:w="1814"/>
-          </w:tcPr>
-          <w:p>
-            <w:pPr>
-              <w:spacing w:after="40"/>
-            </w:pPr>
-            <w:r/>
-            <w:r>
-              <w:rPr>
-                <w:rFonts w:ascii="微软雅黑" w:hAnsi="微软雅黑" w:eastAsia="微软雅黑"/>
-                <w:sz w:val="18"/>
-              </w:rPr>
-              <w:t>大模型选模板</w:t>
-            </w:r>
-          </w:p>
-        </w:tc>
-        <w:tc>
-          <w:tcPr>
-            <w:tcW w:type="dxa" w:w="2381"/>
-          </w:tcPr>
-          <w:p>
-            <w:pPr>
-              <w:spacing w:after="40"/>
-            </w:pPr>
-            <w:r/>
-            <w:r>
-              <w:rPr>
-                <w:rFonts w:ascii="微软雅黑" w:hAnsi="微软雅黑" w:eastAsia="微软雅黑"/>
-                <w:sz w:val="18"/>
-              </w:rPr>
-              <w:t>业务描述一句话</w:t>
-            </w:r>
-          </w:p>
-        </w:tc>
-        <w:tc>
-          <w:tcPr>
-            <w:tcW w:type="dxa" w:w="1928"/>
-          </w:tcPr>
-          <w:p>
-            <w:pPr>
-              <w:spacing w:after="40"/>
-            </w:pPr>
-            <w:r/>
-            <w:r>
-              <w:rPr>
-                <w:rFonts w:ascii="微软雅黑" w:hAnsi="微软雅黑" w:eastAsia="微软雅黑"/>
-                <w:sz w:val="18"/>
-              </w:rPr>
-              <w:t>是（只输出 JSON）</w:t>
-            </w:r>
-          </w:p>
-        </w:tc>
-        <w:tc>
-          <w:tcPr>
-            <w:tcW w:type="dxa" w:w="2665"/>
-          </w:tcPr>
-          <w:p>
-            <w:pPr>
-              <w:spacing w:after="40"/>
-            </w:pPr>
-            <w:r/>
-            <w:r>
-              <w:rPr>
-                <w:rFonts w:ascii="微软雅黑" w:hAnsi="微软雅黑" w:eastAsia="微软雅黑"/>
-                <w:sz w:val="18"/>
-              </w:rPr>
-              <w:t>描述更自由、口语化的真实业务输入</w:t>
-            </w:r>
-          </w:p>
-        </w:tc>
-      </w:tr>
-      <w:tr>
-        <w:trPr>
-          <w:cantSplit/>
-        </w:trPr>
-        <w:tc>
-          <w:tcPr>
-            <w:tcW w:type="dxa" w:w="1814"/>
-          </w:tcPr>
-          <w:p>
-            <w:pPr>
-              <w:spacing w:after="40"/>
-            </w:pPr>
-            <w:r/>
-            <w:r>
-              <w:rPr>
-                <w:rFonts w:ascii="微软雅黑" w:hAnsi="微软雅黑" w:eastAsia="微软雅黑"/>
-                <w:sz w:val="18"/>
-              </w:rPr>
-              <w:t>直接给 IR</w:t>
-            </w:r>
-          </w:p>
-        </w:tc>
-        <w:tc>
-          <w:tcPr>
-            <w:tcW w:type="dxa" w:w="2381"/>
-          </w:tcPr>
-          <w:p>
-            <w:pPr>
-              <w:spacing w:after="40"/>
-            </w:pPr>
-            <w:r/>
-            <w:r>
-              <w:rPr>
-                <w:rFonts w:ascii="微软雅黑" w:hAnsi="微软雅黑" w:eastAsia="微软雅黑"/>
-                <w:sz w:val="18"/>
-              </w:rPr>
-              <w:t>结构化 JSON（中间表示）</w:t>
-            </w:r>
-          </w:p>
-        </w:tc>
-        <w:tc>
-          <w:tcPr>
-            <w:tcW w:type="dxa" w:w="1928"/>
-          </w:tcPr>
-          <w:p>
-            <w:pPr>
-              <w:spacing w:after="40"/>
-            </w:pPr>
-            <w:r/>
-            <w:r>
-              <w:rPr>
-                <w:rFonts w:ascii="微软雅黑" w:hAnsi="微软雅黑" w:eastAsia="微软雅黑"/>
-                <w:sz w:val="18"/>
-              </w:rPr>
-              <w:t>否</w:t>
-            </w:r>
-          </w:p>
-        </w:tc>
-        <w:tc>
-          <w:tcPr>
-            <w:tcW w:type="dxa" w:w="2665"/>
-          </w:tcPr>
-          <w:p>
-            <w:pPr>
-              <w:spacing w:after="40"/>
-            </w:pPr>
-            <w:r/>
-            <w:r>
-              <w:rPr>
-                <w:rFonts w:ascii="微软雅黑" w:hAnsi="微软雅黑" w:eastAsia="微软雅黑"/>
-                <w:sz w:val="18"/>
-              </w:rPr>
-              <w:t>系统集成、批量生成、二次开发</w:t>
-            </w:r>
-          </w:p>
-        </w:tc>
-      </w:tr>
-    </w:tbl>
     <w:p>
       <w:pPr>
-        <w:spacing w:after="40"/>
+        <w:pStyle w:val="ListBullet"/>
+        <w:spacing w:after="60" w:line="336" w:lineRule="auto"/>
       </w:pPr>
+      <w:r>
+        <w:rPr>
+          <w:rFonts w:ascii="微软雅黑" w:hAnsi="微软雅黑" w:eastAsia="微软雅黑"/>
+          <w:sz w:val="21"/>
+        </w:rPr>
+        <w:t>离线模板匹配：一句话 → 模板，不需要大模型，适合演示、断网、成本敏感场景。</w:t>
+      </w:r>
+    </w:p>
+    <w:p>
+      <w:pPr>
+        <w:pStyle w:val="ListBullet"/>
+        <w:spacing w:after="60" w:line="336" w:lineRule="auto"/>
+      </w:pPr>
+      <w:r>
+        <w:rPr>
+          <w:rFonts w:ascii="微软雅黑" w:hAnsi="微软雅黑" w:eastAsia="微软雅黑"/>
+          <w:sz w:val="21"/>
+        </w:rPr>
+        <w:t>大模型选模板：一句话 → 模型只回 templateId + slots（JSON），适合口语化、表述更自由的真实输入。</w:t>
+      </w:r>
+    </w:p>
+    <w:p>
+      <w:pPr>
+        <w:pStyle w:val="ListBullet"/>
+        <w:spacing w:after="60" w:line="336" w:lineRule="auto"/>
+      </w:pPr>
+      <w:r>
+        <w:rPr>
+          <w:rFonts w:ascii="微软雅黑" w:hAnsi="微软雅黑" w:eastAsia="微软雅黑"/>
+          <w:sz w:val="21"/>
+        </w:rPr>
+        <w:t>直接给 IR：结构化 JSON 进管线，适合系统集成、批量生成与二次开发。</w:t>
+      </w:r>
     </w:p>
     <w:p>
       <w:pPr>
@@ -1178,7 +1239,7 @@
           <w:color w:val="1F2329"/>
           <w:sz w:val="21"/>
         </w:rPr>
-        <w:t>以上三种能力都已在本地 Web 应用里打通：浏览器内输入一句话 → 生成 → 可视化 → 下载 .bpmn，全程不需要切到命令行。应用只监听本机回环地址，关闭窗口即结束。</w:t>
+        <w:t>三种路径在本地 Web 应用里都已打通：浏览器内输入 → 生成 → 可视化 → 下载 .bpmn，全程不用切命令行；应用只监听本机回环地址，关闭窗口即结束。</w:t>
       </w:r>
     </w:p>
     <w:p>
@@ -3233,92 +3294,41 @@
     </w:p>
     <w:p>
       <w:pPr>
-        <w:spacing w:after="120"/>
+        <w:pStyle w:val="ListBullet"/>
+        <w:spacing w:after="60" w:line="336" w:lineRule="auto"/>
       </w:pPr>
       <w:r>
         <w:rPr>
           <w:rFonts w:ascii="微软雅黑" w:hAnsi="微软雅黑" w:eastAsia="微软雅黑"/>
-          <w:b/>
-          <w:i w:val="0"/>
-          <w:color w:val="1F2329"/>
           <w:sz w:val="21"/>
         </w:rPr>
-        <w:t>难点一：模型幻觉导致的“看起来对、跑不通”。</w:t>
+        <w:t>模型幻觉“看起来对、跑不通”：多个结束事件、审批节点没有出口、网关全带条件却没有默认流 —— XML 合法、XSD 通过、引擎也能部署，但运行时永久卡死。做法是把这类问题前移到静态检查（src/graph.js 做可达性与死路分析）。</w:t>
       </w:r>
     </w:p>
     <w:p>
       <w:pPr>
-        <w:spacing w:after="120"/>
+        <w:pStyle w:val="ListBullet"/>
+        <w:spacing w:after="60" w:line="336" w:lineRule="auto"/>
       </w:pPr>
       <w:r>
         <w:rPr>
           <w:rFonts w:ascii="微软雅黑" w:hAnsi="微软雅黑" w:eastAsia="微软雅黑"/>
-          <w:b w:val="0"/>
-          <w:i w:val="0"/>
-          <w:color w:val="1F2329"/>
           <w:sz w:val="21"/>
         </w:rPr>
-        <w:t>模型经常生成结构完整但语义非法的流程：多个结束事件、某审批节点没有出口、排他网关所有分支都带条件却没有默认流。最后一类最隐蔽——XML 合法、XSD 通过、引擎也能部署，但运行时所有条件都不满足，流程实例永久卡死。我们的做法是把这些问题全部前移到静态检查（src/graph.js 做可达性与死路分析），在进引擎之前就拦掉。</w:t>
+        <w:t>图形坐标（DI）不能手写：BPMN 分逻辑段与坐标段，缺坐标时引擎照跑但可视化工具白屏。用最长路径分层算法（正向直角折线、回边绕行），不用力导向是因为它每次结果不同，会破坏“同输入同输出”。</w:t>
       </w:r>
     </w:p>
     <w:p>
       <w:pPr>
-        <w:spacing w:after="120"/>
+        <w:pStyle w:val="ListBullet"/>
+        <w:spacing w:after="60" w:line="336" w:lineRule="auto"/>
       </w:pPr>
       <w:r>
         <w:rPr>
           <w:rFonts w:ascii="微软雅黑" w:hAnsi="微软雅黑" w:eastAsia="微软雅黑"/>
-          <w:b/>
-          <w:i w:val="0"/>
-          <w:color w:val="1F2329"/>
           <w:sz w:val="21"/>
         </w:rPr>
-        <w:t>难点二：图形坐标（DI）不能靠手写。</w:t>
-      </w:r>
-    </w:p>
-    <w:p>
-      <w:pPr>
-        <w:spacing w:after="120"/>
-      </w:pPr>
-      <w:r>
-        <w:rPr>
-          <w:rFonts w:ascii="微软雅黑" w:hAnsi="微软雅黑" w:eastAsia="微软雅黑"/>
-          <w:b w:val="0"/>
-          <w:i w:val="0"/>
-          <w:color w:val="1F2329"/>
-          <w:sz w:val="21"/>
-        </w:rPr>
-        <w:t>BPMN 文件分两半：process 是逻辑，BPMNDiagram 是坐标。少了坐标段，引擎照跑，但可视化工具打开是空白页。我们实现了最长路径分层算法：按“从开始节点的最长距离”分层，同层纵向排开，正向连线走直角折线、回边绕行。选分层而非力导向，是因为力导向每次布局结果不同，会破坏“同输入同输出”的可复现性。</w:t>
-      </w:r>
-    </w:p>
-    <w:p>
-      <w:pPr>
-        <w:spacing w:after="120"/>
-      </w:pPr>
-      <w:r>
-        <w:rPr>
-          <w:rFonts w:ascii="微软雅黑" w:hAnsi="微软雅黑" w:eastAsia="微软雅黑"/>
-          <w:b/>
-          <w:i w:val="0"/>
-          <w:color w:val="1F2329"/>
-          <w:sz w:val="21"/>
-        </w:rPr>
-        <w:t>难点三：修复必须克制。</w:t>
-      </w:r>
-    </w:p>
-    <w:p>
-      <w:pPr>
-        <w:spacing w:after="120"/>
-      </w:pPr>
-      <w:r>
-        <w:rPr>
-          <w:rFonts w:ascii="微软雅黑" w:hAnsi="微软雅黑" w:eastAsia="微软雅黑"/>
-          <w:b w:val="0"/>
-          <w:i w:val="0"/>
-          <w:color w:val="1F2329"/>
-          <w:sz w:val="21"/>
-        </w:rPr>
-        <w:t>自动修复很容易做过头。我们划了一条硬线：缺 id、重复 id、自环、悬空端点、多余默认流可以修；缺节点类型、悬挂节点、不可达节点、网关缺默认流一律不修——因为这些需要业务判断，替他猜等于制造无法解释的流程。</w:t>
+        <w:t>修复必须克制：缺 id / 重复 id / 自环 / 悬空端点 / 多余默认流可以修；缺节点类型、悬挂节点、不可达节点一律不修 —— 这些需要业务判断，替用户猜等于制造无法解释的流程。</w:t>
       </w:r>
     </w:p>
     <w:p>
@@ -4796,10 +4806,17 @@
     </w:p>
     <w:p>
       <w:pPr>
-        <w:pStyle w:val="Heading2"/>
+        <w:spacing w:after="120"/>
       </w:pPr>
       <w:r>
-        <w:t>5.1 让模型“只说选哪个模板”，而不是“画流程”</w:t>
+        <w:rPr>
+          <w:rFonts w:ascii="微软雅黑" w:hAnsi="微软雅黑" w:eastAsia="微软雅黑"/>
+          <w:b/>
+          <w:i w:val="0"/>
+          <w:color w:val="1F2329"/>
+          <w:sz w:val="21"/>
+        </w:rPr>
+        <w:t>① 让模型“只说选哪个模板”，而不是“画流程”。</w:t>
       </w:r>
     </w:p>
     <w:p>
@@ -4814,7 +4831,7 @@
           <w:color w:val="1F2329"/>
           <w:sz w:val="21"/>
         </w:rPr>
-        <w:t>这是本作品与常见“让 AI 直接写 BPMN”方案的根本区别。模型被约束成只能输出一个极小的 JSON：</w:t>
+        <w:t>模型被约束成只输出一个极小的 JSON（templateId + slots + confidence，见 5.1 示例）；结构、连线、坐标、命名空间全部由确定性代码产生 —— “生成不出合法 XML”在物理上不可能发生。模型的自由度和系统可靠性之间的取舍，被明确放在语义层而不是语法层。</w:t>
       </w:r>
     </w:p>
     <w:p>
@@ -4824,12 +4841,12 @@
       <w:r>
         <w:rPr>
           <w:rFonts w:ascii="微软雅黑" w:hAnsi="微软雅黑" w:eastAsia="微软雅黑"/>
-          <w:b w:val="0"/>
+          <w:b/>
           <w:i w:val="0"/>
-          <w:color w:val="6B7280"/>
-          <w:sz w:val="19"/>
+          <w:color w:val="1F2329"/>
+          <w:sz w:val="21"/>
         </w:rPr>
-        <w:t>{"templateId":"amount_tiered","slots":{"tier1":2000,"tier2":8000},"confidence":0.95}</w:t>
+        <w:t>② 把“生成”降级为“选模板 + 填参数”。</w:t>
       </w:r>
     </w:p>
     <w:p>
@@ -4844,15 +4861,22 @@
           <w:color w:val="1F2329"/>
           <w:sz w:val="21"/>
         </w:rPr>
-        <w:t>结构、连线、坐标、命名空间全部由确定性代码产生。这样“生成不出合法 XML”在物理上不可能发生，模型的自由度和系统可靠性之间的取舍被明确放在语义层，而不是语法层。</w:t>
+        <w:t>纯自由生成的通过率不稳定、每次结果不同；模板化后稳定性来自模板本身，模型只承担它最擅长的小任务：理解一句话的意图、抽取阈值。</w:t>
       </w:r>
     </w:p>
     <w:p>
       <w:pPr>
-        <w:pStyle w:val="Heading2"/>
+        <w:spacing w:after="120"/>
       </w:pPr>
       <w:r>
-        <w:t>5.2 把“生成”降级为“选模板 + 填参数”</w:t>
+        <w:rPr>
+          <w:rFonts w:ascii="微软雅黑" w:hAnsi="微软雅黑" w:eastAsia="微软雅黑"/>
+          <w:b/>
+          <w:i w:val="0"/>
+          <w:color w:val="1F2329"/>
+          <w:sz w:val="21"/>
+        </w:rPr>
+        <w:t>③ 引擎规则反哺静态检查（真实案例）。</w:t>
       </w:r>
     </w:p>
     <w:p>
@@ -4867,15 +4891,22 @@
           <w:color w:val="1F2329"/>
           <w:sz w:val="21"/>
         </w:rPr>
-        <w:t>纯大模型自由生成的通过率不稳定，且每次结果不同。模板化后，稳定性来自模板本身，模型只承担它最擅长的小任务：理解一句话的意图、抽取阈值。实测 8 条业务描述端到端通过率 100%。</w:t>
+        <w:t>接入 Flowable 官方校验器后发现自研图论检查漏了一条：“默认流不允许带条件”。这条 XSD 查不出、标准模型库也查不出，只有部署到引擎才报。已补进静态检查并加了确定性修复 —— 多层验证不是重复劳动，而是互相补位。</w:t>
       </w:r>
     </w:p>
     <w:p>
       <w:pPr>
-        <w:pStyle w:val="Heading2"/>
+        <w:spacing w:after="120"/>
       </w:pPr>
       <w:r>
-        <w:t>5.3 引擎规则反哺静态检查（真实案例）</w:t>
+        <w:rPr>
+          <w:rFonts w:ascii="微软雅黑" w:hAnsi="微软雅黑" w:eastAsia="微软雅黑"/>
+          <w:b/>
+          <w:i w:val="0"/>
+          <w:color w:val="1F2329"/>
+          <w:sz w:val="21"/>
+        </w:rPr>
+        <w:t>④ 把“环境零污染”做成可验证的工程原则。</w:t>
       </w:r>
     </w:p>
     <w:p>
@@ -4890,60 +4921,7 @@
           <w:color w:val="1F2329"/>
           <w:sz w:val="21"/>
         </w:rPr>
-        <w:t>项目在接入 Flowable 官方校验器后，发现自研图论检查漏了一条规则：</w:t>
-      </w:r>
-    </w:p>
-    <w:p>
-      <w:pPr>
-        <w:spacing w:after="120"/>
-      </w:pPr>
-      <w:r>
-        <w:rPr>
-          <w:rFonts w:ascii="微软雅黑" w:hAnsi="微软雅黑" w:eastAsia="微软雅黑"/>
-          <w:b w:val="0"/>
-          <w:i/>
-          <w:color w:val="6B7280"/>
-          <w:sz w:val="19"/>
-        </w:rPr>
-        <w:t>“Default sequenceflow has a condition, which is not allowed”</w:t>
-      </w:r>
-    </w:p>
-    <w:p>
-      <w:pPr>
-        <w:spacing w:after="120"/>
-      </w:pPr>
-      <w:r>
-        <w:rPr>
-          <w:rFonts w:ascii="微软雅黑" w:hAnsi="微软雅黑" w:eastAsia="微软雅黑"/>
-          <w:b w:val="0"/>
-          <w:i w:val="0"/>
-          <w:color w:val="1F2329"/>
-          <w:sz w:val="21"/>
-        </w:rPr>
-        <w:t>含义是默认流不能同时带条件（默认流是“条件都不满足时的兜底”，自己再带条件就自相矛盾）。这条规则 XSD 查不出、标准模型库也查不出，只有引擎部署时才报。我们把这条规则补进了静态检查，并给修复器加了对应的确定性修复——现在这类错误在写文件之前就会被拦下。这说明多层验证不是重复劳动，而是互相补位。</w:t>
-      </w:r>
-    </w:p>
-    <w:p>
-      <w:pPr>
-        <w:pStyle w:val="Heading2"/>
-      </w:pPr>
-      <w:r>
-        <w:t>5.4 把“环境零污染”做成可验证的工程原则</w:t>
-      </w:r>
-    </w:p>
-    <w:p>
-      <w:pPr>
-        <w:spacing w:after="120"/>
-      </w:pPr>
-      <w:r>
-        <w:rPr>
-          <w:rFonts w:ascii="微软雅黑" w:hAnsi="微软雅黑" w:eastAsia="微软雅黑"/>
-          <w:b w:val="0"/>
-          <w:i w:val="0"/>
-          <w:color w:val="1F2329"/>
-          <w:sz w:val="21"/>
-        </w:rPr>
-        <w:t>政务与企业客户对交付环境的干净程度很敏感。本项目把这件事从口号变成了 11 条可检查的工程原则，其中 10 条由脚本自动验证，红灯即不得交付。配套的环境守卫工具能给出基线与差异报告，实现“项目目录删掉即归零”。详见第七章。</w:t>
+        <w:t>政务与企业客户对交付环境的干净程度很敏感。本项目把它从口号变成 10 条可自动检查的原则，配套环境守卫工具给出基线与差异报告，实现“项目目录删掉即归零”。详见第七章。</w:t>
       </w:r>
     </w:p>
     <w:p>
@@ -4966,7 +4944,7 @@
           <w:color w:val="1F2329"/>
           <w:sz w:val="21"/>
         </w:rPr>
-        <w:t>所有结论都可以在仓库内用一条命令复现：verify-all.cmd</w:t>
+        <w:t>下列结论都能在仓库内用一条命令复现：verify-all.cmd（CI 每次 push 也会在干净机器上重跑）。</w:t>
       </w:r>
     </w:p>
     <w:tbl>
@@ -5006,7 +4984,7 @@
         </w:tc>
         <w:tc>
           <w:tcPr>
-            <w:tcW w:type="dxa" w:w="4762"/>
+            <w:tcW w:type="dxa" w:w="4876"/>
             <w:shd w:fill="EEF1F6"/>
           </w:tcPr>
           <w:p>
@@ -5023,7 +5001,7 @@
         </w:tc>
         <w:tc>
           <w:tcPr>
-            <w:tcW w:type="dxa" w:w="2098"/>
+            <w:tcW w:type="dxa" w:w="1984"/>
             <w:shd w:fill="EEF1F6"/>
           </w:tcPr>
           <w:p>
@@ -5057,13 +5035,13 @@
                 <w:rFonts w:ascii="微软雅黑" w:hAnsi="微软雅黑" w:eastAsia="微软雅黑"/>
                 <w:sz w:val="18"/>
               </w:rPr>
-              <w:t>单元与回归测试</w:t>
+              <w:t>单元与回归</w:t>
             </w:r>
           </w:p>
         </w:tc>
         <w:tc>
           <w:tcPr>
-            <w:tcW w:type="dxa" w:w="4762"/>
+            <w:tcW w:type="dxa" w:w="4876"/>
           </w:tcPr>
           <w:p>
             <w:pPr>
@@ -5075,13 +5053,13 @@
                 <w:rFonts w:ascii="微软雅黑" w:hAnsi="微软雅黑" w:eastAsia="微软雅黑"/>
                 <w:sz w:val="18"/>
               </w:rPr>
-              <w:t>node test/run.js（正向 / 反向 / 可修复 / 自然语言 / 提示词 / 脚本卫生）</w:t>
+              <w:t>node test/run.js（正向 / 反向 / 可修复 / 自然语言 / 数值解析 / 帮助页 / 脚本卫生）</w:t>
             </w:r>
           </w:p>
         </w:tc>
         <w:tc>
           <w:tcPr>
-            <w:tcW w:type="dxa" w:w="2098"/>
+            <w:tcW w:type="dxa" w:w="1984"/>
           </w:tcPr>
           <w:p>
             <w:pPr>
@@ -5093,7 +5071,302 @@
                 <w:rFonts w:ascii="微软雅黑" w:hAnsi="微软雅黑" w:eastAsia="微软雅黑"/>
                 <w:sz w:val="18"/>
               </w:rPr>
-              <w:t>318 项断言全部通过</w:t>
+              <w:t>318 项断言通过</w:t>
+            </w:r>
+          </w:p>
+        </w:tc>
+      </w:tr>
+      <w:tr>
+        <w:trPr>
+          <w:cantSplit/>
+        </w:trPr>
+        <w:tc>
+          <w:tcPr>
+            <w:tcW w:type="dxa" w:w="1928"/>
+          </w:tcPr>
+          <w:p>
+            <w:pPr>
+              <w:spacing w:after="40"/>
+            </w:pPr>
+            <w:r/>
+            <w:r>
+              <w:rPr>
+                <w:rFonts w:ascii="微软雅黑" w:hAnsi="微软雅黑" w:eastAsia="微软雅黑"/>
+                <w:sz w:val="18"/>
+              </w:rPr>
+              <w:t>BPMN 规范（L2）</w:t>
+            </w:r>
+          </w:p>
+        </w:tc>
+        <w:tc>
+          <w:tcPr>
+            <w:tcW w:type="dxa" w:w="4876"/>
+          </w:tcPr>
+          <w:p>
+            <w:pPr>
+              <w:spacing w:after="40"/>
+            </w:pPr>
+            <w:r/>
+            <w:r>
+              <w:rPr>
+                <w:rFonts w:ascii="微软雅黑" w:hAnsi="微软雅黑" w:eastAsia="微软雅黑"/>
+                <w:sz w:val="18"/>
+              </w:rPr>
+              <w:t>OMG 官方 XSD + JDK 17 单文件校验器</w:t>
+            </w:r>
+          </w:p>
+        </w:tc>
+        <w:tc>
+          <w:tcPr>
+            <w:tcW w:type="dxa" w:w="1984"/>
+          </w:tcPr>
+          <w:p>
+            <w:pPr>
+              <w:spacing w:after="40"/>
+            </w:pPr>
+            <w:r/>
+            <w:r>
+              <w:rPr>
+                <w:rFonts w:ascii="微软雅黑" w:hAnsi="微软雅黑" w:eastAsia="微软雅黑"/>
+                <w:sz w:val="18"/>
+              </w:rPr>
+              <w:t>65 / 65 文件通过</w:t>
+            </w:r>
+          </w:p>
+        </w:tc>
+      </w:tr>
+      <w:tr>
+        <w:trPr>
+          <w:cantSplit/>
+        </w:trPr>
+        <w:tc>
+          <w:tcPr>
+            <w:tcW w:type="dxa" w:w="1928"/>
+          </w:tcPr>
+          <w:p>
+            <w:pPr>
+              <w:spacing w:after="40"/>
+            </w:pPr>
+            <w:r/>
+            <w:r>
+              <w:rPr>
+                <w:rFonts w:ascii="微软雅黑" w:hAnsi="微软雅黑" w:eastAsia="微软雅黑"/>
+                <w:sz w:val="18"/>
+              </w:rPr>
+              <w:t>BPMN 模型（L2b）</w:t>
+            </w:r>
+          </w:p>
+        </w:tc>
+        <w:tc>
+          <w:tcPr>
+            <w:tcW w:type="dxa" w:w="4876"/>
+          </w:tcPr>
+          <w:p>
+            <w:pPr>
+              <w:spacing w:after="40"/>
+            </w:pPr>
+            <w:r/>
+            <w:r>
+              <w:rPr>
+                <w:rFonts w:ascii="微软雅黑" w:hAnsi="微软雅黑" w:eastAsia="微软雅黑"/>
+                <w:sz w:val="18"/>
+              </w:rPr>
+              <w:t>第三方 bpmn-moddle</w:t>
+            </w:r>
+          </w:p>
+        </w:tc>
+        <w:tc>
+          <w:tcPr>
+            <w:tcW w:type="dxa" w:w="1984"/>
+          </w:tcPr>
+          <w:p>
+            <w:pPr>
+              <w:spacing w:after="40"/>
+            </w:pPr>
+            <w:r/>
+            <w:r>
+              <w:rPr>
+                <w:rFonts w:ascii="微软雅黑" w:hAnsi="微软雅黑" w:eastAsia="微软雅黑"/>
+                <w:sz w:val="18"/>
+              </w:rPr>
+              <w:t>65 / 65 文件通过</w:t>
+            </w:r>
+          </w:p>
+        </w:tc>
+      </w:tr>
+      <w:tr>
+        <w:trPr>
+          <w:cantSplit/>
+        </w:trPr>
+        <w:tc>
+          <w:tcPr>
+            <w:tcW w:type="dxa" w:w="1928"/>
+          </w:tcPr>
+          <w:p>
+            <w:pPr>
+              <w:spacing w:after="40"/>
+            </w:pPr>
+            <w:r/>
+            <w:r>
+              <w:rPr>
+                <w:rFonts w:ascii="微软雅黑" w:hAnsi="微软雅黑" w:eastAsia="微软雅黑"/>
+                <w:sz w:val="18"/>
+              </w:rPr>
+              <w:t>引擎接受（L4-lite）</w:t>
+            </w:r>
+          </w:p>
+        </w:tc>
+        <w:tc>
+          <w:tcPr>
+            <w:tcW w:type="dxa" w:w="4876"/>
+          </w:tcPr>
+          <w:p>
+            <w:pPr>
+              <w:spacing w:after="40"/>
+            </w:pPr>
+            <w:r/>
+            <w:r>
+              <w:rPr>
+                <w:rFonts w:ascii="微软雅黑" w:hAnsi="微软雅黑" w:eastAsia="微软雅黑"/>
+                <w:sz w:val="18"/>
+              </w:rPr>
+              <w:t>Flowable 7.2.0 的 BpmnXMLConverter + ProcessValidator</w:t>
+            </w:r>
+          </w:p>
+        </w:tc>
+        <w:tc>
+          <w:tcPr>
+            <w:tcW w:type="dxa" w:w="1984"/>
+          </w:tcPr>
+          <w:p>
+            <w:pPr>
+              <w:spacing w:after="40"/>
+            </w:pPr>
+            <w:r/>
+            <w:r>
+              <w:rPr>
+                <w:rFonts w:ascii="微软雅黑" w:hAnsi="微软雅黑" w:eastAsia="微软雅黑"/>
+                <w:sz w:val="18"/>
+              </w:rPr>
+              <w:t>65 / 65 文件通过</w:t>
+            </w:r>
+          </w:p>
+        </w:tc>
+      </w:tr>
+      <w:tr>
+        <w:trPr>
+          <w:cantSplit/>
+        </w:trPr>
+        <w:tc>
+          <w:tcPr>
+            <w:tcW w:type="dxa" w:w="1928"/>
+          </w:tcPr>
+          <w:p>
+            <w:pPr>
+              <w:spacing w:after="40"/>
+            </w:pPr>
+            <w:r/>
+            <w:r>
+              <w:rPr>
+                <w:rFonts w:ascii="微软雅黑" w:hAnsi="微软雅黑" w:eastAsia="微软雅黑"/>
+                <w:sz w:val="18"/>
+              </w:rPr>
+              <w:t>实例运行（L4）</w:t>
+            </w:r>
+          </w:p>
+        </w:tc>
+        <w:tc>
+          <w:tcPr>
+            <w:tcW w:type="dxa" w:w="4876"/>
+          </w:tcPr>
+          <w:p>
+            <w:pPr>
+              <w:spacing w:after="40"/>
+            </w:pPr>
+            <w:r/>
+            <w:r>
+              <w:rPr>
+                <w:rFonts w:ascii="微软雅黑" w:hAnsi="微软雅黑" w:eastAsia="微软雅黑"/>
+                <w:sz w:val="18"/>
+              </w:rPr>
+              <w:t>Flowable + H2：部署 → 启动 → 自动完成 → 路径断言</w:t>
+            </w:r>
+          </w:p>
+        </w:tc>
+        <w:tc>
+          <w:tcPr>
+            <w:tcW w:type="dxa" w:w="1984"/>
+          </w:tcPr>
+          <w:p>
+            <w:pPr>
+              <w:spacing w:after="40"/>
+            </w:pPr>
+            <w:r/>
+            <w:r>
+              <w:rPr>
+                <w:rFonts w:ascii="微软雅黑" w:hAnsi="微软雅黑" w:eastAsia="微软雅黑"/>
+                <w:sz w:val="18"/>
+              </w:rPr>
+              <w:t>113 条断言通过</w:t>
+            </w:r>
+          </w:p>
+        </w:tc>
+      </w:tr>
+      <w:tr>
+        <w:trPr>
+          <w:cantSplit/>
+        </w:trPr>
+        <w:tc>
+          <w:tcPr>
+            <w:tcW w:type="dxa" w:w="1928"/>
+          </w:tcPr>
+          <w:p>
+            <w:pPr>
+              <w:spacing w:after="40"/>
+            </w:pPr>
+            <w:r/>
+            <w:r>
+              <w:rPr>
+                <w:rFonts w:ascii="微软雅黑" w:hAnsi="微软雅黑" w:eastAsia="微软雅黑"/>
+                <w:sz w:val="18"/>
+              </w:rPr>
+              <w:t>分支覆盖</w:t>
+            </w:r>
+          </w:p>
+        </w:tc>
+        <w:tc>
+          <w:tcPr>
+            <w:tcW w:type="dxa" w:w="4876"/>
+          </w:tcPr>
+          <w:p>
+            <w:pPr>
+              <w:spacing w:after="40"/>
+            </w:pPr>
+            <w:r/>
+            <w:r>
+              <w:rPr>
+                <w:rFonts w:ascii="微软雅黑" w:hAnsi="微软雅黑" w:eastAsia="微软雅黑"/>
+                <w:sz w:val="18"/>
+              </w:rPr>
+              <w:t>scripts/coverage-specs.js 按模板自动生成</w:t>
+            </w:r>
+          </w:p>
+        </w:tc>
+        <w:tc>
+          <w:tcPr>
+            <w:tcW w:type="dxa" w:w="1984"/>
+          </w:tcPr>
+          <w:p>
+            <w:pPr>
+              <w:spacing w:after="40"/>
+            </w:pPr>
+            <w:r/>
+            <w:r>
+              <w:rPr>
+                <w:rFonts w:ascii="微软雅黑" w:hAnsi="微软雅黑" w:eastAsia="微软雅黑"/>
+                <w:sz w:val="18"/>
+              </w:rPr>
+              <w:t>100 条 / 28 个模板</w:t>
             </w:r>
           </w:p>
         </w:tc>
@@ -5122,7 +5395,7 @@
         </w:tc>
         <w:tc>
           <w:tcPr>
-            <w:tcW w:type="dxa" w:w="4762"/>
+            <w:tcW w:type="dxa" w:w="4876"/>
           </w:tcPr>
           <w:p>
             <w:pPr>
@@ -5140,7 +5413,7 @@
         </w:tc>
         <w:tc>
           <w:tcPr>
-            <w:tcW w:type="dxa" w:w="2098"/>
+            <w:tcW w:type="dxa" w:w="1984"/>
           </w:tcPr>
           <w:p>
             <w:pPr>
@@ -5152,243 +5425,7 @@
                 <w:rFonts w:ascii="微软雅黑" w:hAnsi="微软雅黑" w:eastAsia="微软雅黑"/>
                 <w:sz w:val="18"/>
               </w:rPr>
-              <w:t>8 / 8 通过（100%）</w:t>
-            </w:r>
-          </w:p>
-        </w:tc>
-      </w:tr>
-      <w:tr>
-        <w:trPr>
-          <w:cantSplit/>
-        </w:trPr>
-        <w:tc>
-          <w:tcPr>
-            <w:tcW w:type="dxa" w:w="1928"/>
-          </w:tcPr>
-          <w:p>
-            <w:pPr>
-              <w:spacing w:after="40"/>
-            </w:pPr>
-            <w:r/>
-            <w:r>
-              <w:rPr>
-                <w:rFonts w:ascii="微软雅黑" w:hAnsi="微软雅黑" w:eastAsia="微软雅黑"/>
-                <w:sz w:val="18"/>
-              </w:rPr>
-              <w:t>BPMN 规范（L2）</w:t>
-            </w:r>
-          </w:p>
-        </w:tc>
-        <w:tc>
-          <w:tcPr>
-            <w:tcW w:type="dxa" w:w="4762"/>
-          </w:tcPr>
-          <w:p>
-            <w:pPr>
-              <w:spacing w:after="40"/>
-            </w:pPr>
-            <w:r/>
-            <w:r>
-              <w:rPr>
-                <w:rFonts w:ascii="微软雅黑" w:hAnsi="微软雅黑" w:eastAsia="微软雅黑"/>
-                <w:sz w:val="18"/>
-              </w:rPr>
-              <w:t>OMG 官方 XSD + JDK 17 单文件校验器</w:t>
-            </w:r>
-          </w:p>
-        </w:tc>
-        <w:tc>
-          <w:tcPr>
-            <w:tcW w:type="dxa" w:w="2098"/>
-          </w:tcPr>
-          <w:p>
-            <w:pPr>
-              <w:spacing w:after="40"/>
-            </w:pPr>
-            <w:r/>
-            <w:r>
-              <w:rPr>
-                <w:rFonts w:ascii="微软雅黑" w:hAnsi="微软雅黑" w:eastAsia="微软雅黑"/>
-                <w:sz w:val="18"/>
-              </w:rPr>
-              <w:t>125 / 125 文件通过</w:t>
-            </w:r>
-          </w:p>
-        </w:tc>
-      </w:tr>
-      <w:tr>
-        <w:trPr>
-          <w:cantSplit/>
-        </w:trPr>
-        <w:tc>
-          <w:tcPr>
-            <w:tcW w:type="dxa" w:w="1928"/>
-          </w:tcPr>
-          <w:p>
-            <w:pPr>
-              <w:spacing w:after="40"/>
-            </w:pPr>
-            <w:r/>
-            <w:r>
-              <w:rPr>
-                <w:rFonts w:ascii="微软雅黑" w:hAnsi="微软雅黑" w:eastAsia="微软雅黑"/>
-                <w:sz w:val="18"/>
-              </w:rPr>
-              <w:t>BPMN 模型（L2b）</w:t>
-            </w:r>
-          </w:p>
-        </w:tc>
-        <w:tc>
-          <w:tcPr>
-            <w:tcW w:type="dxa" w:w="4762"/>
-          </w:tcPr>
-          <w:p>
-            <w:pPr>
-              <w:spacing w:after="40"/>
-            </w:pPr>
-            <w:r/>
-            <w:r>
-              <w:rPr>
-                <w:rFonts w:ascii="微软雅黑" w:hAnsi="微软雅黑" w:eastAsia="微软雅黑"/>
-                <w:sz w:val="18"/>
-              </w:rPr>
-              <w:t>第三方 bpmn-moddle</w:t>
-            </w:r>
-          </w:p>
-        </w:tc>
-        <w:tc>
-          <w:tcPr>
-            <w:tcW w:type="dxa" w:w="2098"/>
-          </w:tcPr>
-          <w:p>
-            <w:pPr>
-              <w:spacing w:after="40"/>
-            </w:pPr>
-            <w:r/>
-            <w:r>
-              <w:rPr>
-                <w:rFonts w:ascii="微软雅黑" w:hAnsi="微软雅黑" w:eastAsia="微软雅黑"/>
-                <w:sz w:val="18"/>
-              </w:rPr>
-              <w:t>125 / 125 文件通过</w:t>
-            </w:r>
-          </w:p>
-        </w:tc>
-      </w:tr>
-      <w:tr>
-        <w:trPr>
-          <w:cantSplit/>
-        </w:trPr>
-        <w:tc>
-          <w:tcPr>
-            <w:tcW w:type="dxa" w:w="1928"/>
-          </w:tcPr>
-          <w:p>
-            <w:pPr>
-              <w:spacing w:after="40"/>
-            </w:pPr>
-            <w:r/>
-            <w:r>
-              <w:rPr>
-                <w:rFonts w:ascii="微软雅黑" w:hAnsi="微软雅黑" w:eastAsia="微软雅黑"/>
-                <w:sz w:val="18"/>
-              </w:rPr>
-              <w:t>引擎接受（L4-lite）</w:t>
-            </w:r>
-          </w:p>
-        </w:tc>
-        <w:tc>
-          <w:tcPr>
-            <w:tcW w:type="dxa" w:w="4762"/>
-          </w:tcPr>
-          <w:p>
-            <w:pPr>
-              <w:spacing w:after="40"/>
-            </w:pPr>
-            <w:r/>
-            <w:r>
-              <w:rPr>
-                <w:rFonts w:ascii="微软雅黑" w:hAnsi="微软雅黑" w:eastAsia="微软雅黑"/>
-                <w:sz w:val="18"/>
-              </w:rPr>
-              <w:t>Flowable 7.2.0 的 BpmnXMLConverter + ProcessValidator</w:t>
-            </w:r>
-          </w:p>
-        </w:tc>
-        <w:tc>
-          <w:tcPr>
-            <w:tcW w:type="dxa" w:w="2098"/>
-          </w:tcPr>
-          <w:p>
-            <w:pPr>
-              <w:spacing w:after="40"/>
-            </w:pPr>
-            <w:r/>
-            <w:r>
-              <w:rPr>
-                <w:rFonts w:ascii="微软雅黑" w:hAnsi="微软雅黑" w:eastAsia="微软雅黑"/>
-                <w:sz w:val="18"/>
-              </w:rPr>
-              <w:t>125 / 125 文件通过</w:t>
-            </w:r>
-          </w:p>
-        </w:tc>
-      </w:tr>
-      <w:tr>
-        <w:trPr>
-          <w:cantSplit/>
-        </w:trPr>
-        <w:tc>
-          <w:tcPr>
-            <w:tcW w:type="dxa" w:w="1928"/>
-          </w:tcPr>
-          <w:p>
-            <w:pPr>
-              <w:spacing w:after="40"/>
-            </w:pPr>
-            <w:r/>
-            <w:r>
-              <w:rPr>
-                <w:rFonts w:ascii="微软雅黑" w:hAnsi="微软雅黑" w:eastAsia="微软雅黑"/>
-                <w:sz w:val="18"/>
-              </w:rPr>
-              <w:t>实例运行（L4）</w:t>
-            </w:r>
-          </w:p>
-        </w:tc>
-        <w:tc>
-          <w:tcPr>
-            <w:tcW w:type="dxa" w:w="4762"/>
-          </w:tcPr>
-          <w:p>
-            <w:pPr>
-              <w:spacing w:after="40"/>
-            </w:pPr>
-            <w:r/>
-            <w:r>
-              <w:rPr>
-                <w:rFonts w:ascii="微软雅黑" w:hAnsi="微软雅黑" w:eastAsia="微软雅黑"/>
-                <w:sz w:val="18"/>
-              </w:rPr>
-              <w:t>Flowable + H2 内存引擎：部署 → 启动实例 → 自动完成任务 → 路径断言</w:t>
-            </w:r>
-          </w:p>
-        </w:tc>
-        <w:tc>
-          <w:tcPr>
-            <w:tcW w:type="dxa" w:w="2098"/>
-          </w:tcPr>
-          <w:p>
-            <w:pPr>
-              <w:spacing w:after="40"/>
-            </w:pPr>
-            <w:r/>
-            <w:r>
-              <w:rPr>
-                <w:rFonts w:ascii="微软雅黑" w:hAnsi="微软雅黑" w:eastAsia="微软雅黑"/>
-                <w:sz w:val="18"/>
-              </w:rPr>
-              <w:t>113 / 113 断言通过</w:t>
+              <w:t>8 / 8 通过</w:t>
             </w:r>
           </w:p>
         </w:tc>
@@ -5417,7 +5454,7 @@
         </w:tc>
         <w:tc>
           <w:tcPr>
-            <w:tcW w:type="dxa" w:w="4762"/>
+            <w:tcW w:type="dxa" w:w="4876"/>
           </w:tcPr>
           <w:p>
             <w:pPr>
@@ -5435,7 +5472,7 @@
         </w:tc>
         <w:tc>
           <w:tcPr>
-            <w:tcW w:type="dxa" w:w="2098"/>
+            <w:tcW w:type="dxa" w:w="1984"/>
           </w:tcPr>
           <w:p>
             <w:pPr>
@@ -5447,7 +5484,7 @@
                 <w:rFonts w:ascii="微软雅黑" w:hAnsi="微软雅黑" w:eastAsia="微软雅黑"/>
                 <w:sz w:val="18"/>
               </w:rPr>
-              <w:t>完全一致，产物无时间戳</w:t>
+              <w:t>完全一致（产物无时间戳）</w:t>
             </w:r>
           </w:p>
         </w:tc>
@@ -5463,22 +5500,7 @@
         <w:pStyle w:val="Heading2"/>
       </w:pPr>
       <w:r>
-        <w:t>6.1 大模型实测样例</w:t>
-      </w:r>
-    </w:p>
-    <w:p>
-      <w:pPr>
-        <w:spacing w:after="120"/>
-      </w:pPr>
-      <w:r>
-        <w:rPr>
-          <w:rFonts w:ascii="微软雅黑" w:hAnsi="微软雅黑" w:eastAsia="微软雅黑"/>
-          <w:b w:val="0"/>
-          <w:i w:val="0"/>
-          <w:color w:val="1F2329"/>
-          <w:sz w:val="21"/>
-        </w:rPr>
-        <w:t>输入（真实测试用例）：</w:t>
+        <w:t>6.1 大模型实测（真实调用一次）</w:t>
       </w:r>
     </w:p>
     <w:p>
@@ -5493,349 +5515,54 @@
           <w:color w:val="6B7280"/>
           <w:sz w:val="19"/>
         </w:rPr>
-        <w:t>“我要做一个差旅报销审批流，金额小于 2000 主管批，超过 8000 财务批”</w:t>
+        <w:t>输入：“我要做一个差旅报销审批流，金额小于 2000 主管批，超过 8000 财务批”</w:t>
       </w:r>
     </w:p>
     <w:p>
       <w:pPr>
-        <w:spacing w:after="120"/>
+        <w:pStyle w:val="ListBullet"/>
+        <w:spacing w:after="60" w:line="336" w:lineRule="auto"/>
       </w:pPr>
       <w:r>
         <w:rPr>
           <w:rFonts w:ascii="微软雅黑" w:hAnsi="微软雅黑" w:eastAsia="微软雅黑"/>
-          <w:b w:val="0"/>
-          <w:i w:val="0"/>
-          <w:color w:val="1F2329"/>
           <w:sz w:val="21"/>
         </w:rPr>
-        <w:t>输出：</w:t>
+        <w:t>模型只回 JSON：templateId=amount_tiered、tier1=2000、tier2=8000，置信度 0.95。</w:t>
       </w:r>
     </w:p>
-    <w:tbl>
-      <w:tblPr>
-        <w:tblStyle w:val="TableGrid"/>
-        <w:tblW w:type="auto" w:w="0"/>
-        <w:jc w:val="center"/>
-        <w:tblLayout w:type="fixed"/>
-        <w:tblLook w:firstColumn="1" w:firstRow="1" w:lastColumn="0" w:lastRow="0" w:noHBand="0" w:noVBand="1" w:val="04A0"/>
-      </w:tblPr>
-      <w:tblGrid>
-        <w:gridCol w:w="4536"/>
-        <w:gridCol w:w="4536"/>
-      </w:tblGrid>
-      <w:tr>
-        <w:trPr>
-          <w:cantSplit/>
-          <w:tblHeader/>
-        </w:trPr>
-        <w:tc>
-          <w:tcPr>
-            <w:tcW w:type="dxa" w:w="1814"/>
-            <w:shd w:fill="EEF1F6"/>
-          </w:tcPr>
-          <w:p>
-            <w:r/>
-            <w:r>
-              <w:rPr>
-                <w:rFonts w:ascii="微软雅黑" w:hAnsi="微软雅黑"/>
-                <w:b/>
-                <w:sz w:val="18"/>
-              </w:rPr>
-              <w:t>项</w:t>
-            </w:r>
-          </w:p>
-        </w:tc>
-        <w:tc>
-          <w:tcPr>
-            <w:tcW w:type="dxa" w:w="6973"/>
-            <w:shd w:fill="EEF1F6"/>
-          </w:tcPr>
-          <w:p>
-            <w:r/>
-            <w:r>
-              <w:rPr>
-                <w:rFonts w:ascii="微软雅黑" w:hAnsi="微软雅黑"/>
-                <w:b/>
-                <w:sz w:val="18"/>
-              </w:rPr>
-              <w:t>结果</w:t>
-            </w:r>
-          </w:p>
-        </w:tc>
-      </w:tr>
-      <w:tr>
-        <w:trPr>
-          <w:cantSplit/>
-        </w:trPr>
-        <w:tc>
-          <w:tcPr>
-            <w:tcW w:type="dxa" w:w="1814"/>
-          </w:tcPr>
-          <w:p>
-            <w:pPr>
-              <w:spacing w:after="40"/>
-            </w:pPr>
-            <w:r/>
-            <w:r>
-              <w:rPr>
-                <w:rFonts w:ascii="微软雅黑" w:hAnsi="微软雅黑" w:eastAsia="微软雅黑"/>
-                <w:sz w:val="18"/>
-              </w:rPr>
-              <w:t>选中模板</w:t>
-            </w:r>
-          </w:p>
-        </w:tc>
-        <w:tc>
-          <w:tcPr>
-            <w:tcW w:type="dxa" w:w="6973"/>
-          </w:tcPr>
-          <w:p>
-            <w:pPr>
-              <w:spacing w:after="40"/>
-            </w:pPr>
-            <w:r/>
-            <w:r>
-              <w:rPr>
-                <w:rFonts w:ascii="微软雅黑" w:hAnsi="微软雅黑" w:eastAsia="微软雅黑"/>
-                <w:sz w:val="18"/>
-              </w:rPr>
-              <w:t>amount_tiered（金额分级审批），置信度 0.95</w:t>
-            </w:r>
-          </w:p>
-        </w:tc>
-      </w:tr>
-      <w:tr>
-        <w:trPr>
-          <w:cantSplit/>
-        </w:trPr>
-        <w:tc>
-          <w:tcPr>
-            <w:tcW w:type="dxa" w:w="1814"/>
-          </w:tcPr>
-          <w:p>
-            <w:pPr>
-              <w:spacing w:after="40"/>
-            </w:pPr>
-            <w:r/>
-            <w:r>
-              <w:rPr>
-                <w:rFonts w:ascii="微软雅黑" w:hAnsi="微软雅黑" w:eastAsia="微软雅黑"/>
-                <w:sz w:val="18"/>
-              </w:rPr>
-              <w:t>模型理由</w:t>
-            </w:r>
-          </w:p>
-        </w:tc>
-        <w:tc>
-          <w:tcPr>
-            <w:tcW w:type="dxa" w:w="6973"/>
-          </w:tcPr>
-          <w:p>
-            <w:pPr>
-              <w:spacing w:after="40"/>
-            </w:pPr>
-            <w:r/>
-            <w:r>
-              <w:rPr>
-                <w:rFonts w:ascii="微软雅黑" w:hAnsi="微软雅黑" w:eastAsia="微软雅黑"/>
-                <w:sz w:val="18"/>
-              </w:rPr>
-              <w:t>差旅报销按金额区间分级审批，2000 与 8000 为两个分级阈值</w:t>
-            </w:r>
-          </w:p>
-        </w:tc>
-      </w:tr>
-      <w:tr>
-        <w:trPr>
-          <w:cantSplit/>
-        </w:trPr>
-        <w:tc>
-          <w:tcPr>
-            <w:tcW w:type="dxa" w:w="1814"/>
-          </w:tcPr>
-          <w:p>
-            <w:pPr>
-              <w:spacing w:after="40"/>
-            </w:pPr>
-            <w:r/>
-            <w:r>
-              <w:rPr>
-                <w:rFonts w:ascii="微软雅黑" w:hAnsi="微软雅黑" w:eastAsia="微软雅黑"/>
-                <w:sz w:val="18"/>
-              </w:rPr>
-              <w:t>生成结果</w:t>
-            </w:r>
-          </w:p>
-        </w:tc>
-        <w:tc>
-          <w:tcPr>
-            <w:tcW w:type="dxa" w:w="6973"/>
-          </w:tcPr>
-          <w:p>
-            <w:pPr>
-              <w:spacing w:after="40"/>
-            </w:pPr>
-            <w:r/>
-            <w:r>
-              <w:rPr>
-                <w:rFonts w:ascii="微软雅黑" w:hAnsi="微软雅黑" w:eastAsia="微软雅黑"/>
-                <w:sz w:val="18"/>
-              </w:rPr>
-              <w:t>7 个节点 / 8 条连线，5999 字节</w:t>
-            </w:r>
-          </w:p>
-        </w:tc>
-      </w:tr>
-      <w:tr>
-        <w:trPr>
-          <w:cantSplit/>
-        </w:trPr>
-        <w:tc>
-          <w:tcPr>
-            <w:tcW w:type="dxa" w:w="1814"/>
-          </w:tcPr>
-          <w:p>
-            <w:pPr>
-              <w:spacing w:after="40"/>
-            </w:pPr>
-            <w:r/>
-            <w:r>
-              <w:rPr>
-                <w:rFonts w:ascii="微软雅黑" w:hAnsi="微软雅黑" w:eastAsia="微软雅黑"/>
-                <w:sz w:val="18"/>
-              </w:rPr>
-              <w:t>条件表达式</w:t>
-            </w:r>
-          </w:p>
-        </w:tc>
-        <w:tc>
-          <w:tcPr>
-            <w:tcW w:type="dxa" w:w="6973"/>
-          </w:tcPr>
-          <w:p>
-            <w:pPr>
-              <w:spacing w:after="40"/>
-            </w:pPr>
-            <w:r/>
-            <w:r>
-              <w:rPr>
-                <w:rFonts w:ascii="微软雅黑" w:hAnsi="微软雅黑" w:eastAsia="微软雅黑"/>
-                <w:sz w:val="18"/>
-              </w:rPr>
-              <w:t>${amount &lt;= 2000} 与 ${amount &gt; 2000 &amp;&amp; amount &lt;= 8000}</w:t>
-            </w:r>
-          </w:p>
-        </w:tc>
-      </w:tr>
-      <w:tr>
-        <w:trPr>
-          <w:cantSplit/>
-        </w:trPr>
-        <w:tc>
-          <w:tcPr>
-            <w:tcW w:type="dxa" w:w="1814"/>
-          </w:tcPr>
-          <w:p>
-            <w:pPr>
-              <w:spacing w:after="40"/>
-            </w:pPr>
-            <w:r/>
-            <w:r>
-              <w:rPr>
-                <w:rFonts w:ascii="微软雅黑" w:hAnsi="微软雅黑" w:eastAsia="微软雅黑"/>
-                <w:sz w:val="18"/>
-              </w:rPr>
-              <w:t>引擎校验</w:t>
-            </w:r>
-          </w:p>
-        </w:tc>
-        <w:tc>
-          <w:tcPr>
-            <w:tcW w:type="dxa" w:w="6973"/>
-          </w:tcPr>
-          <w:p>
-            <w:pPr>
-              <w:spacing w:after="40"/>
-            </w:pPr>
-            <w:r/>
-            <w:r>
-              <w:rPr>
-                <w:rFonts w:ascii="微软雅黑" w:hAnsi="微软雅黑" w:eastAsia="微软雅黑"/>
-                <w:sz w:val="18"/>
-              </w:rPr>
-              <w:t>Flowable 解析通过、流程校验通过</w:t>
-            </w:r>
-          </w:p>
-        </w:tc>
-      </w:tr>
-      <w:tr>
-        <w:trPr>
-          <w:cantSplit/>
-        </w:trPr>
-        <w:tc>
-          <w:tcPr>
-            <w:tcW w:type="dxa" w:w="1814"/>
-          </w:tcPr>
-          <w:p>
-            <w:pPr>
-              <w:spacing w:after="40"/>
-            </w:pPr>
-            <w:r/>
-            <w:r>
-              <w:rPr>
-                <w:rFonts w:ascii="微软雅黑" w:hAnsi="微软雅黑" w:eastAsia="微软雅黑"/>
-                <w:sz w:val="18"/>
-              </w:rPr>
-              <w:t>用量</w:t>
-            </w:r>
-          </w:p>
-        </w:tc>
-        <w:tc>
-          <w:tcPr>
-            <w:tcW w:type="dxa" w:w="6973"/>
-          </w:tcPr>
-          <w:p>
-            <w:pPr>
-              <w:spacing w:after="40"/>
-            </w:pPr>
-            <w:r/>
-            <w:r>
-              <w:rPr>
-                <w:rFonts w:ascii="微软雅黑" w:hAnsi="微软雅黑" w:eastAsia="微软雅黑"/>
-                <w:sz w:val="18"/>
-              </w:rPr>
-              <w:t>输入 869 token / 输出 159 token</w:t>
-            </w:r>
-          </w:p>
-        </w:tc>
-      </w:tr>
-    </w:tbl>
     <w:p>
       <w:pPr>
-        <w:spacing w:after="40"/>
+        <w:pStyle w:val="ListBullet"/>
+        <w:spacing w:after="60" w:line="336" w:lineRule="auto"/>
       </w:pPr>
+      <w:r>
+        <w:rPr>
+          <w:rFonts w:ascii="微软雅黑" w:hAnsi="微软雅黑" w:eastAsia="微软雅黑"/>
+          <w:sz w:val="21"/>
+        </w:rPr>
+        <w:t>理由：差旅报销按金额区间分级审批，2000 与 8000 为两个分级阈值。</w:t>
+      </w:r>
+    </w:p>
+    <w:p>
+      <w:pPr>
+        <w:pStyle w:val="ListBullet"/>
+        <w:spacing w:after="60" w:line="336" w:lineRule="auto"/>
+      </w:pPr>
+      <w:r>
+        <w:rPr>
+          <w:rFonts w:ascii="微软雅黑" w:hAnsi="微软雅黑" w:eastAsia="微软雅黑"/>
+          <w:sz w:val="21"/>
+        </w:rPr>
+        <w:t>产物：7 节点 / 8 连线，条件为 ${amount &lt;= 2000} 与 ${amount &gt; 2000 &amp;&amp; amount &lt;= 8000}，Flowable 校验通过。</w:t>
+      </w:r>
     </w:p>
     <w:p>
       <w:pPr>
         <w:pStyle w:val="Heading2"/>
       </w:pPr>
       <w:r>
-        <w:t>6.2 实例运行实测记录</w:t>
-      </w:r>
-    </w:p>
-    <w:p>
-      <w:pPr>
-        <w:spacing w:after="120"/>
-      </w:pPr>
-      <w:r>
-        <w:rPr>
-          <w:rFonts w:ascii="微软雅黑" w:hAnsi="微软雅黑" w:eastAsia="微软雅黑"/>
-          <w:b w:val="0"/>
-          <w:i w:val="0"/>
-          <w:color w:val="1F2329"/>
-          <w:sz w:val="21"/>
-        </w:rPr>
-        <w:t>同一份 BPMN 文件、不同输入变量，实测走过的审批路径：</w:t>
+        <w:t>6.2 实例运行实测（同一文件、不同变量走不同分支）</w:t>
       </w:r>
     </w:p>
     <w:tbl>
@@ -5875,7 +5602,7 @@
         </w:tc>
         <w:tc>
           <w:tcPr>
-            <w:tcW w:type="dxa" w:w="4876"/>
+            <w:tcW w:type="dxa" w:w="5102"/>
             <w:shd w:fill="EEF1F6"/>
           </w:tcPr>
           <w:p>
@@ -5892,7 +5619,7 @@
         </w:tc>
         <w:tc>
           <w:tcPr>
-            <w:tcW w:type="dxa" w:w="2098"/>
+            <w:tcW w:type="dxa" w:w="1871"/>
             <w:shd w:fill="EEF1F6"/>
           </w:tcPr>
           <w:p>
@@ -5932,7 +5659,7 @@
         </w:tc>
         <w:tc>
           <w:tcPr>
-            <w:tcW w:type="dxa" w:w="4876"/>
+            <w:tcW w:type="dxa" w:w="5102"/>
           </w:tcPr>
           <w:p>
             <w:pPr>
@@ -5950,7 +5677,7 @@
         </w:tc>
         <w:tc>
           <w:tcPr>
-            <w:tcW w:type="dxa" w:w="2098"/>
+            <w:tcW w:type="dxa" w:w="1871"/>
           </w:tcPr>
           <w:p>
             <w:pPr>
@@ -5962,7 +5689,7 @@
                 <w:rFonts w:ascii="微软雅黑" w:hAnsi="微软雅黑" w:eastAsia="微软雅黑"/>
                 <w:sz w:val="18"/>
               </w:rPr>
-              <w:t>小额走主管，符合预期</w:t>
+              <w:t>小额走主管</w:t>
             </w:r>
           </w:p>
         </w:tc>
@@ -5991,7 +5718,7 @@
         </w:tc>
         <w:tc>
           <w:tcPr>
-            <w:tcW w:type="dxa" w:w="4876"/>
+            <w:tcW w:type="dxa" w:w="5102"/>
           </w:tcPr>
           <w:p>
             <w:pPr>
@@ -6009,7 +5736,7 @@
         </w:tc>
         <w:tc>
           <w:tcPr>
-            <w:tcW w:type="dxa" w:w="2098"/>
+            <w:tcW w:type="dxa" w:w="1871"/>
           </w:tcPr>
           <w:p>
             <w:pPr>
@@ -6021,7 +5748,7 @@
                 <w:rFonts w:ascii="微软雅黑" w:hAnsi="微软雅黑" w:eastAsia="微软雅黑"/>
                 <w:sz w:val="18"/>
               </w:rPr>
-              <w:t>中额升级到总监，符合预期</w:t>
+              <w:t>中额升级总监</w:t>
             </w:r>
           </w:p>
         </w:tc>
@@ -6050,7 +5777,7 @@
         </w:tc>
         <w:tc>
           <w:tcPr>
-            <w:tcW w:type="dxa" w:w="4876"/>
+            <w:tcW w:type="dxa" w:w="5102"/>
           </w:tcPr>
           <w:p>
             <w:pPr>
@@ -6068,7 +5795,7 @@
         </w:tc>
         <w:tc>
           <w:tcPr>
-            <w:tcW w:type="dxa" w:w="2098"/>
+            <w:tcW w:type="dxa" w:w="1871"/>
           </w:tcPr>
           <w:p>
             <w:pPr>
@@ -6080,7 +5807,7 @@
                 <w:rFonts w:ascii="微软雅黑" w:hAnsi="微软雅黑" w:eastAsia="微软雅黑"/>
                 <w:sz w:val="18"/>
               </w:rPr>
-              <w:t>大额走财务，符合预期</w:t>
+              <w:t>大额走财务</w:t>
             </w:r>
           </w:p>
         </w:tc>
@@ -6103,13 +5830,13 @@
                 <w:rFonts w:ascii="微软雅黑" w:hAnsi="微软雅黑" w:eastAsia="微软雅黑"/>
                 <w:sz w:val="18"/>
               </w:rPr>
-              <w:t>days = 2</w:t>
+              <w:t>overseas = true</w:t>
             </w:r>
           </w:p>
         </w:tc>
         <w:tc>
           <w:tcPr>
-            <w:tcW w:type="dxa" w:w="4876"/>
+            <w:tcW w:type="dxa" w:w="5102"/>
           </w:tcPr>
           <w:p>
             <w:pPr>
@@ -6121,13 +5848,13 @@
                 <w:rFonts w:ascii="微软雅黑" w:hAnsi="微软雅黑" w:eastAsia="微软雅黑"/>
                 <w:sz w:val="18"/>
               </w:rPr>
-              <w:t>填写请假单 → 直属主管审批</w:t>
+              <w:t>提交出差申请 → 行政审核 → 主管审批 → 行政备案</w:t>
             </w:r>
           </w:p>
         </w:tc>
         <w:tc>
           <w:tcPr>
-            <w:tcW w:type="dxa" w:w="2098"/>
+            <w:tcW w:type="dxa" w:w="1871"/>
           </w:tcPr>
           <w:p>
             <w:pPr>
@@ -6139,125 +5866,7 @@
                 <w:rFonts w:ascii="微软雅黑" w:hAnsi="微软雅黑" w:eastAsia="微软雅黑"/>
                 <w:sz w:val="18"/>
               </w:rPr>
-              <w:t>短期走主管</w:t>
-            </w:r>
-          </w:p>
-        </w:tc>
-      </w:tr>
-      <w:tr>
-        <w:trPr>
-          <w:cantSplit/>
-        </w:trPr>
-        <w:tc>
-          <w:tcPr>
-            <w:tcW w:type="dxa" w:w="1814"/>
-          </w:tcPr>
-          <w:p>
-            <w:pPr>
-              <w:spacing w:after="40"/>
-            </w:pPr>
-            <w:r/>
-            <w:r>
-              <w:rPr>
-                <w:rFonts w:ascii="微软雅黑" w:hAnsi="微软雅黑" w:eastAsia="微软雅黑"/>
-                <w:sz w:val="18"/>
-              </w:rPr>
-              <w:t>days = 9</w:t>
-            </w:r>
-          </w:p>
-        </w:tc>
-        <w:tc>
-          <w:tcPr>
-            <w:tcW w:type="dxa" w:w="4876"/>
-          </w:tcPr>
-          <w:p>
-            <w:pPr>
-              <w:spacing w:after="40"/>
-            </w:pPr>
-            <w:r/>
-            <w:r>
-              <w:rPr>
-                <w:rFonts w:ascii="微软雅黑" w:hAnsi="微软雅黑" w:eastAsia="微软雅黑"/>
-                <w:sz w:val="18"/>
-              </w:rPr>
-              <w:t>填写请假单 → 人事备案</w:t>
-            </w:r>
-          </w:p>
-        </w:tc>
-        <w:tc>
-          <w:tcPr>
-            <w:tcW w:type="dxa" w:w="2098"/>
-          </w:tcPr>
-          <w:p>
-            <w:pPr>
-              <w:spacing w:after="40"/>
-            </w:pPr>
-            <w:r/>
-            <w:r>
-              <w:rPr>
-                <w:rFonts w:ascii="微软雅黑" w:hAnsi="微软雅黑" w:eastAsia="微软雅黑"/>
-                <w:sz w:val="18"/>
-              </w:rPr>
-              <w:t>长期走人事</w:t>
-            </w:r>
-          </w:p>
-        </w:tc>
-      </w:tr>
-      <w:tr>
-        <w:trPr>
-          <w:cantSplit/>
-        </w:trPr>
-        <w:tc>
-          <w:tcPr>
-            <w:tcW w:type="dxa" w:w="1814"/>
-          </w:tcPr>
-          <w:p>
-            <w:pPr>
-              <w:spacing w:after="40"/>
-            </w:pPr>
-            <w:r/>
-            <w:r>
-              <w:rPr>
-                <w:rFonts w:ascii="微软雅黑" w:hAnsi="微软雅黑" w:eastAsia="微软雅黑"/>
-                <w:sz w:val="18"/>
-              </w:rPr>
-              <w:t>合同会签</w:t>
-            </w:r>
-          </w:p>
-        </w:tc>
-        <w:tc>
-          <w:tcPr>
-            <w:tcW w:type="dxa" w:w="4876"/>
-          </w:tcPr>
-          <w:p>
-            <w:pPr>
-              <w:spacing w:after="40"/>
-            </w:pPr>
-            <w:r/>
-            <w:r>
-              <w:rPr>
-                <w:rFonts w:ascii="微软雅黑" w:hAnsi="微软雅黑" w:eastAsia="微软雅黑"/>
-                <w:sz w:val="18"/>
-              </w:rPr>
-              <w:t>提交 → 法务/财务/业务三方并行 → 汇总结束</w:t>
-            </w:r>
-          </w:p>
-        </w:tc>
-        <w:tc>
-          <w:tcPr>
-            <w:tcW w:type="dxa" w:w="2098"/>
-          </w:tcPr>
-          <w:p>
-            <w:pPr>
-              <w:spacing w:after="40"/>
-            </w:pPr>
-            <w:r/>
-            <w:r>
-              <w:rPr>
-                <w:rFonts w:ascii="微软雅黑" w:hAnsi="微软雅黑" w:eastAsia="微软雅黑"/>
-                <w:sz w:val="18"/>
-              </w:rPr>
-              <w:t>并行网关语义正确</w:t>
+              <w:t>是否类分支生效</w:t>
             </w:r>
           </w:p>
         </w:tc>
@@ -6267,21 +5876,6 @@
       <w:pPr>
         <w:spacing w:after="40"/>
       </w:pPr>
-    </w:p>
-    <w:p>
-      <w:pPr>
-        <w:spacing w:after="120"/>
-      </w:pPr>
-      <w:r>
-        <w:rPr>
-          <w:rFonts w:ascii="微软雅黑" w:hAnsi="微软雅黑" w:eastAsia="微软雅黑"/>
-          <w:b w:val="0"/>
-          <w:i w:val="0"/>
-          <w:color w:val="1F2329"/>
-          <w:sz w:val="21"/>
-        </w:rPr>
-        <w:t>这组结果说明：条件表达式不是文本装饰，它在真实引擎里驱动了不同的执行路径。</w:t>
-      </w:r>
     </w:p>
     <w:p>
       <w:pPr>
@@ -6303,747 +5897,59 @@
           <w:color w:val="1F2329"/>
           <w:sz w:val="21"/>
         </w:rPr>
-        <w:t>本项目的开发环境前提是：一台 Windows 家庭版机器，无法使用系统级沙盒或虚拟机。因此隔离只能做在用户态，原则也必须落到可检查的地方。</w:t>
+        <w:t>开发机是 Windows 家庭版，无法用系统级沙盒，因此隔离只能做在用户态、并且必须落到可检查的地方。完整 10 条原则见仓库 PRINCIPLES.md，其中 9 条由代码自动检查，红灯即不得产出。</w:t>
       </w:r>
-    </w:p>
-    <w:tbl>
-      <w:tblPr>
-        <w:tblStyle w:val="TableGrid"/>
-        <w:tblW w:type="auto" w:w="0"/>
-        <w:jc w:val="center"/>
-        <w:tblLayout w:type="fixed"/>
-        <w:tblLook w:firstColumn="1" w:firstRow="1" w:lastColumn="0" w:lastRow="0" w:noHBand="0" w:noVBand="1" w:val="04A0"/>
-      </w:tblPr>
-      <w:tblGrid>
-        <w:gridCol w:w="3024"/>
-        <w:gridCol w:w="3024"/>
-        <w:gridCol w:w="3024"/>
-      </w:tblGrid>
-      <w:tr>
-        <w:trPr>
-          <w:cantSplit/>
-          <w:tblHeader/>
-        </w:trPr>
-        <w:tc>
-          <w:tcPr>
-            <w:tcW w:type="dxa" w:w="794"/>
-            <w:shd w:fill="EEF1F6"/>
-          </w:tcPr>
-          <w:p>
-            <w:r/>
-            <w:r>
-              <w:rPr>
-                <w:rFonts w:ascii="微软雅黑" w:hAnsi="微软雅黑"/>
-                <w:b/>
-                <w:sz w:val="17"/>
-              </w:rPr>
-              <w:t>编号</w:t>
-            </w:r>
-          </w:p>
-        </w:tc>
-        <w:tc>
-          <w:tcPr>
-            <w:tcW w:type="dxa" w:w="4762"/>
-            <w:shd w:fill="EEF1F6"/>
-          </w:tcPr>
-          <w:p>
-            <w:r/>
-            <w:r>
-              <w:rPr>
-                <w:rFonts w:ascii="微软雅黑" w:hAnsi="微软雅黑"/>
-                <w:b/>
-                <w:sz w:val="17"/>
-              </w:rPr>
-              <w:t>原则</w:t>
-            </w:r>
-          </w:p>
-        </w:tc>
-        <w:tc>
-          <w:tcPr>
-            <w:tcW w:type="dxa" w:w="3231"/>
-            <w:shd w:fill="EEF1F6"/>
-          </w:tcPr>
-          <w:p>
-            <w:r/>
-            <w:r>
-              <w:rPr>
-                <w:rFonts w:ascii="微软雅黑" w:hAnsi="微软雅黑"/>
-                <w:b/>
-                <w:sz w:val="17"/>
-              </w:rPr>
-              <w:t>检查方式</w:t>
-            </w:r>
-          </w:p>
-        </w:tc>
-      </w:tr>
-      <w:tr>
-        <w:trPr>
-          <w:cantSplit/>
-        </w:trPr>
-        <w:tc>
-          <w:tcPr>
-            <w:tcW w:type="dxa" w:w="794"/>
-          </w:tcPr>
-          <w:p>
-            <w:pPr>
-              <w:spacing w:after="40"/>
-            </w:pPr>
-            <w:r/>
-            <w:r>
-              <w:rPr>
-                <w:rFonts w:ascii="微软雅黑" w:hAnsi="微软雅黑" w:eastAsia="微软雅黑"/>
-                <w:sz w:val="17"/>
-              </w:rPr>
-              <w:t>P-01</w:t>
-            </w:r>
-          </w:p>
-        </w:tc>
-        <w:tc>
-          <w:tcPr>
-            <w:tcW w:type="dxa" w:w="4762"/>
-          </w:tcPr>
-          <w:p>
-            <w:pPr>
-              <w:spacing w:after="40"/>
-            </w:pPr>
-            <w:r/>
-            <w:r>
-              <w:rPr>
-                <w:rFonts w:ascii="微软雅黑" w:hAnsi="微软雅黑" w:eastAsia="微软雅黑"/>
-                <w:sz w:val="17"/>
-              </w:rPr>
-              <w:t>磁盘边界：产物不出工作区</w:t>
-            </w:r>
-          </w:p>
-        </w:tc>
-        <w:tc>
-          <w:tcPr>
-            <w:tcW w:type="dxa" w:w="3231"/>
-          </w:tcPr>
-          <w:p>
-            <w:pPr>
-              <w:spacing w:after="40"/>
-            </w:pPr>
-            <w:r/>
-            <w:r>
-              <w:rPr>
-                <w:rFonts w:ascii="微软雅黑" w:hAnsi="微软雅黑" w:eastAsia="微软雅黑"/>
-                <w:sz w:val="17"/>
-              </w:rPr>
-              <w:t>扫描源码中的系统路径引用</w:t>
-            </w:r>
-          </w:p>
-        </w:tc>
-      </w:tr>
-      <w:tr>
-        <w:trPr>
-          <w:cantSplit/>
-        </w:trPr>
-        <w:tc>
-          <w:tcPr>
-            <w:tcW w:type="dxa" w:w="794"/>
-          </w:tcPr>
-          <w:p>
-            <w:pPr>
-              <w:spacing w:after="40"/>
-            </w:pPr>
-            <w:r/>
-            <w:r>
-              <w:rPr>
-                <w:rFonts w:ascii="微软雅黑" w:hAnsi="微软雅黑" w:eastAsia="微软雅黑"/>
-                <w:sz w:val="17"/>
-              </w:rPr>
-              <w:t>P-02</w:t>
-            </w:r>
-          </w:p>
-        </w:tc>
-        <w:tc>
-          <w:tcPr>
-            <w:tcW w:type="dxa" w:w="4762"/>
-          </w:tcPr>
-          <w:p>
-            <w:pPr>
-              <w:spacing w:after="40"/>
-            </w:pPr>
-            <w:r/>
-            <w:r>
-              <w:rPr>
-                <w:rFonts w:ascii="微软雅黑" w:hAnsi="微软雅黑" w:eastAsia="微软雅黑"/>
-                <w:sz w:val="17"/>
-              </w:rPr>
-              <w:t>分层零依赖：核心 0 依赖，前端依赖须登记</w:t>
-            </w:r>
-          </w:p>
-        </w:tc>
-        <w:tc>
-          <w:tcPr>
-            <w:tcW w:type="dxa" w:w="3231"/>
-          </w:tcPr>
-          <w:p>
-            <w:pPr>
-              <w:spacing w:after="40"/>
-            </w:pPr>
-            <w:r/>
-            <w:r>
-              <w:rPr>
-                <w:rFonts w:ascii="微软雅黑" w:hAnsi="微软雅黑" w:eastAsia="微软雅黑"/>
-                <w:sz w:val="17"/>
-              </w:rPr>
-              <w:t>根依赖为 0 + web 依赖必须出现在第三方清单</w:t>
-            </w:r>
-          </w:p>
-        </w:tc>
-      </w:tr>
-      <w:tr>
-        <w:trPr>
-          <w:cantSplit/>
-        </w:trPr>
-        <w:tc>
-          <w:tcPr>
-            <w:tcW w:type="dxa" w:w="794"/>
-          </w:tcPr>
-          <w:p>
-            <w:pPr>
-              <w:spacing w:after="40"/>
-            </w:pPr>
-            <w:r/>
-            <w:r>
-              <w:rPr>
-                <w:rFonts w:ascii="微软雅黑" w:hAnsi="微软雅黑" w:eastAsia="微软雅黑"/>
-                <w:sz w:val="17"/>
-              </w:rPr>
-              <w:t>P-03</w:t>
-            </w:r>
-          </w:p>
-        </w:tc>
-        <w:tc>
-          <w:tcPr>
-            <w:tcW w:type="dxa" w:w="4762"/>
-          </w:tcPr>
-          <w:p>
-            <w:pPr>
-              <w:spacing w:after="40"/>
-            </w:pPr>
-            <w:r/>
-            <w:r>
-              <w:rPr>
-                <w:rFonts w:ascii="微软雅黑" w:hAnsi="微软雅黑" w:eastAsia="微软雅黑"/>
-                <w:sz w:val="17"/>
-              </w:rPr>
-              <w:t>不碰系统层：无服务 / 注册表 / PATH / 管理员</w:t>
-            </w:r>
-          </w:p>
-        </w:tc>
-        <w:tc>
-          <w:tcPr>
-            <w:tcW w:type="dxa" w:w="3231"/>
-          </w:tcPr>
-          <w:p>
-            <w:pPr>
-              <w:spacing w:after="40"/>
-            </w:pPr>
-            <w:r/>
-            <w:r>
-              <w:rPr>
-                <w:rFonts w:ascii="微软雅黑" w:hAnsi="微软雅黑" w:eastAsia="微软雅黑"/>
-                <w:sz w:val="17"/>
-              </w:rPr>
-              <w:t>扫描 reg add / sc create / setx 等</w:t>
-            </w:r>
-          </w:p>
-        </w:tc>
-      </w:tr>
-      <w:tr>
-        <w:trPr>
-          <w:cantSplit/>
-        </w:trPr>
-        <w:tc>
-          <w:tcPr>
-            <w:tcW w:type="dxa" w:w="794"/>
-          </w:tcPr>
-          <w:p>
-            <w:pPr>
-              <w:spacing w:after="40"/>
-            </w:pPr>
-            <w:r/>
-            <w:r>
-              <w:rPr>
-                <w:rFonts w:ascii="微软雅黑" w:hAnsi="微软雅黑" w:eastAsia="微软雅黑"/>
-                <w:sz w:val="17"/>
-              </w:rPr>
-              <w:t>P-04</w:t>
-            </w:r>
-          </w:p>
-        </w:tc>
-        <w:tc>
-          <w:tcPr>
-            <w:tcW w:type="dxa" w:w="4762"/>
-          </w:tcPr>
-          <w:p>
-            <w:pPr>
-              <w:spacing w:after="40"/>
-            </w:pPr>
-            <w:r/>
-            <w:r>
-              <w:rPr>
-                <w:rFonts w:ascii="微软雅黑" w:hAnsi="微软雅黑" w:eastAsia="微软雅黑"/>
-                <w:sz w:val="17"/>
-              </w:rPr>
-              <w:t>进程边界：前台运行，不起常驻进程</w:t>
-            </w:r>
-          </w:p>
-        </w:tc>
-        <w:tc>
-          <w:tcPr>
-            <w:tcW w:type="dxa" w:w="3231"/>
-          </w:tcPr>
-          <w:p>
-            <w:pPr>
-              <w:spacing w:after="40"/>
-            </w:pPr>
-            <w:r/>
-            <w:r>
-              <w:rPr>
-                <w:rFonts w:ascii="微软雅黑" w:hAnsi="微软雅黑" w:eastAsia="微软雅黑"/>
-                <w:sz w:val="17"/>
-              </w:rPr>
-              <w:t>扫描子进程调用</w:t>
-            </w:r>
-          </w:p>
-        </w:tc>
-      </w:tr>
-      <w:tr>
-        <w:trPr>
-          <w:cantSplit/>
-        </w:trPr>
-        <w:tc>
-          <w:tcPr>
-            <w:tcW w:type="dxa" w:w="794"/>
-          </w:tcPr>
-          <w:p>
-            <w:pPr>
-              <w:spacing w:after="40"/>
-            </w:pPr>
-            <w:r/>
-            <w:r>
-              <w:rPr>
-                <w:rFonts w:ascii="微软雅黑" w:hAnsi="微软雅黑" w:eastAsia="微软雅黑"/>
-                <w:sz w:val="17"/>
-              </w:rPr>
-              <w:t>P-05</w:t>
-            </w:r>
-          </w:p>
-        </w:tc>
-        <w:tc>
-          <w:tcPr>
-            <w:tcW w:type="dxa" w:w="4762"/>
-          </w:tcPr>
-          <w:p>
-            <w:pPr>
-              <w:spacing w:after="40"/>
-            </w:pPr>
-            <w:r/>
-            <w:r>
-              <w:rPr>
-                <w:rFonts w:ascii="微软雅黑" w:hAnsi="微软雅黑" w:eastAsia="微软雅黑"/>
-                <w:sz w:val="17"/>
-              </w:rPr>
-              <w:t>密钥不落地：只从环境变量读</w:t>
-            </w:r>
-          </w:p>
-        </w:tc>
-        <w:tc>
-          <w:tcPr>
-            <w:tcW w:type="dxa" w:w="3231"/>
-          </w:tcPr>
-          <w:p>
-            <w:pPr>
-              <w:spacing w:after="40"/>
-            </w:pPr>
-            <w:r/>
-            <w:r>
-              <w:rPr>
-                <w:rFonts w:ascii="微软雅黑" w:hAnsi="微软雅黑" w:eastAsia="微软雅黑"/>
-                <w:sz w:val="17"/>
-              </w:rPr>
-              <w:t>扫描硬编码密钥特征</w:t>
-            </w:r>
-          </w:p>
-        </w:tc>
-      </w:tr>
-      <w:tr>
-        <w:trPr>
-          <w:cantSplit/>
-        </w:trPr>
-        <w:tc>
-          <w:tcPr>
-            <w:tcW w:type="dxa" w:w="794"/>
-          </w:tcPr>
-          <w:p>
-            <w:pPr>
-              <w:spacing w:after="40"/>
-            </w:pPr>
-            <w:r/>
-            <w:r>
-              <w:rPr>
-                <w:rFonts w:ascii="微软雅黑" w:hAnsi="微软雅黑" w:eastAsia="微软雅黑"/>
-                <w:sz w:val="17"/>
-              </w:rPr>
-              <w:t>P-06</w:t>
-            </w:r>
-          </w:p>
-        </w:tc>
-        <w:tc>
-          <w:tcPr>
-            <w:tcW w:type="dxa" w:w="4762"/>
-          </w:tcPr>
-          <w:p>
-            <w:pPr>
-              <w:spacing w:after="40"/>
-            </w:pPr>
-            <w:r/>
-            <w:r>
-              <w:rPr>
-                <w:rFonts w:ascii="微软雅黑" w:hAnsi="微软雅黑" w:eastAsia="微软雅黑"/>
-                <w:sz w:val="17"/>
-              </w:rPr>
-              <w:t>生成物确定性：同输入同字节</w:t>
-            </w:r>
-          </w:p>
-        </w:tc>
-        <w:tc>
-          <w:tcPr>
-            <w:tcW w:type="dxa" w:w="3231"/>
-          </w:tcPr>
-          <w:p>
-            <w:pPr>
-              <w:spacing w:after="40"/>
-            </w:pPr>
-            <w:r/>
-            <w:r>
-              <w:rPr>
-                <w:rFonts w:ascii="微软雅黑" w:hAnsi="微软雅黑" w:eastAsia="微软雅黑"/>
-                <w:sz w:val="17"/>
-              </w:rPr>
-              <w:t>两次序列化比对字节</w:t>
-            </w:r>
-          </w:p>
-        </w:tc>
-      </w:tr>
-      <w:tr>
-        <w:trPr>
-          <w:cantSplit/>
-        </w:trPr>
-        <w:tc>
-          <w:tcPr>
-            <w:tcW w:type="dxa" w:w="794"/>
-          </w:tcPr>
-          <w:p>
-            <w:pPr>
-              <w:spacing w:after="40"/>
-            </w:pPr>
-            <w:r/>
-            <w:r>
-              <w:rPr>
-                <w:rFonts w:ascii="微软雅黑" w:hAnsi="微软雅黑" w:eastAsia="微软雅黑"/>
-                <w:sz w:val="17"/>
-              </w:rPr>
-              <w:t>P-07</w:t>
-            </w:r>
-          </w:p>
-        </w:tc>
-        <w:tc>
-          <w:tcPr>
-            <w:tcW w:type="dxa" w:w="4762"/>
-          </w:tcPr>
-          <w:p>
-            <w:pPr>
-              <w:spacing w:after="40"/>
-            </w:pPr>
-            <w:r/>
-            <w:r>
-              <w:rPr>
-                <w:rFonts w:ascii="微软雅黑" w:hAnsi="微软雅黑" w:eastAsia="微软雅黑"/>
-                <w:sz w:val="17"/>
-              </w:rPr>
-              <w:t>模型不直接产出 XML</w:t>
-            </w:r>
-          </w:p>
-        </w:tc>
-        <w:tc>
-          <w:tcPr>
-            <w:tcW w:type="dxa" w:w="3231"/>
-          </w:tcPr>
-          <w:p>
-            <w:pPr>
-              <w:spacing w:after="40"/>
-            </w:pPr>
-            <w:r/>
-            <w:r>
-              <w:rPr>
-                <w:rFonts w:ascii="微软雅黑" w:hAnsi="微软雅黑" w:eastAsia="微软雅黑"/>
-                <w:sz w:val="17"/>
-              </w:rPr>
-              <w:t>校验管线顺序 + 拒绝非 IR 输入</w:t>
-            </w:r>
-          </w:p>
-        </w:tc>
-      </w:tr>
-      <w:tr>
-        <w:trPr>
-          <w:cantSplit/>
-        </w:trPr>
-        <w:tc>
-          <w:tcPr>
-            <w:tcW w:type="dxa" w:w="794"/>
-          </w:tcPr>
-          <w:p>
-            <w:pPr>
-              <w:spacing w:after="40"/>
-            </w:pPr>
-            <w:r/>
-            <w:r>
-              <w:rPr>
-                <w:rFonts w:ascii="微软雅黑" w:hAnsi="微软雅黑" w:eastAsia="微软雅黑"/>
-                <w:sz w:val="17"/>
-              </w:rPr>
-              <w:t>P-08</w:t>
-            </w:r>
-          </w:p>
-        </w:tc>
-        <w:tc>
-          <w:tcPr>
-            <w:tcW w:type="dxa" w:w="4762"/>
-          </w:tcPr>
-          <w:p>
-            <w:pPr>
-              <w:spacing w:after="40"/>
-            </w:pPr>
-            <w:r/>
-            <w:r>
-              <w:rPr>
-                <w:rFonts w:ascii="微软雅黑" w:hAnsi="微软雅黑" w:eastAsia="微软雅黑"/>
-                <w:sz w:val="17"/>
-              </w:rPr>
-              <w:t>校验不可跳过，错误必须显式失败</w:t>
-            </w:r>
-          </w:p>
-        </w:tc>
-        <w:tc>
-          <w:tcPr>
-            <w:tcW w:type="dxa" w:w="3231"/>
-          </w:tcPr>
-          <w:p>
-            <w:pPr>
-              <w:spacing w:after="40"/>
-            </w:pPr>
-            <w:r/>
-            <w:r>
-              <w:rPr>
-                <w:rFonts w:ascii="微软雅黑" w:hAnsi="微软雅黑" w:eastAsia="微软雅黑"/>
-                <w:sz w:val="17"/>
-              </w:rPr>
-              <w:t>坏图必须报错、好图必须零错</w:t>
-            </w:r>
-          </w:p>
-        </w:tc>
-      </w:tr>
-      <w:tr>
-        <w:trPr>
-          <w:cantSplit/>
-        </w:trPr>
-        <w:tc>
-          <w:tcPr>
-            <w:tcW w:type="dxa" w:w="794"/>
-          </w:tcPr>
-          <w:p>
-            <w:pPr>
-              <w:spacing w:after="40"/>
-            </w:pPr>
-            <w:r/>
-            <w:r>
-              <w:rPr>
-                <w:rFonts w:ascii="微软雅黑" w:hAnsi="微软雅黑" w:eastAsia="微软雅黑"/>
-                <w:sz w:val="17"/>
-              </w:rPr>
-              <w:t>P-09</w:t>
-            </w:r>
-          </w:p>
-        </w:tc>
-        <w:tc>
-          <w:tcPr>
-            <w:tcW w:type="dxa" w:w="4762"/>
-          </w:tcPr>
-          <w:p>
-            <w:pPr>
-              <w:spacing w:after="40"/>
-            </w:pPr>
-            <w:r/>
-            <w:r>
-              <w:rPr>
-                <w:rFonts w:ascii="微软雅黑" w:hAnsi="微软雅黑" w:eastAsia="微软雅黑"/>
-                <w:sz w:val="17"/>
-              </w:rPr>
-              <w:t>可归零：产物不入库、可一键清理</w:t>
-            </w:r>
-          </w:p>
-        </w:tc>
-        <w:tc>
-          <w:tcPr>
-            <w:tcW w:type="dxa" w:w="3231"/>
-          </w:tcPr>
-          <w:p>
-            <w:pPr>
-              <w:spacing w:after="40"/>
-            </w:pPr>
-            <w:r/>
-            <w:r>
-              <w:rPr>
-                <w:rFonts w:ascii="微软雅黑" w:hAnsi="微软雅黑" w:eastAsia="微软雅黑"/>
-                <w:sz w:val="17"/>
-              </w:rPr>
-              <w:t>.gitignore 覆盖 + 项目内无残留产物</w:t>
-            </w:r>
-          </w:p>
-        </w:tc>
-      </w:tr>
-      <w:tr>
-        <w:trPr>
-          <w:cantSplit/>
-        </w:trPr>
-        <w:tc>
-          <w:tcPr>
-            <w:tcW w:type="dxa" w:w="794"/>
-          </w:tcPr>
-          <w:p>
-            <w:pPr>
-              <w:spacing w:after="40"/>
-            </w:pPr>
-            <w:r/>
-            <w:r>
-              <w:rPr>
-                <w:rFonts w:ascii="微软雅黑" w:hAnsi="微软雅黑" w:eastAsia="微软雅黑"/>
-                <w:sz w:val="17"/>
-              </w:rPr>
-              <w:t>P-10</w:t>
-            </w:r>
-          </w:p>
-        </w:tc>
-        <w:tc>
-          <w:tcPr>
-            <w:tcW w:type="dxa" w:w="4762"/>
-          </w:tcPr>
-          <w:p>
-            <w:pPr>
-              <w:spacing w:after="40"/>
-            </w:pPr>
-            <w:r/>
-            <w:r>
-              <w:rPr>
-                <w:rFonts w:ascii="微软雅黑" w:hAnsi="微软雅黑" w:eastAsia="微软雅黑"/>
-                <w:sz w:val="17"/>
-              </w:rPr>
-              <w:t>诚实：未验证的不声称已验证</w:t>
-            </w:r>
-          </w:p>
-        </w:tc>
-        <w:tc>
-          <w:tcPr>
-            <w:tcW w:type="dxa" w:w="3231"/>
-          </w:tcPr>
-          <w:p>
-            <w:pPr>
-              <w:spacing w:after="40"/>
-            </w:pPr>
-            <w:r/>
-            <w:r>
-              <w:rPr>
-                <w:rFonts w:ascii="微软雅黑" w:hAnsi="微软雅黑" w:eastAsia="微软雅黑"/>
-                <w:sz w:val="17"/>
-              </w:rPr>
-              <w:t>人工守则（本章 6.2 即其应用）</w:t>
-            </w:r>
-          </w:p>
-        </w:tc>
-      </w:tr>
-      <w:tr>
-        <w:trPr>
-          <w:cantSplit/>
-        </w:trPr>
-        <w:tc>
-          <w:tcPr>
-            <w:tcW w:type="dxa" w:w="794"/>
-          </w:tcPr>
-          <w:p>
-            <w:pPr>
-              <w:spacing w:after="40"/>
-            </w:pPr>
-            <w:r/>
-            <w:r>
-              <w:rPr>
-                <w:rFonts w:ascii="微软雅黑" w:hAnsi="微软雅黑" w:eastAsia="微软雅黑"/>
-                <w:sz w:val="17"/>
-              </w:rPr>
-              <w:t>P-11</w:t>
-            </w:r>
-          </w:p>
-        </w:tc>
-        <w:tc>
-          <w:tcPr>
-            <w:tcW w:type="dxa" w:w="4762"/>
-          </w:tcPr>
-          <w:p>
-            <w:pPr>
-              <w:spacing w:after="40"/>
-            </w:pPr>
-            <w:r/>
-            <w:r>
-              <w:rPr>
-                <w:rFonts w:ascii="微软雅黑" w:hAnsi="微软雅黑" w:eastAsia="微软雅黑"/>
-                <w:sz w:val="17"/>
-              </w:rPr>
-              <w:t>开源合规：许可证清晰、无传染性污染</w:t>
-            </w:r>
-          </w:p>
-        </w:tc>
-        <w:tc>
-          <w:tcPr>
-            <w:tcW w:type="dxa" w:w="3231"/>
-          </w:tcPr>
-          <w:p>
-            <w:pPr>
-              <w:spacing w:after="40"/>
-            </w:pPr>
-            <w:r/>
-            <w:r>
-              <w:rPr>
-                <w:rFonts w:ascii="微软雅黑" w:hAnsi="微软雅黑" w:eastAsia="微软雅黑"/>
-                <w:sz w:val="17"/>
-              </w:rPr>
-              <w:t>LICENSE / NOTICE / 第三方清单齐全，源码无 GPL</w:t>
-            </w:r>
-          </w:p>
-        </w:tc>
-      </w:tr>
-    </w:tbl>
-    <w:p>
-      <w:pPr>
-        <w:spacing w:after="40"/>
-      </w:pPr>
     </w:p>
     <w:p>
       <w:pPr>
-        <w:spacing w:after="120"/>
+        <w:pStyle w:val="ListBullet"/>
+        <w:spacing w:after="60" w:line="336" w:lineRule="auto"/>
       </w:pPr>
       <w:r>
         <w:rPr>
           <w:rFonts w:ascii="微软雅黑" w:hAnsi="微软雅黑" w:eastAsia="微软雅黑"/>
-          <w:b w:val="0"/>
-          <w:i w:val="0"/>
-          <w:color w:val="1F2329"/>
           <w:sz w:val="21"/>
         </w:rPr>
-        <w:t>实测数据：依赖安装前后，系统级 npm 缓存 802.5 MB 保持不变（零增长），全部依赖落在项目目录，可一键删除；安装环境守卫报告与基线完全一致。</w:t>
+        <w:t>P-01 磁盘边界：产物不出工作区（用户流程 .data\out，验证产物 .data\verify）。</w:t>
+      </w:r>
+    </w:p>
+    <w:p>
+      <w:pPr>
+        <w:pStyle w:val="ListBullet"/>
+        <w:spacing w:after="60" w:line="336" w:lineRule="auto"/>
+      </w:pPr>
+      <w:r>
+        <w:rPr>
+          <w:rFonts w:ascii="微软雅黑" w:hAnsi="微软雅黑" w:eastAsia="微软雅黑"/>
+          <w:sz w:val="21"/>
+        </w:rPr>
+        <w:t>P-02/03/04 不碰系统层：核心零依赖、不装服务、不改 PATH / 注册表、不起常驻进程。</w:t>
+      </w:r>
+    </w:p>
+    <w:p>
+      <w:pPr>
+        <w:pStyle w:val="ListBullet"/>
+        <w:spacing w:after="60" w:line="336" w:lineRule="auto"/>
+      </w:pPr>
+      <w:r>
+        <w:rPr>
+          <w:rFonts w:ascii="微软雅黑" w:hAnsi="微软雅黑" w:eastAsia="微软雅黑"/>
+          <w:sz w:val="21"/>
+        </w:rPr>
+        <w:t>P-05 密钥不落地：只从环境变量或界面内存读取，不入库、不打印、不进日志。</w:t>
+      </w:r>
+    </w:p>
+    <w:p>
+      <w:pPr>
+        <w:pStyle w:val="ListBullet"/>
+        <w:spacing w:after="60" w:line="336" w:lineRule="auto"/>
+      </w:pPr>
+      <w:r>
+        <w:rPr>
+          <w:rFonts w:ascii="微软雅黑" w:hAnsi="微软雅黑" w:eastAsia="微软雅黑"/>
+          <w:sz w:val="21"/>
+        </w:rPr>
+        <w:t>P-07 模型不直接产出 XML：校验管线顺序固定，非 IR 输入直接拒绝。</w:t>
       </w:r>
     </w:p>
     <w:p>
@@ -7059,7 +5965,7 @@
         <w:pStyle w:val="Heading2"/>
       </w:pPr>
       <w:r>
-        <w:t>8.1 三条命令</w:t>
+        <w:t>8.1 常用命令</w:t>
       </w:r>
     </w:p>
     <w:tbl>
@@ -7081,7 +5987,7 @@
         </w:trPr>
         <w:tc>
           <w:tcPr>
-            <w:tcW w:type="dxa" w:w="3402"/>
+            <w:tcW w:type="dxa" w:w="3628"/>
             <w:shd w:fill="EEF1F6"/>
           </w:tcPr>
           <w:p>
@@ -7098,7 +6004,7 @@
         </w:tc>
         <w:tc>
           <w:tcPr>
-            <w:tcW w:type="dxa" w:w="5386"/>
+            <w:tcW w:type="dxa" w:w="5159"/>
             <w:shd w:fill="EEF1F6"/>
           </w:tcPr>
           <w:p>
@@ -7120,7 +6026,7 @@
         </w:trPr>
         <w:tc>
           <w:tcPr>
-            <w:tcW w:type="dxa" w:w="3402"/>
+            <w:tcW w:type="dxa" w:w="3628"/>
           </w:tcPr>
           <w:p>
             <w:pPr>
@@ -7132,13 +6038,13 @@
                 <w:rFonts w:ascii="微软雅黑" w:hAnsi="微软雅黑" w:eastAsia="微软雅黑"/>
                 <w:sz w:val="18"/>
               </w:rPr>
-              <w:t>ai2bpmn.cmd "业务描述"</w:t>
+              <w:t>nl2bpmn.cmd "..." -o out.bpmn</w:t>
             </w:r>
           </w:p>
         </w:tc>
         <w:tc>
           <w:tcPr>
-            <w:tcW w:type="dxa" w:w="5386"/>
+            <w:tcW w:type="dxa" w:w="5159"/>
           </w:tcPr>
           <w:p>
             <w:pPr>
@@ -7150,7 +6056,7 @@
                 <w:rFonts w:ascii="微软雅黑" w:hAnsi="微软雅黑" w:eastAsia="微软雅黑"/>
                 <w:sz w:val="18"/>
               </w:rPr>
-              <w:t>调用大模型，一句话生成 BPMN</w:t>
+              <w:t>离线模板匹配，一句话生成（不需要 Key）</w:t>
             </w:r>
           </w:p>
         </w:tc>
@@ -7161,7 +6067,7 @@
         </w:trPr>
         <w:tc>
           <w:tcPr>
-            <w:tcW w:type="dxa" w:w="3402"/>
+            <w:tcW w:type="dxa" w:w="3628"/>
           </w:tcPr>
           <w:p>
             <w:pPr>
@@ -7173,13 +6079,13 @@
                 <w:rFonts w:ascii="微软雅黑" w:hAnsi="微软雅黑" w:eastAsia="微软雅黑"/>
                 <w:sz w:val="18"/>
               </w:rPr>
-              <w:t>nl2bpmn.cmd "业务描述"</w:t>
+              <w:t>ai2bpmn.cmd "..." -o out.bpmn</w:t>
             </w:r>
           </w:p>
         </w:tc>
         <w:tc>
           <w:tcPr>
-            <w:tcW w:type="dxa" w:w="5386"/>
+            <w:tcW w:type="dxa" w:w="5159"/>
           </w:tcPr>
           <w:p>
             <w:pPr>
@@ -7191,7 +6097,7 @@
                 <w:rFonts w:ascii="微软雅黑" w:hAnsi="微软雅黑" w:eastAsia="微软雅黑"/>
                 <w:sz w:val="18"/>
               </w:rPr>
-              <w:t>离线模板匹配，不联网、不需要密钥</w:t>
+              <w:t>调用大模型生成（需要 Key）</w:t>
             </w:r>
           </w:p>
         </w:tc>
@@ -7202,7 +6108,7 @@
         </w:trPr>
         <w:tc>
           <w:tcPr>
-            <w:tcW w:type="dxa" w:w="3402"/>
+            <w:tcW w:type="dxa" w:w="3628"/>
           </w:tcPr>
           <w:p>
             <w:pPr>
@@ -7214,13 +6120,13 @@
                 <w:rFonts w:ascii="微软雅黑" w:hAnsi="微软雅黑" w:eastAsia="微软雅黑"/>
                 <w:sz w:val="18"/>
               </w:rPr>
-              <w:t>demo.cmd</w:t>
+              <w:t>bpmn2svg.cmd out.bpmn</w:t>
             </w:r>
           </w:p>
         </w:tc>
         <w:tc>
           <w:tcPr>
-            <w:tcW w:type="dxa" w:w="5386"/>
+            <w:tcW w:type="dxa" w:w="5159"/>
           </w:tcPr>
           <w:p>
             <w:pPr>
@@ -7232,7 +6138,7 @@
                 <w:rFonts w:ascii="微软雅黑" w:hAnsi="微软雅黑" w:eastAsia="微软雅黑"/>
                 <w:sz w:val="18"/>
               </w:rPr>
-              <w:t>启动本地 Web 应用（浏览器里输入、生成、下载）</w:t>
+              <w:t>把 BPMN 渲染成 SVG（不开浏览器）</w:t>
             </w:r>
           </w:p>
         </w:tc>
@@ -7243,7 +6149,7 @@
         </w:trPr>
         <w:tc>
           <w:tcPr>
-            <w:tcW w:type="dxa" w:w="3402"/>
+            <w:tcW w:type="dxa" w:w="3628"/>
           </w:tcPr>
           <w:p>
             <w:pPr>
@@ -7261,7 +6167,7 @@
         </w:tc>
         <w:tc>
           <w:tcPr>
-            <w:tcW w:type="dxa" w:w="5386"/>
+            <w:tcW w:type="dxa" w:w="5159"/>
           </w:tcPr>
           <w:p>
             <w:pPr>
@@ -7273,7 +6179,48 @@
                 <w:rFonts w:ascii="微软雅黑" w:hAnsi="微软雅黑" w:eastAsia="微软雅黑"/>
                 <w:sz w:val="18"/>
               </w:rPr>
-              <w:t>五层验证一次跑完（测试 / XSD / moddle / 引擎）</w:t>
+              <w:t>六层验证一次跑完（测试 / XSD / moddle / 引擎 / 实例 / 覆盖）</w:t>
+            </w:r>
+          </w:p>
+        </w:tc>
+      </w:tr>
+      <w:tr>
+        <w:trPr>
+          <w:cantSplit/>
+        </w:trPr>
+        <w:tc>
+          <w:tcPr>
+            <w:tcW w:type="dxa" w:w="3628"/>
+          </w:tcPr>
+          <w:p>
+            <w:pPr>
+              <w:spacing w:after="40"/>
+            </w:pPr>
+            <w:r/>
+            <w:r>
+              <w:rPr>
+                <w:rFonts w:ascii="微软雅黑" w:hAnsi="微软雅黑" w:eastAsia="微软雅黑"/>
+                <w:sz w:val="18"/>
+              </w:rPr>
+              <w:t>创建桌面快捷方式.cmd</w:t>
+            </w:r>
+          </w:p>
+        </w:tc>
+        <w:tc>
+          <w:tcPr>
+            <w:tcW w:type="dxa" w:w="5159"/>
+          </w:tcPr>
+          <w:p>
+            <w:pPr>
+              <w:spacing w:after="40"/>
+            </w:pPr>
+            <w:r/>
+            <w:r>
+              <w:rPr>
+                <w:rFonts w:ascii="微软雅黑" w:hAnsi="微软雅黑" w:eastAsia="微软雅黑"/>
+                <w:sz w:val="18"/>
+              </w:rPr>
+              <w:t>生成桌面图标，之后双击即可用桌面应用版</w:t>
             </w:r>
           </w:p>
         </w:tc>
@@ -7289,375 +6236,7 @@
         <w:pStyle w:val="Heading2"/>
       </w:pPr>
       <w:r>
-        <w:t>8.2 目录结构（节选）</w:t>
-      </w:r>
-    </w:p>
-    <w:tbl>
-      <w:tblPr>
-        <w:tblStyle w:val="TableGrid"/>
-        <w:tblW w:type="auto" w:w="0"/>
-        <w:jc w:val="center"/>
-        <w:tblLayout w:type="fixed"/>
-        <w:tblLook w:firstColumn="1" w:firstRow="1" w:lastColumn="0" w:lastRow="0" w:noHBand="0" w:noVBand="1" w:val="04A0"/>
-      </w:tblPr>
-      <w:tblGrid>
-        <w:gridCol w:w="4536"/>
-        <w:gridCol w:w="4536"/>
-      </w:tblGrid>
-      <w:tr>
-        <w:trPr>
-          <w:cantSplit/>
-          <w:tblHeader/>
-        </w:trPr>
-        <w:tc>
-          <w:tcPr>
-            <w:tcW w:type="dxa" w:w="1928"/>
-            <w:shd w:fill="EEF1F6"/>
-          </w:tcPr>
-          <w:p>
-            <w:r/>
-            <w:r>
-              <w:rPr>
-                <w:rFonts w:ascii="微软雅黑" w:hAnsi="微软雅黑"/>
-                <w:b/>
-                <w:sz w:val="18"/>
-              </w:rPr>
-              <w:t>路径</w:t>
-            </w:r>
-          </w:p>
-        </w:tc>
-        <w:tc>
-          <w:tcPr>
-            <w:tcW w:type="dxa" w:w="6860"/>
-            <w:shd w:fill="EEF1F6"/>
-          </w:tcPr>
-          <w:p>
-            <w:r/>
-            <w:r>
-              <w:rPr>
-                <w:rFonts w:ascii="微软雅黑" w:hAnsi="微软雅黑"/>
-                <w:b/>
-                <w:sz w:val="18"/>
-              </w:rPr>
-              <w:t>说明</w:t>
-            </w:r>
-          </w:p>
-        </w:tc>
-      </w:tr>
-      <w:tr>
-        <w:trPr>
-          <w:cantSplit/>
-        </w:trPr>
-        <w:tc>
-          <w:tcPr>
-            <w:tcW w:type="dxa" w:w="1928"/>
-          </w:tcPr>
-          <w:p>
-            <w:pPr>
-              <w:spacing w:after="40"/>
-            </w:pPr>
-            <w:r/>
-            <w:r>
-              <w:rPr>
-                <w:rFonts w:ascii="微软雅黑" w:hAnsi="微软雅黑" w:eastAsia="微软雅黑"/>
-                <w:sz w:val="18"/>
-              </w:rPr>
-              <w:t>bin/</w:t>
-            </w:r>
-          </w:p>
-        </w:tc>
-        <w:tc>
-          <w:tcPr>
-            <w:tcW w:type="dxa" w:w="6860"/>
-          </w:tcPr>
-          <w:p>
-            <w:pPr>
-              <w:spacing w:after="40"/>
-            </w:pPr>
-            <w:r/>
-            <w:r>
-              <w:rPr>
-                <w:rFonts w:ascii="微软雅黑" w:hAnsi="微软雅黑" w:eastAsia="微软雅黑"/>
-                <w:sz w:val="18"/>
-              </w:rPr>
-              <w:t>两个命令行入口：IR → BPMN、自然语言 → BPMN</w:t>
-            </w:r>
-          </w:p>
-        </w:tc>
-      </w:tr>
-      <w:tr>
-        <w:trPr>
-          <w:cantSplit/>
-        </w:trPr>
-        <w:tc>
-          <w:tcPr>
-            <w:tcW w:type="dxa" w:w="1928"/>
-          </w:tcPr>
-          <w:p>
-            <w:pPr>
-              <w:spacing w:after="40"/>
-            </w:pPr>
-            <w:r/>
-            <w:r>
-              <w:rPr>
-                <w:rFonts w:ascii="微软雅黑" w:hAnsi="微软雅黑" w:eastAsia="微软雅黑"/>
-                <w:sz w:val="18"/>
-              </w:rPr>
-              <w:t>src/</w:t>
-            </w:r>
-          </w:p>
-        </w:tc>
-        <w:tc>
-          <w:tcPr>
-            <w:tcW w:type="dxa" w:w="6860"/>
-          </w:tcPr>
-          <w:p>
-            <w:pPr>
-              <w:spacing w:after="40"/>
-            </w:pPr>
-            <w:r/>
-            <w:r>
-              <w:rPr>
-                <w:rFonts w:ascii="微软雅黑" w:hAnsi="微软雅黑" w:eastAsia="微软雅黑"/>
-                <w:sz w:val="18"/>
-              </w:rPr>
-              <w:t>生成核心（零依赖）：契约、图论、布局、序列化、修复、提示词</w:t>
-            </w:r>
-          </w:p>
-        </w:tc>
-      </w:tr>
-      <w:tr>
-        <w:trPr>
-          <w:cantSplit/>
-        </w:trPr>
-        <w:tc>
-          <w:tcPr>
-            <w:tcW w:type="dxa" w:w="1928"/>
-          </w:tcPr>
-          <w:p>
-            <w:pPr>
-              <w:spacing w:after="40"/>
-            </w:pPr>
-            <w:r/>
-            <w:r>
-              <w:rPr>
-                <w:rFonts w:ascii="微软雅黑" w:hAnsi="微软雅黑" w:eastAsia="微软雅黑"/>
-                <w:sz w:val="18"/>
-              </w:rPr>
-              <w:t>src/templates/</w:t>
-            </w:r>
-          </w:p>
-        </w:tc>
-        <w:tc>
-          <w:tcPr>
-            <w:tcW w:type="dxa" w:w="6860"/>
-          </w:tcPr>
-          <w:p>
-            <w:pPr>
-              <w:spacing w:after="40"/>
-            </w:pPr>
-            <w:r/>
-            <w:r>
-              <w:rPr>
-                <w:rFonts w:ascii="微软雅黑" w:hAnsi="微软雅黑" w:eastAsia="微软雅黑"/>
-                <w:sz w:val="18"/>
-              </w:rPr>
-              <w:t>28 个审批流模板（JSON，可直接增删）</w:t>
-            </w:r>
-          </w:p>
-        </w:tc>
-      </w:tr>
-      <w:tr>
-        <w:trPr>
-          <w:cantSplit/>
-        </w:trPr>
-        <w:tc>
-          <w:tcPr>
-            <w:tcW w:type="dxa" w:w="1928"/>
-          </w:tcPr>
-          <w:p>
-            <w:pPr>
-              <w:spacing w:after="40"/>
-            </w:pPr>
-            <w:r/>
-            <w:r>
-              <w:rPr>
-                <w:rFonts w:ascii="微软雅黑" w:hAnsi="微软雅黑" w:eastAsia="微软雅黑"/>
-                <w:sz w:val="18"/>
-              </w:rPr>
-              <w:t>test/</w:t>
-            </w:r>
-          </w:p>
-        </w:tc>
-        <w:tc>
-          <w:tcPr>
-            <w:tcW w:type="dxa" w:w="6860"/>
-          </w:tcPr>
-          <w:p>
-            <w:pPr>
-              <w:spacing w:after="40"/>
-            </w:pPr>
-            <w:r/>
-            <w:r>
-              <w:rPr>
-                <w:rFonts w:ascii="微软雅黑" w:hAnsi="微软雅黑" w:eastAsia="微软雅黑"/>
-                <w:sz w:val="18"/>
-              </w:rPr>
-              <w:t>正向 / 反向 / 可修复 / 自然语言用例，共 318 项断言</w:t>
-            </w:r>
-          </w:p>
-        </w:tc>
-      </w:tr>
-      <w:tr>
-        <w:trPr>
-          <w:cantSplit/>
-        </w:trPr>
-        <w:tc>
-          <w:tcPr>
-            <w:tcW w:type="dxa" w:w="1928"/>
-          </w:tcPr>
-          <w:p>
-            <w:pPr>
-              <w:spacing w:after="40"/>
-            </w:pPr>
-            <w:r/>
-            <w:r>
-              <w:rPr>
-                <w:rFonts w:ascii="微软雅黑" w:hAnsi="微软雅黑" w:eastAsia="微软雅黑"/>
-                <w:sz w:val="18"/>
-              </w:rPr>
-              <w:t>tools/</w:t>
-            </w:r>
-          </w:p>
-        </w:tc>
-        <w:tc>
-          <w:tcPr>
-            <w:tcW w:type="dxa" w:w="6860"/>
-          </w:tcPr>
-          <w:p>
-            <w:pPr>
-              <w:spacing w:after="40"/>
-            </w:pPr>
-            <w:r/>
-            <w:r>
-              <w:rPr>
-                <w:rFonts w:ascii="微软雅黑" w:hAnsi="微软雅黑" w:eastAsia="微软雅黑"/>
-                <w:sz w:val="18"/>
-              </w:rPr>
-              <w:t>XSD 校验器、Flowable 引擎校验器（Java 单文件，无需构建工具）</w:t>
-            </w:r>
-          </w:p>
-        </w:tc>
-      </w:tr>
-      <w:tr>
-        <w:trPr>
-          <w:cantSplit/>
-        </w:trPr>
-        <w:tc>
-          <w:tcPr>
-            <w:tcW w:type="dxa" w:w="1928"/>
-          </w:tcPr>
-          <w:p>
-            <w:pPr>
-              <w:spacing w:after="40"/>
-            </w:pPr>
-            <w:r/>
-            <w:r>
-              <w:rPr>
-                <w:rFonts w:ascii="微软雅黑" w:hAnsi="微软雅黑" w:eastAsia="微软雅黑"/>
-                <w:sz w:val="18"/>
-              </w:rPr>
-              <w:t>web/</w:t>
-            </w:r>
-          </w:p>
-        </w:tc>
-        <w:tc>
-          <w:tcPr>
-            <w:tcW w:type="dxa" w:w="6860"/>
-          </w:tcPr>
-          <w:p>
-            <w:pPr>
-              <w:spacing w:after="40"/>
-            </w:pPr>
-            <w:r/>
-            <w:r>
-              <w:rPr>
-                <w:rFonts w:ascii="微软雅黑" w:hAnsi="微软雅黑" w:eastAsia="微软雅黑"/>
-                <w:sz w:val="18"/>
-              </w:rPr>
-              <w:t>本地 Web 应用（生成 / 模板库 / 验证报告 / 设置）与第三方模型校验</w:t>
-            </w:r>
-          </w:p>
-        </w:tc>
-      </w:tr>
-      <w:tr>
-        <w:trPr>
-          <w:cantSplit/>
-        </w:trPr>
-        <w:tc>
-          <w:tcPr>
-            <w:tcW w:type="dxa" w:w="1928"/>
-          </w:tcPr>
-          <w:p>
-            <w:pPr>
-              <w:spacing w:after="40"/>
-            </w:pPr>
-            <w:r/>
-            <w:r>
-              <w:rPr>
-                <w:rFonts w:ascii="微软雅黑" w:hAnsi="微软雅黑" w:eastAsia="微软雅黑"/>
-                <w:sz w:val="18"/>
-              </w:rPr>
-              <w:t>docs/</w:t>
-            </w:r>
-          </w:p>
-        </w:tc>
-        <w:tc>
-          <w:tcPr>
-            <w:tcW w:type="dxa" w:w="6860"/>
-          </w:tcPr>
-          <w:p>
-            <w:pPr>
-              <w:spacing w:after="40"/>
-            </w:pPr>
-            <w:r/>
-            <w:r>
-              <w:rPr>
-                <w:rFonts w:ascii="微软雅黑" w:hAnsi="微软雅黑" w:eastAsia="微软雅黑"/>
-                <w:sz w:val="18"/>
-              </w:rPr>
-              <w:t>架构说明、第三方许可清单、本文档</w:t>
-            </w:r>
-          </w:p>
-        </w:tc>
-      </w:tr>
-    </w:tbl>
-    <w:p>
-      <w:pPr>
-        <w:spacing w:after="40"/>
-      </w:pPr>
-    </w:p>
-    <w:p>
-      <w:pPr>
-        <w:pStyle w:val="Heading2"/>
-      </w:pPr>
-      <w:r>
-        <w:t>8.3 开源合规声明</w:t>
-      </w:r>
-    </w:p>
-    <w:p>
-      <w:pPr>
-        <w:spacing w:after="120"/>
-      </w:pPr>
-      <w:r>
-        <w:rPr>
-          <w:rFonts w:ascii="微软雅黑" w:hAnsi="微软雅黑" w:eastAsia="微软雅黑"/>
-          <w:b w:val="0"/>
-          <w:i w:val="0"/>
-          <w:color w:val="1F2329"/>
-          <w:sz w:val="21"/>
-        </w:rPr>
-        <w:t>本项目由开发者主导架构设计与核心实现；部分辅助代码由大模型生成，经人工审查与重构，确保无 GPL / AGPL 传染性代码污染。</w:t>
+        <w:t>8.2 开源合规声明</w:t>
       </w:r>
     </w:p>
     <w:p>
@@ -7683,7 +6262,7 @@
           <w:rFonts w:ascii="微软雅黑" w:hAnsi="微软雅黑" w:eastAsia="微软雅黑"/>
           <w:sz w:val="21"/>
         </w:rPr>
-        <w:t>第三方组件：见 docs/THIRD-PARTY.md，核心链路运行时依赖为 0 个。</w:t>
+        <w:t>第三方组件：见 docs/THIRD-PARTY.md；核心链路运行时依赖为 0 个，桌面应用版仅依赖 bpmn-js（MIT）。</w:t>
       </w:r>
     </w:p>
     <w:p>
@@ -7696,7 +6275,7 @@
           <w:rFonts w:ascii="微软雅黑" w:hAnsi="微软雅黑" w:eastAsia="微软雅黑"/>
           <w:sz w:val="21"/>
         </w:rPr>
-        <w:t>规范文件（OMG XSD）按需下载至缓存目录，不随仓库分发。</w:t>
+        <w:t>规范文件（OMG XSD）与 Flowable jar 按需下载至缓存目录，不随仓库分发。</w:t>
       </w:r>
     </w:p>
     <w:p>
@@ -7709,67 +6288,7 @@
           <w:rFonts w:ascii="微软雅黑" w:hAnsi="微软雅黑" w:eastAsia="微软雅黑"/>
           <w:sz w:val="21"/>
         </w:rPr>
-        <w:t>大模型密钥只从环境变量读取，不入库、不打印、不写入日志。</w:t>
-      </w:r>
-    </w:p>
-    <w:p>
-      <w:pPr>
-        <w:pStyle w:val="Heading2"/>
-      </w:pPr>
-      <w:r>
-        <w:t>8.4 后续可扩展方向</w:t>
-      </w:r>
-    </w:p>
-    <w:p>
-      <w:pPr>
-        <w:pStyle w:val="ListBullet"/>
-        <w:spacing w:after="60" w:line="336" w:lineRule="auto"/>
-      </w:pPr>
-      <w:r>
-        <w:rPr>
-          <w:rFonts w:ascii="微软雅黑" w:hAnsi="微软雅黑" w:eastAsia="微软雅黑"/>
-          <w:sz w:val="21"/>
-        </w:rPr>
-        <w:t>模板库扩充：面向更多行业（项目立项、合同用印、值班调休等）沉淀模板。</w:t>
-      </w:r>
-    </w:p>
-    <w:p>
-      <w:pPr>
-        <w:pStyle w:val="ListBullet"/>
-        <w:spacing w:after="60" w:line="336" w:lineRule="auto"/>
-      </w:pPr>
-      <w:r>
-        <w:rPr>
-          <w:rFonts w:ascii="微软雅黑" w:hAnsi="微软雅黑" w:eastAsia="微软雅黑"/>
-          <w:sz w:val="21"/>
-        </w:rPr>
-        <w:t>多供应商支持：已抽象供应商层，可并行调用不同模型做投票或降级。</w:t>
-      </w:r>
-    </w:p>
-    <w:p>
-      <w:pPr>
-        <w:pStyle w:val="ListBullet"/>
-        <w:spacing w:after="60" w:line="336" w:lineRule="auto"/>
-      </w:pPr>
-      <w:r>
-        <w:rPr>
-          <w:rFonts w:ascii="微软雅黑" w:hAnsi="微软雅黑" w:eastAsia="微软雅黑"/>
-          <w:sz w:val="21"/>
-        </w:rPr>
-        <w:t>模板可视化编辑：在 Web 应用里直接编辑模板 JSON 并实时预览，进一步降低配置门槛。</w:t>
-      </w:r>
-    </w:p>
-    <w:p>
-      <w:pPr>
-        <w:pStyle w:val="ListBullet"/>
-        <w:spacing w:after="60" w:line="336" w:lineRule="auto"/>
-      </w:pPr>
-      <w:r>
-        <w:rPr>
-          <w:rFonts w:ascii="微软雅黑" w:hAnsi="微软雅黑" w:eastAsia="微软雅黑"/>
-          <w:sz w:val="21"/>
-        </w:rPr>
-        <w:t>表单与数据集成：把用户任务与真实表单、外部系统对接，形成可上线的审批中台。</w:t>
+        <w:t>大模型密钥只从环境变量或界面内存读取，不入库、不打印、不写入日志。</w:t>
       </w:r>
     </w:p>
     <w:p>
@@ -7781,9 +6300,10 @@
           <w:rFonts w:ascii="微软雅黑" w:hAnsi="微软雅黑" w:eastAsia="微软雅黑"/>
           <w:b w:val="0"/>
           <w:i w:val="0"/>
-          <w:color w:val="1F2329"/>
-          <w:sz w:val="21"/>
+          <w:color w:val="6B7280"/>
+          <w:sz w:val="18"/>
         </w:rPr>
+        <w:t>完整目录结构与后续扩展方向见仓库 README.md。</w:t>
       </w:r>
     </w:p>
     <w:p>

</xml_diff>

<commit_message>
feat: every human task except submit can now reject (28/28); lock it with invariants
</commit_message>
<xml_diff>
--- a/docs/bpmn-gen-report.docx
+++ b/docs/bpmn-gen-report.docx
@@ -5071,7 +5071,7 @@
                 <w:rFonts w:ascii="微软雅黑" w:hAnsi="微软雅黑" w:eastAsia="微软雅黑"/>
                 <w:sz w:val="18"/>
               </w:rPr>
-              <w:t>318 项断言通过</w:t>
+              <w:t>348 项断言通过</w:t>
             </w:r>
           </w:p>
         </w:tc>
@@ -5366,7 +5366,7 @@
                 <w:rFonts w:ascii="微软雅黑" w:hAnsi="微软雅黑" w:eastAsia="微软雅黑"/>
                 <w:sz w:val="18"/>
               </w:rPr>
-              <w:t>100 条 / 28 个模板</w:t>
+              <w:t>104 条 / 28 个模板</w:t>
             </w:r>
           </w:p>
         </w:tc>

</xml_diff>

<commit_message>
fix(layout): back edges route through outside lanes and enter from bottom; labels no longer overlap
</commit_message>
<xml_diff>
--- a/docs/bpmn-gen-report.docx
+++ b/docs/bpmn-gen-report.docx
@@ -4695,7 +4695,7 @@
       <w:r>
         <w:drawing>
           <wp:inline xmlns:a="http://schemas.openxmlformats.org/drawingml/2006/main" xmlns:pic="http://schemas.openxmlformats.org/drawingml/2006/picture">
-            <wp:extent cx="5577840" cy="2743200"/>
+            <wp:extent cx="5577840" cy="3028950"/>
             <wp:docPr id="1" name="Picture 1"/>
             <wp:cNvGraphicFramePr>
               <a:graphicFrameLocks noChangeAspect="1"/>
@@ -4716,7 +4716,7 @@
                   <pic:spPr>
                     <a:xfrm>
                       <a:off x="0" y="0"/>
-                      <a:ext cx="5577840" cy="2743200"/>
+                      <a:ext cx="5577840" cy="3028950"/>
                     </a:xfrm>
                     <a:prstGeom prst="rect"/>
                   </pic:spPr>
@@ -4749,7 +4749,7 @@
       <w:r>
         <w:drawing>
           <wp:inline xmlns:a="http://schemas.openxmlformats.org/drawingml/2006/main" xmlns:pic="http://schemas.openxmlformats.org/drawingml/2006/picture">
-            <wp:extent cx="5577840" cy="1475797"/>
+            <wp:extent cx="5577840" cy="1401838"/>
             <wp:docPr id="2" name="Picture 2"/>
             <wp:cNvGraphicFramePr>
               <a:graphicFrameLocks noChangeAspect="1"/>
@@ -4770,7 +4770,7 @@
                   <pic:spPr>
                     <a:xfrm>
                       <a:off x="0" y="0"/>
-                      <a:ext cx="5577840" cy="1475797"/>
+                      <a:ext cx="5577840" cy="1401838"/>
                     </a:xfrm>
                     <a:prstGeom prst="rect"/>
                   </pic:spPr>

</xml_diff>

<commit_message>
feat: approvers use candidateGroups + org-roles.json handoff table (deployable instead of variable placeholders)
</commit_message>
<xml_diff>
--- a/docs/bpmn-gen-report.docx
+++ b/docs/bpmn-gen-report.docx
@@ -4603,6 +4603,65 @@
                 <w:rFonts w:ascii="微软雅黑" w:hAnsi="微软雅黑" w:eastAsia="微软雅黑"/>
                 <w:sz w:val="18"/>
               </w:rPr>
+              <w:t>角色组交接</w:t>
+            </w:r>
+          </w:p>
+        </w:tc>
+        <w:tc>
+          <w:tcPr>
+            <w:tcW w:type="dxa" w:w="4309"/>
+          </w:tcPr>
+          <w:p>
+            <w:pPr>
+              <w:spacing w:after="40"/>
+            </w:pPr>
+            <w:r/>
+            <w:r>
+              <w:rPr>
+                <w:rFonts w:ascii="微软雅黑" w:hAnsi="微软雅黑" w:eastAsia="微软雅黑"/>
+                <w:sz w:val="18"/>
+              </w:rPr>
+              <w:t>审批人用 flowable:candidateGroups 字面量组名，附 org-roles.json 映射表（组名 → 建议引擎组 + 中文角色），说明书列出每个流程所需组</w:t>
+            </w:r>
+          </w:p>
+        </w:tc>
+        <w:tc>
+          <w:tcPr>
+            <w:tcW w:type="dxa" w:w="2551"/>
+          </w:tcPr>
+          <w:p>
+            <w:pPr>
+              <w:spacing w:after="40"/>
+            </w:pPr>
+            <w:r/>
+            <w:r>
+              <w:rPr>
+                <w:rFonts w:ascii="微软雅黑" w:hAnsi="微软雅黑" w:eastAsia="微软雅黑"/>
+                <w:sz w:val="18"/>
+              </w:rPr>
+              <w:t>单元测试断言：角色组都在映射表里、没有未定义的处理人变量</w:t>
+            </w:r>
+          </w:p>
+        </w:tc>
+      </w:tr>
+      <w:tr>
+        <w:trPr>
+          <w:cantSplit/>
+        </w:trPr>
+        <w:tc>
+          <w:tcPr>
+            <w:tcW w:type="dxa" w:w="1928"/>
+          </w:tcPr>
+          <w:p>
+            <w:pPr>
+              <w:spacing w:after="40"/>
+            </w:pPr>
+            <w:r/>
+            <w:r>
+              <w:rPr>
+                <w:rFonts w:ascii="微软雅黑" w:hAnsi="微软雅黑" w:eastAsia="微软雅黑"/>
+                <w:sz w:val="18"/>
+              </w:rPr>
               <w:t>配套产物</w:t>
             </w:r>
           </w:p>

</xml_diff>

<commit_message>
feat: --bundle delivery package (bpmn+doc+form+cases+roles+deploy guide+check summary)
</commit_message>
<xml_diff>
--- a/docs/bpmn-gen-report.docx
+++ b/docs/bpmn-gen-report.docx
@@ -6179,6 +6179,47 @@
                 <w:rFonts w:ascii="微软雅黑" w:hAnsi="微软雅黑" w:eastAsia="微软雅黑"/>
                 <w:sz w:val="18"/>
               </w:rPr>
+              <w:t>nl2bpmn.cmd "..." -o out.bpmn --bundle</w:t>
+            </w:r>
+          </w:p>
+        </w:tc>
+        <w:tc>
+          <w:tcPr>
+            <w:tcW w:type="dxa" w:w="5159"/>
+          </w:tcPr>
+          <w:p>
+            <w:pPr>
+              <w:spacing w:after="40"/>
+            </w:pPr>
+            <w:r/>
+            <w:r>
+              <w:rPr>
+                <w:rFonts w:ascii="微软雅黑" w:hAnsi="微软雅黑" w:eastAsia="微软雅黑"/>
+                <w:sz w:val="18"/>
+              </w:rPr>
+              <w:t>生成可交付的整个目录（bpmn/说明/表单/用例/角色组/部署说明/校验摘要）</w:t>
+            </w:r>
+          </w:p>
+        </w:tc>
+      </w:tr>
+      <w:tr>
+        <w:trPr>
+          <w:cantSplit/>
+        </w:trPr>
+        <w:tc>
+          <w:tcPr>
+            <w:tcW w:type="dxa" w:w="3628"/>
+          </w:tcPr>
+          <w:p>
+            <w:pPr>
+              <w:spacing w:after="40"/>
+            </w:pPr>
+            <w:r/>
+            <w:r>
+              <w:rPr>
+                <w:rFonts w:ascii="微软雅黑" w:hAnsi="微软雅黑" w:eastAsia="微软雅黑"/>
+                <w:sz w:val="18"/>
+              </w:rPr>
               <w:t>bpmn2svg.cmd out.bpmn</w:t>
             </w:r>
           </w:p>

</xml_diff>

<commit_message>
feat: processKey prefix/override + flowable:versionTag + append-only generation ledger (JSONL)
</commit_message>
<xml_diff>
--- a/docs/bpmn-gen-report.docx
+++ b/docs/bpmn-gen-report.docx
@@ -4603,6 +4603,124 @@
                 <w:rFonts w:ascii="微软雅黑" w:hAnsi="微软雅黑" w:eastAsia="微软雅黑"/>
                 <w:sz w:val="18"/>
               </w:rPr>
+              <w:t>命名与版本</w:t>
+            </w:r>
+          </w:p>
+        </w:tc>
+        <w:tc>
+          <w:tcPr>
+            <w:tcW w:type="dxa" w:w="4309"/>
+          </w:tcPr>
+          <w:p>
+            <w:pPr>
+              <w:spacing w:after="40"/>
+            </w:pPr>
+            <w:r/>
+            <w:r>
+              <w:rPr>
+                <w:rFonts w:ascii="微软雅黑" w:hAnsi="微软雅黑" w:eastAsia="微软雅黑"/>
+                <w:sz w:val="18"/>
+              </w:rPr>
+              <w:t>processKey 可加前缀或整体覆盖（防导入撞车），flowable:versionTag 可指定</w:t>
+            </w:r>
+          </w:p>
+        </w:tc>
+        <w:tc>
+          <w:tcPr>
+            <w:tcW w:type="dxa" w:w="2551"/>
+          </w:tcPr>
+          <w:p>
+            <w:pPr>
+              <w:spacing w:after="40"/>
+            </w:pPr>
+            <w:r/>
+            <w:r>
+              <w:rPr>
+                <w:rFonts w:ascii="微软雅黑" w:hAnsi="微软雅黑" w:eastAsia="微软雅黑"/>
+                <w:sz w:val="18"/>
+              </w:rPr>
+              <w:t>单元测试断言前缀/覆盖/版本都进入 XML</w:t>
+            </w:r>
+          </w:p>
+        </w:tc>
+      </w:tr>
+      <w:tr>
+        <w:trPr>
+          <w:cantSplit/>
+        </w:trPr>
+        <w:tc>
+          <w:tcPr>
+            <w:tcW w:type="dxa" w:w="1928"/>
+          </w:tcPr>
+          <w:p>
+            <w:pPr>
+              <w:spacing w:after="40"/>
+            </w:pPr>
+            <w:r/>
+            <w:r>
+              <w:rPr>
+                <w:rFonts w:ascii="微软雅黑" w:hAnsi="微软雅黑" w:eastAsia="微软雅黑"/>
+                <w:sz w:val="18"/>
+              </w:rPr>
+              <w:t>生成台账</w:t>
+            </w:r>
+          </w:p>
+        </w:tc>
+        <w:tc>
+          <w:tcPr>
+            <w:tcW w:type="dxa" w:w="4309"/>
+          </w:tcPr>
+          <w:p>
+            <w:pPr>
+              <w:spacing w:after="40"/>
+            </w:pPr>
+            <w:r/>
+            <w:r>
+              <w:rPr>
+                <w:rFonts w:ascii="微软雅黑" w:hAnsi="微软雅黑" w:eastAsia="微软雅黑"/>
+                <w:sz w:val="18"/>
+              </w:rPr>
+              <w:t>每次生成追加一行 JSONL：时间、原话、模板、processKey、版本、节点数、XML 指纹</w:t>
+            </w:r>
+          </w:p>
+        </w:tc>
+        <w:tc>
+          <w:tcPr>
+            <w:tcW w:type="dxa" w:w="2551"/>
+          </w:tcPr>
+          <w:p>
+            <w:pPr>
+              <w:spacing w:after="40"/>
+            </w:pPr>
+            <w:r/>
+            <w:r>
+              <w:rPr>
+                <w:rFonts w:ascii="微软雅黑" w:hAnsi="微软雅黑" w:eastAsia="微软雅黑"/>
+                <w:sz w:val="18"/>
+              </w:rPr>
+              <w:t>单元测试断言追加、字段完整、指纹与内容一致</w:t>
+            </w:r>
+          </w:p>
+        </w:tc>
+      </w:tr>
+      <w:tr>
+        <w:trPr>
+          <w:cantSplit/>
+        </w:trPr>
+        <w:tc>
+          <w:tcPr>
+            <w:tcW w:type="dxa" w:w="1928"/>
+          </w:tcPr>
+          <w:p>
+            <w:pPr>
+              <w:spacing w:after="40"/>
+            </w:pPr>
+            <w:r/>
+            <w:r>
+              <w:rPr>
+                <w:rFonts w:ascii="微软雅黑" w:hAnsi="微软雅黑" w:eastAsia="微软雅黑"/>
+                <w:sz w:val="18"/>
+              </w:rPr>
               <w:t>角色组交接</w:t>
             </w:r>
           </w:p>

</xml_diff>

<commit_message>
docs: align assertion/file counts with reality (400 assertions, 65 files)
</commit_message>
<xml_diff>
--- a/docs/bpmn-gen-report.docx
+++ b/docs/bpmn-gen-report.docx
@@ -2555,7 +2555,7 @@
                 <w:rFonts w:ascii="微软雅黑" w:hAnsi="微软雅黑" w:eastAsia="微软雅黑"/>
                 <w:sz w:val="18"/>
               </w:rPr>
-              <w:t>66 / 66 文件</w:t>
+              <w:t>65 / 65 文件</w:t>
             </w:r>
           </w:p>
         </w:tc>
@@ -2632,7 +2632,7 @@
                 <w:rFonts w:ascii="微软雅黑" w:hAnsi="微软雅黑" w:eastAsia="微软雅黑"/>
                 <w:sz w:val="18"/>
               </w:rPr>
-              <w:t>66 / 66 文件</w:t>
+              <w:t>65 / 65 文件</w:t>
             </w:r>
           </w:p>
         </w:tc>
@@ -2709,7 +2709,7 @@
                 <w:rFonts w:ascii="微软雅黑" w:hAnsi="微软雅黑" w:eastAsia="微软雅黑"/>
                 <w:sz w:val="18"/>
               </w:rPr>
-              <w:t>66 / 66 文件</w:t>
+              <w:t>65 / 65 文件</w:t>
             </w:r>
           </w:p>
         </w:tc>
@@ -5248,7 +5248,7 @@
                 <w:rFonts w:ascii="微软雅黑" w:hAnsi="微软雅黑" w:eastAsia="微软雅黑"/>
                 <w:sz w:val="18"/>
               </w:rPr>
-              <w:t>348 项断言通过</w:t>
+              <w:t>400 项断言通过</w:t>
             </w:r>
           </w:p>
         </w:tc>

</xml_diff>

<commit_message>
docs: stop double-counting instance assertions (13 manual + 104 generated)
</commit_message>
<xml_diff>
--- a/docs/bpmn-gen-report.docx
+++ b/docs/bpmn-gen-report.docx
@@ -2786,7 +2786,7 @@
                 <w:rFonts w:ascii="微软雅黑" w:hAnsi="微软雅黑" w:eastAsia="微软雅黑"/>
                 <w:sz w:val="18"/>
               </w:rPr>
-              <w:t>113 / 113 断言</w:t>
+              <w:t>13 / 13 断言（另 104 条机器生成的分支用例见下）</w:t>
             </w:r>
           </w:p>
         </w:tc>
@@ -5484,7 +5484,7 @@
                 <w:rFonts w:ascii="微软雅黑" w:hAnsi="微软雅黑" w:eastAsia="微软雅黑"/>
                 <w:sz w:val="18"/>
               </w:rPr>
-              <w:t>113 条断言通过</w:t>
+              <w:t>13 条断言全部通过（人工编写）</w:t>
             </w:r>
           </w:p>
         </w:tc>

</xml_diff>